<commit_message>
Mahal listesi ve ağırlık cetveli güncellendi (MAHAL-AGIRLIK-EKSIKSIZ)
</commit_message>
<xml_diff>
--- a/belgeler/05_MAHAL_LISTESI.docx
+++ b/belgeler/05_MAHAL_LISTESI.docx
@@ -680,6 +680,23 @@
               <w:spacing w:before="20" w:after="20"/>
               <w:jc w:val="left"/>
             </w:pPr>
+          </w:p>
+        </w:tc>
+        <w:tc>
+          <w:tcPr>
+            <w:tcW w:type="dxa" w:w="573"/>
+            <w:tcBorders>
+              <w:top w:val="single" w:sz="4" w:space="0" w:color="808080"/>
+              <w:left w:val="single" w:sz="4" w:space="0" w:color="808080"/>
+              <w:bottom w:val="single" w:sz="4" w:space="0" w:color="808080"/>
+              <w:right w:val="single" w:sz="4" w:space="0" w:color="808080"/>
+            </w:tcBorders>
+          </w:tcPr>
+          <w:p>
+            <w:pPr>
+              <w:spacing w:before="20" w:after="20"/>
+              <w:jc w:val="left"/>
+            </w:pPr>
             <w:r>
               <w:rPr>
                 <w:rFonts w:ascii="Calibri" w:hAnsi="Calibri"/>
@@ -719,23 +736,6 @@
             </w:r>
           </w:p>
         </w:tc>
-        <w:tc>
-          <w:tcPr>
-            <w:tcW w:type="dxa" w:w="573"/>
-            <w:tcBorders>
-              <w:top w:val="single" w:sz="4" w:space="0" w:color="808080"/>
-              <w:left w:val="single" w:sz="4" w:space="0" w:color="808080"/>
-              <w:bottom w:val="single" w:sz="4" w:space="0" w:color="808080"/>
-              <w:right w:val="single" w:sz="4" w:space="0" w:color="808080"/>
-            </w:tcBorders>
-          </w:tcPr>
-          <w:p>
-            <w:pPr>
-              <w:spacing w:before="20" w:after="20"/>
-              <w:jc w:val="left"/>
-            </w:pPr>
-          </w:p>
-        </w:tc>
       </w:tr>
       <w:tr>
         <w:tc>
@@ -1528,6 +1528,23 @@
               <w:spacing w:before="20" w:after="20"/>
               <w:jc w:val="left"/>
             </w:pPr>
+          </w:p>
+        </w:tc>
+        <w:tc>
+          <w:tcPr>
+            <w:tcW w:type="dxa" w:w="573"/>
+            <w:tcBorders>
+              <w:top w:val="single" w:sz="4" w:space="0" w:color="808080"/>
+              <w:left w:val="single" w:sz="4" w:space="0" w:color="808080"/>
+              <w:bottom w:val="single" w:sz="4" w:space="0" w:color="808080"/>
+              <w:right w:val="single" w:sz="4" w:space="0" w:color="808080"/>
+            </w:tcBorders>
+          </w:tcPr>
+          <w:p>
+            <w:pPr>
+              <w:spacing w:before="20" w:after="20"/>
+              <w:jc w:val="left"/>
+            </w:pPr>
             <w:r>
               <w:rPr>
                 <w:rFonts w:ascii="Calibri" w:hAnsi="Calibri"/>
@@ -1567,23 +1584,6 @@
             </w:r>
           </w:p>
         </w:tc>
-        <w:tc>
-          <w:tcPr>
-            <w:tcW w:type="dxa" w:w="573"/>
-            <w:tcBorders>
-              <w:top w:val="single" w:sz="4" w:space="0" w:color="808080"/>
-              <w:left w:val="single" w:sz="4" w:space="0" w:color="808080"/>
-              <w:bottom w:val="single" w:sz="4" w:space="0" w:color="808080"/>
-              <w:right w:val="single" w:sz="4" w:space="0" w:color="808080"/>
-            </w:tcBorders>
-          </w:tcPr>
-          <w:p>
-            <w:pPr>
-              <w:spacing w:before="20" w:after="20"/>
-              <w:jc w:val="left"/>
-            </w:pPr>
-          </w:p>
-        </w:tc>
       </w:tr>
       <w:tr>
         <w:tc>
@@ -2100,6 +2100,130 @@
               <w:spacing w:before="20" w:after="20"/>
               <w:jc w:val="left"/>
             </w:pPr>
+          </w:p>
+        </w:tc>
+        <w:tc>
+          <w:tcPr>
+            <w:tcW w:type="dxa" w:w="573"/>
+            <w:tcBorders>
+              <w:top w:val="single" w:sz="4" w:space="0" w:color="808080"/>
+              <w:left w:val="single" w:sz="4" w:space="0" w:color="808080"/>
+              <w:bottom w:val="single" w:sz="4" w:space="0" w:color="808080"/>
+              <w:right w:val="single" w:sz="4" w:space="0" w:color="808080"/>
+            </w:tcBorders>
+          </w:tcPr>
+          <w:p>
+            <w:pPr>
+              <w:spacing w:before="20" w:after="20"/>
+              <w:jc w:val="left"/>
+            </w:pPr>
+          </w:p>
+        </w:tc>
+        <w:tc>
+          <w:tcPr>
+            <w:tcW w:type="dxa" w:w="573"/>
+            <w:tcBorders>
+              <w:top w:val="single" w:sz="4" w:space="0" w:color="808080"/>
+              <w:left w:val="single" w:sz="4" w:space="0" w:color="808080"/>
+              <w:bottom w:val="single" w:sz="4" w:space="0" w:color="808080"/>
+              <w:right w:val="single" w:sz="4" w:space="0" w:color="808080"/>
+            </w:tcBorders>
+          </w:tcPr>
+          <w:p>
+            <w:pPr>
+              <w:spacing w:before="20" w:after="20"/>
+              <w:jc w:val="left"/>
+            </w:pPr>
+          </w:p>
+        </w:tc>
+      </w:tr>
+      <w:tr>
+        <w:tc>
+          <w:tcPr>
+            <w:tcW w:type="dxa" w:w="1146"/>
+            <w:tcBorders>
+              <w:top w:val="single" w:sz="4" w:space="0" w:color="808080"/>
+              <w:left w:val="single" w:sz="4" w:space="0" w:color="808080"/>
+              <w:bottom w:val="single" w:sz="4" w:space="0" w:color="808080"/>
+              <w:right w:val="single" w:sz="4" w:space="0" w:color="808080"/>
+            </w:tcBorders>
+          </w:tcPr>
+          <w:p>
+            <w:pPr>
+              <w:spacing w:before="20" w:after="20"/>
+              <w:jc w:val="left"/>
+            </w:pPr>
+          </w:p>
+        </w:tc>
+        <w:tc>
+          <w:tcPr>
+            <w:tcW w:type="dxa" w:w="841"/>
+            <w:tcBorders>
+              <w:top w:val="single" w:sz="4" w:space="0" w:color="808080"/>
+              <w:left w:val="single" w:sz="4" w:space="0" w:color="808080"/>
+              <w:bottom w:val="single" w:sz="4" w:space="0" w:color="808080"/>
+              <w:right w:val="single" w:sz="4" w:space="0" w:color="808080"/>
+            </w:tcBorders>
+          </w:tcPr>
+          <w:p>
+            <w:pPr>
+              <w:spacing w:before="20" w:after="20"/>
+              <w:jc w:val="left"/>
+            </w:pPr>
+            <w:r>
+              <w:rPr>
+                <w:rFonts w:ascii="Calibri" w:hAnsi="Calibri"/>
+                <w:b w:val="0"/>
+                <w:i w:val="0"/>
+                <w:color w:val="000000"/>
+                <w:sz w:val="16"/>
+              </w:rPr>
+              <w:t>15.160.1002</w:t>
+            </w:r>
+          </w:p>
+        </w:tc>
+        <w:tc>
+          <w:tcPr>
+            <w:tcW w:type="dxa" w:w="3286"/>
+            <w:tcBorders>
+              <w:top w:val="single" w:sz="4" w:space="0" w:color="808080"/>
+              <w:left w:val="single" w:sz="4" w:space="0" w:color="808080"/>
+              <w:bottom w:val="single" w:sz="4" w:space="0" w:color="808080"/>
+              <w:right w:val="single" w:sz="4" w:space="0" w:color="808080"/>
+            </w:tcBorders>
+          </w:tcPr>
+          <w:p>
+            <w:pPr>
+              <w:spacing w:before="20" w:after="20"/>
+              <w:jc w:val="left"/>
+            </w:pPr>
+            <w:r>
+              <w:rPr>
+                <w:rFonts w:ascii="Calibri" w:hAnsi="Calibri"/>
+                <w:b w:val="0"/>
+                <w:i w:val="0"/>
+                <w:color w:val="000000"/>
+                <w:sz w:val="16"/>
+              </w:rPr>
+              <w:t>Q188 nervürlü çelik hasır</w:t>
+            </w:r>
+          </w:p>
+        </w:tc>
+        <w:tc>
+          <w:tcPr>
+            <w:tcW w:type="dxa" w:w="573"/>
+            <w:tcBorders>
+              <w:top w:val="single" w:sz="4" w:space="0" w:color="808080"/>
+              <w:left w:val="single" w:sz="4" w:space="0" w:color="808080"/>
+              <w:bottom w:val="single" w:sz="4" w:space="0" w:color="808080"/>
+              <w:right w:val="single" w:sz="4" w:space="0" w:color="808080"/>
+            </w:tcBorders>
+          </w:tcPr>
+          <w:p>
+            <w:pPr>
+              <w:spacing w:before="20" w:after="20"/>
+              <w:jc w:val="left"/>
+            </w:pPr>
             <w:r>
               <w:rPr>
                 <w:rFonts w:ascii="Calibri" w:hAnsi="Calibri"/>
@@ -2127,113 +2251,6 @@
               <w:spacing w:before="20" w:after="20"/>
               <w:jc w:val="left"/>
             </w:pPr>
-          </w:p>
-        </w:tc>
-        <w:tc>
-          <w:tcPr>
-            <w:tcW w:type="dxa" w:w="573"/>
-            <w:tcBorders>
-              <w:top w:val="single" w:sz="4" w:space="0" w:color="808080"/>
-              <w:left w:val="single" w:sz="4" w:space="0" w:color="808080"/>
-              <w:bottom w:val="single" w:sz="4" w:space="0" w:color="808080"/>
-              <w:right w:val="single" w:sz="4" w:space="0" w:color="808080"/>
-            </w:tcBorders>
-          </w:tcPr>
-          <w:p>
-            <w:pPr>
-              <w:spacing w:before="20" w:after="20"/>
-              <w:jc w:val="left"/>
-            </w:pPr>
-          </w:p>
-        </w:tc>
-      </w:tr>
-      <w:tr>
-        <w:tc>
-          <w:tcPr>
-            <w:tcW w:type="dxa" w:w="1146"/>
-            <w:tcBorders>
-              <w:top w:val="single" w:sz="4" w:space="0" w:color="808080"/>
-              <w:left w:val="single" w:sz="4" w:space="0" w:color="808080"/>
-              <w:bottom w:val="single" w:sz="4" w:space="0" w:color="808080"/>
-              <w:right w:val="single" w:sz="4" w:space="0" w:color="808080"/>
-            </w:tcBorders>
-          </w:tcPr>
-          <w:p>
-            <w:pPr>
-              <w:spacing w:before="20" w:after="20"/>
-              <w:jc w:val="left"/>
-            </w:pPr>
-          </w:p>
-        </w:tc>
-        <w:tc>
-          <w:tcPr>
-            <w:tcW w:type="dxa" w:w="841"/>
-            <w:tcBorders>
-              <w:top w:val="single" w:sz="4" w:space="0" w:color="808080"/>
-              <w:left w:val="single" w:sz="4" w:space="0" w:color="808080"/>
-              <w:bottom w:val="single" w:sz="4" w:space="0" w:color="808080"/>
-              <w:right w:val="single" w:sz="4" w:space="0" w:color="808080"/>
-            </w:tcBorders>
-          </w:tcPr>
-          <w:p>
-            <w:pPr>
-              <w:spacing w:before="20" w:after="20"/>
-              <w:jc w:val="left"/>
-            </w:pPr>
-            <w:r>
-              <w:rPr>
-                <w:rFonts w:ascii="Calibri" w:hAnsi="Calibri"/>
-                <w:b w:val="0"/>
-                <w:i w:val="0"/>
-                <w:color w:val="000000"/>
-                <w:sz w:val="16"/>
-              </w:rPr>
-              <w:t>15.160.1002</w:t>
-            </w:r>
-          </w:p>
-        </w:tc>
-        <w:tc>
-          <w:tcPr>
-            <w:tcW w:type="dxa" w:w="3286"/>
-            <w:tcBorders>
-              <w:top w:val="single" w:sz="4" w:space="0" w:color="808080"/>
-              <w:left w:val="single" w:sz="4" w:space="0" w:color="808080"/>
-              <w:bottom w:val="single" w:sz="4" w:space="0" w:color="808080"/>
-              <w:right w:val="single" w:sz="4" w:space="0" w:color="808080"/>
-            </w:tcBorders>
-          </w:tcPr>
-          <w:p>
-            <w:pPr>
-              <w:spacing w:before="20" w:after="20"/>
-              <w:jc w:val="left"/>
-            </w:pPr>
-            <w:r>
-              <w:rPr>
-                <w:rFonts w:ascii="Calibri" w:hAnsi="Calibri"/>
-                <w:b w:val="0"/>
-                <w:i w:val="0"/>
-                <w:color w:val="000000"/>
-                <w:sz w:val="16"/>
-              </w:rPr>
-              <w:t>Q188 nervürlü çelik hasır</w:t>
-            </w:r>
-          </w:p>
-        </w:tc>
-        <w:tc>
-          <w:tcPr>
-            <w:tcW w:type="dxa" w:w="573"/>
-            <w:tcBorders>
-              <w:top w:val="single" w:sz="4" w:space="0" w:color="808080"/>
-              <w:left w:val="single" w:sz="4" w:space="0" w:color="808080"/>
-              <w:bottom w:val="single" w:sz="4" w:space="0" w:color="808080"/>
-              <w:right w:val="single" w:sz="4" w:space="0" w:color="808080"/>
-            </w:tcBorders>
-          </w:tcPr>
-          <w:p>
-            <w:pPr>
-              <w:spacing w:before="20" w:after="20"/>
-              <w:jc w:val="left"/>
-            </w:pPr>
             <w:r>
               <w:rPr>
                 <w:rFonts w:ascii="Calibri" w:hAnsi="Calibri"/>
@@ -2261,6 +2278,215 @@
               <w:spacing w:before="20" w:after="20"/>
               <w:jc w:val="left"/>
             </w:pPr>
+          </w:p>
+        </w:tc>
+        <w:tc>
+          <w:tcPr>
+            <w:tcW w:type="dxa" w:w="573"/>
+            <w:tcBorders>
+              <w:top w:val="single" w:sz="4" w:space="0" w:color="808080"/>
+              <w:left w:val="single" w:sz="4" w:space="0" w:color="808080"/>
+              <w:bottom w:val="single" w:sz="4" w:space="0" w:color="808080"/>
+              <w:right w:val="single" w:sz="4" w:space="0" w:color="808080"/>
+            </w:tcBorders>
+          </w:tcPr>
+          <w:p>
+            <w:pPr>
+              <w:spacing w:before="20" w:after="20"/>
+              <w:jc w:val="left"/>
+            </w:pPr>
+          </w:p>
+        </w:tc>
+        <w:tc>
+          <w:tcPr>
+            <w:tcW w:type="dxa" w:w="573"/>
+            <w:tcBorders>
+              <w:top w:val="single" w:sz="4" w:space="0" w:color="808080"/>
+              <w:left w:val="single" w:sz="4" w:space="0" w:color="808080"/>
+              <w:bottom w:val="single" w:sz="4" w:space="0" w:color="808080"/>
+              <w:right w:val="single" w:sz="4" w:space="0" w:color="808080"/>
+            </w:tcBorders>
+          </w:tcPr>
+          <w:p>
+            <w:pPr>
+              <w:spacing w:before="20" w:after="20"/>
+              <w:jc w:val="left"/>
+            </w:pPr>
+          </w:p>
+        </w:tc>
+        <w:tc>
+          <w:tcPr>
+            <w:tcW w:type="dxa" w:w="573"/>
+            <w:tcBorders>
+              <w:top w:val="single" w:sz="4" w:space="0" w:color="808080"/>
+              <w:left w:val="single" w:sz="4" w:space="0" w:color="808080"/>
+              <w:bottom w:val="single" w:sz="4" w:space="0" w:color="808080"/>
+              <w:right w:val="single" w:sz="4" w:space="0" w:color="808080"/>
+            </w:tcBorders>
+          </w:tcPr>
+          <w:p>
+            <w:pPr>
+              <w:spacing w:before="20" w:after="20"/>
+              <w:jc w:val="left"/>
+            </w:pPr>
+          </w:p>
+        </w:tc>
+        <w:tc>
+          <w:tcPr>
+            <w:tcW w:type="dxa" w:w="573"/>
+            <w:tcBorders>
+              <w:top w:val="single" w:sz="4" w:space="0" w:color="808080"/>
+              <w:left w:val="single" w:sz="4" w:space="0" w:color="808080"/>
+              <w:bottom w:val="single" w:sz="4" w:space="0" w:color="808080"/>
+              <w:right w:val="single" w:sz="4" w:space="0" w:color="808080"/>
+            </w:tcBorders>
+          </w:tcPr>
+          <w:p>
+            <w:pPr>
+              <w:spacing w:before="20" w:after="20"/>
+              <w:jc w:val="left"/>
+            </w:pPr>
+          </w:p>
+        </w:tc>
+        <w:tc>
+          <w:tcPr>
+            <w:tcW w:type="dxa" w:w="573"/>
+            <w:tcBorders>
+              <w:top w:val="single" w:sz="4" w:space="0" w:color="808080"/>
+              <w:left w:val="single" w:sz="4" w:space="0" w:color="808080"/>
+              <w:bottom w:val="single" w:sz="4" w:space="0" w:color="808080"/>
+              <w:right w:val="single" w:sz="4" w:space="0" w:color="808080"/>
+            </w:tcBorders>
+          </w:tcPr>
+          <w:p>
+            <w:pPr>
+              <w:spacing w:before="20" w:after="20"/>
+              <w:jc w:val="left"/>
+            </w:pPr>
+          </w:p>
+        </w:tc>
+        <w:tc>
+          <w:tcPr>
+            <w:tcW w:type="dxa" w:w="573"/>
+            <w:tcBorders>
+              <w:top w:val="single" w:sz="4" w:space="0" w:color="808080"/>
+              <w:left w:val="single" w:sz="4" w:space="0" w:color="808080"/>
+              <w:bottom w:val="single" w:sz="4" w:space="0" w:color="808080"/>
+              <w:right w:val="single" w:sz="4" w:space="0" w:color="808080"/>
+            </w:tcBorders>
+          </w:tcPr>
+          <w:p>
+            <w:pPr>
+              <w:spacing w:before="20" w:after="20"/>
+              <w:jc w:val="left"/>
+            </w:pPr>
+          </w:p>
+        </w:tc>
+      </w:tr>
+      <w:tr>
+        <w:tc>
+          <w:tcPr>
+            <w:tcW w:type="dxa" w:w="1146"/>
+            <w:tcBorders>
+              <w:top w:val="single" w:sz="4" w:space="0" w:color="808080"/>
+              <w:left w:val="single" w:sz="4" w:space="0" w:color="808080"/>
+              <w:bottom w:val="single" w:sz="4" w:space="0" w:color="808080"/>
+              <w:right w:val="single" w:sz="4" w:space="0" w:color="808080"/>
+            </w:tcBorders>
+          </w:tcPr>
+          <w:p>
+            <w:pPr>
+              <w:spacing w:before="20" w:after="20"/>
+              <w:jc w:val="left"/>
+            </w:pPr>
+          </w:p>
+        </w:tc>
+        <w:tc>
+          <w:tcPr>
+            <w:tcW w:type="dxa" w:w="841"/>
+            <w:tcBorders>
+              <w:top w:val="single" w:sz="4" w:space="0" w:color="808080"/>
+              <w:left w:val="single" w:sz="4" w:space="0" w:color="808080"/>
+              <w:bottom w:val="single" w:sz="4" w:space="0" w:color="808080"/>
+              <w:right w:val="single" w:sz="4" w:space="0" w:color="808080"/>
+            </w:tcBorders>
+          </w:tcPr>
+          <w:p>
+            <w:pPr>
+              <w:spacing w:before="20" w:after="20"/>
+              <w:jc w:val="left"/>
+            </w:pPr>
+            <w:r>
+              <w:rPr>
+                <w:rFonts w:ascii="Calibri" w:hAnsi="Calibri"/>
+                <w:b w:val="0"/>
+                <w:i w:val="0"/>
+                <w:color w:val="000000"/>
+                <w:sz w:val="16"/>
+              </w:rPr>
+              <w:t>TKDK-0177</w:t>
+            </w:r>
+          </w:p>
+        </w:tc>
+        <w:tc>
+          <w:tcPr>
+            <w:tcW w:type="dxa" w:w="3286"/>
+            <w:tcBorders>
+              <w:top w:val="single" w:sz="4" w:space="0" w:color="808080"/>
+              <w:left w:val="single" w:sz="4" w:space="0" w:color="808080"/>
+              <w:bottom w:val="single" w:sz="4" w:space="0" w:color="808080"/>
+              <w:right w:val="single" w:sz="4" w:space="0" w:color="808080"/>
+            </w:tcBorders>
+          </w:tcPr>
+          <w:p>
+            <w:pPr>
+              <w:spacing w:before="20" w:after="20"/>
+              <w:jc w:val="left"/>
+            </w:pPr>
+            <w:r>
+              <w:rPr>
+                <w:rFonts w:ascii="Calibri" w:hAnsi="Calibri"/>
+                <w:b w:val="0"/>
+                <w:i w:val="0"/>
+                <w:color w:val="000000"/>
+                <w:sz w:val="16"/>
+              </w:rPr>
+              <w:t>Duvar karosu ile döşeme kaplaması (hijyen bölmesi, ofis ve WC)</w:t>
+            </w:r>
+          </w:p>
+        </w:tc>
+        <w:tc>
+          <w:tcPr>
+            <w:tcW w:type="dxa" w:w="573"/>
+            <w:tcBorders>
+              <w:top w:val="single" w:sz="4" w:space="0" w:color="808080"/>
+              <w:left w:val="single" w:sz="4" w:space="0" w:color="808080"/>
+              <w:bottom w:val="single" w:sz="4" w:space="0" w:color="808080"/>
+              <w:right w:val="single" w:sz="4" w:space="0" w:color="808080"/>
+            </w:tcBorders>
+          </w:tcPr>
+          <w:p>
+            <w:pPr>
+              <w:spacing w:before="20" w:after="20"/>
+              <w:jc w:val="left"/>
+            </w:pPr>
+          </w:p>
+        </w:tc>
+        <w:tc>
+          <w:tcPr>
+            <w:tcW w:type="dxa" w:w="573"/>
+            <w:tcBorders>
+              <w:top w:val="single" w:sz="4" w:space="0" w:color="808080"/>
+              <w:left w:val="single" w:sz="4" w:space="0" w:color="808080"/>
+              <w:bottom w:val="single" w:sz="4" w:space="0" w:color="808080"/>
+              <w:right w:val="single" w:sz="4" w:space="0" w:color="808080"/>
+            </w:tcBorders>
+          </w:tcPr>
+          <w:p>
+            <w:pPr>
+              <w:spacing w:before="20" w:after="20"/>
+              <w:jc w:val="left"/>
+            </w:pPr>
             <w:r>
               <w:rPr>
                 <w:rFonts w:ascii="Calibri" w:hAnsi="Calibri"/>
@@ -2409,23 +2635,6 @@
               <w:spacing w:before="20" w:after="20"/>
               <w:jc w:val="left"/>
             </w:pPr>
-          </w:p>
-        </w:tc>
-        <w:tc>
-          <w:tcPr>
-            <w:tcW w:type="dxa" w:w="841"/>
-            <w:tcBorders>
-              <w:top w:val="single" w:sz="4" w:space="0" w:color="808080"/>
-              <w:left w:val="single" w:sz="4" w:space="0" w:color="808080"/>
-              <w:bottom w:val="single" w:sz="4" w:space="0" w:color="808080"/>
-              <w:right w:val="single" w:sz="4" w:space="0" w:color="808080"/>
-            </w:tcBorders>
-          </w:tcPr>
-          <w:p>
-            <w:pPr>
-              <w:spacing w:before="20" w:after="20"/>
-              <w:jc w:val="left"/>
-            </w:pPr>
             <w:r>
               <w:rPr>
                 <w:rFonts w:ascii="Calibri" w:hAnsi="Calibri"/>
@@ -2434,13 +2643,13 @@
                 <w:color w:val="000000"/>
                 <w:sz w:val="16"/>
               </w:rPr>
-              <w:t>TKDK-0177</w:t>
+              <w:t>Duvar Kaplaması</w:t>
             </w:r>
           </w:p>
         </w:tc>
         <w:tc>
           <w:tcPr>
-            <w:tcW w:type="dxa" w:w="3286"/>
+            <w:tcW w:type="dxa" w:w="841"/>
             <w:tcBorders>
               <w:top w:val="single" w:sz="4" w:space="0" w:color="808080"/>
               <w:left w:val="single" w:sz="4" w:space="0" w:color="808080"/>
@@ -2461,25 +2670,35 @@
                 <w:color w:val="000000"/>
                 <w:sz w:val="16"/>
               </w:rPr>
-              <w:t>Duvar karosu ile döşeme kaplaması (hijyen bölmesi, ofis ve WC)</w:t>
+              <w:t>15.225.1010</w:t>
             </w:r>
           </w:p>
         </w:tc>
         <w:tc>
           <w:tcPr>
-            <w:tcW w:type="dxa" w:w="573"/>
-            <w:tcBorders>
-              <w:top w:val="single" w:sz="4" w:space="0" w:color="808080"/>
-              <w:left w:val="single" w:sz="4" w:space="0" w:color="808080"/>
-              <w:bottom w:val="single" w:sz="4" w:space="0" w:color="808080"/>
-              <w:right w:val="single" w:sz="4" w:space="0" w:color="808080"/>
-            </w:tcBorders>
-          </w:tcPr>
-          <w:p>
-            <w:pPr>
-              <w:spacing w:before="20" w:after="20"/>
-              <w:jc w:val="left"/>
-            </w:pPr>
+            <w:tcW w:type="dxa" w:w="3286"/>
+            <w:tcBorders>
+              <w:top w:val="single" w:sz="4" w:space="0" w:color="808080"/>
+              <w:left w:val="single" w:sz="4" w:space="0" w:color="808080"/>
+              <w:bottom w:val="single" w:sz="4" w:space="0" w:color="808080"/>
+              <w:right w:val="single" w:sz="4" w:space="0" w:color="808080"/>
+            </w:tcBorders>
+          </w:tcPr>
+          <w:p>
+            <w:pPr>
+              <w:spacing w:before="20" w:after="20"/>
+              <w:jc w:val="left"/>
+            </w:pPr>
+            <w:r>
+              <w:rPr>
+                <w:rFonts w:ascii="Calibri" w:hAnsi="Calibri"/>
+                <w:b w:val="0"/>
+                <w:i w:val="0"/>
+                <w:color w:val="000000"/>
+                <w:sz w:val="16"/>
+              </w:rPr>
+              <w:t>20 cm teçhizatsız gazbeton blok duvar (gazbeton tutkalı)</w:t>
+            </w:r>
           </w:p>
         </w:tc>
         <w:tc>
@@ -2524,208 +2743,6 @@
               <w:spacing w:before="20" w:after="20"/>
               <w:jc w:val="left"/>
             </w:pPr>
-          </w:p>
-        </w:tc>
-        <w:tc>
-          <w:tcPr>
-            <w:tcW w:type="dxa" w:w="573"/>
-            <w:tcBorders>
-              <w:top w:val="single" w:sz="4" w:space="0" w:color="808080"/>
-              <w:left w:val="single" w:sz="4" w:space="0" w:color="808080"/>
-              <w:bottom w:val="single" w:sz="4" w:space="0" w:color="808080"/>
-              <w:right w:val="single" w:sz="4" w:space="0" w:color="808080"/>
-            </w:tcBorders>
-          </w:tcPr>
-          <w:p>
-            <w:pPr>
-              <w:spacing w:before="20" w:after="20"/>
-              <w:jc w:val="left"/>
-            </w:pPr>
-          </w:p>
-        </w:tc>
-        <w:tc>
-          <w:tcPr>
-            <w:tcW w:type="dxa" w:w="573"/>
-            <w:tcBorders>
-              <w:top w:val="single" w:sz="4" w:space="0" w:color="808080"/>
-              <w:left w:val="single" w:sz="4" w:space="0" w:color="808080"/>
-              <w:bottom w:val="single" w:sz="4" w:space="0" w:color="808080"/>
-              <w:right w:val="single" w:sz="4" w:space="0" w:color="808080"/>
-            </w:tcBorders>
-          </w:tcPr>
-          <w:p>
-            <w:pPr>
-              <w:spacing w:before="20" w:after="20"/>
-              <w:jc w:val="left"/>
-            </w:pPr>
-          </w:p>
-        </w:tc>
-        <w:tc>
-          <w:tcPr>
-            <w:tcW w:type="dxa" w:w="573"/>
-            <w:tcBorders>
-              <w:top w:val="single" w:sz="4" w:space="0" w:color="808080"/>
-              <w:left w:val="single" w:sz="4" w:space="0" w:color="808080"/>
-              <w:bottom w:val="single" w:sz="4" w:space="0" w:color="808080"/>
-              <w:right w:val="single" w:sz="4" w:space="0" w:color="808080"/>
-            </w:tcBorders>
-          </w:tcPr>
-          <w:p>
-            <w:pPr>
-              <w:spacing w:before="20" w:after="20"/>
-              <w:jc w:val="left"/>
-            </w:pPr>
-          </w:p>
-        </w:tc>
-        <w:tc>
-          <w:tcPr>
-            <w:tcW w:type="dxa" w:w="573"/>
-            <w:tcBorders>
-              <w:top w:val="single" w:sz="4" w:space="0" w:color="808080"/>
-              <w:left w:val="single" w:sz="4" w:space="0" w:color="808080"/>
-              <w:bottom w:val="single" w:sz="4" w:space="0" w:color="808080"/>
-              <w:right w:val="single" w:sz="4" w:space="0" w:color="808080"/>
-            </w:tcBorders>
-          </w:tcPr>
-          <w:p>
-            <w:pPr>
-              <w:spacing w:before="20" w:after="20"/>
-              <w:jc w:val="left"/>
-            </w:pPr>
-          </w:p>
-        </w:tc>
-        <w:tc>
-          <w:tcPr>
-            <w:tcW w:type="dxa" w:w="573"/>
-            <w:tcBorders>
-              <w:top w:val="single" w:sz="4" w:space="0" w:color="808080"/>
-              <w:left w:val="single" w:sz="4" w:space="0" w:color="808080"/>
-              <w:bottom w:val="single" w:sz="4" w:space="0" w:color="808080"/>
-              <w:right w:val="single" w:sz="4" w:space="0" w:color="808080"/>
-            </w:tcBorders>
-          </w:tcPr>
-          <w:p>
-            <w:pPr>
-              <w:spacing w:before="20" w:after="20"/>
-              <w:jc w:val="left"/>
-            </w:pPr>
-          </w:p>
-        </w:tc>
-        <w:tc>
-          <w:tcPr>
-            <w:tcW w:type="dxa" w:w="573"/>
-            <w:tcBorders>
-              <w:top w:val="single" w:sz="4" w:space="0" w:color="808080"/>
-              <w:left w:val="single" w:sz="4" w:space="0" w:color="808080"/>
-              <w:bottom w:val="single" w:sz="4" w:space="0" w:color="808080"/>
-              <w:right w:val="single" w:sz="4" w:space="0" w:color="808080"/>
-            </w:tcBorders>
-          </w:tcPr>
-          <w:p>
-            <w:pPr>
-              <w:spacing w:before="20" w:after="20"/>
-              <w:jc w:val="left"/>
-            </w:pPr>
-          </w:p>
-        </w:tc>
-      </w:tr>
-      <w:tr>
-        <w:tc>
-          <w:tcPr>
-            <w:tcW w:type="dxa" w:w="1146"/>
-            <w:tcBorders>
-              <w:top w:val="single" w:sz="4" w:space="0" w:color="808080"/>
-              <w:left w:val="single" w:sz="4" w:space="0" w:color="808080"/>
-              <w:bottom w:val="single" w:sz="4" w:space="0" w:color="808080"/>
-              <w:right w:val="single" w:sz="4" w:space="0" w:color="808080"/>
-            </w:tcBorders>
-          </w:tcPr>
-          <w:p>
-            <w:pPr>
-              <w:spacing w:before="20" w:after="20"/>
-              <w:jc w:val="left"/>
-            </w:pPr>
-            <w:r>
-              <w:rPr>
-                <w:rFonts w:ascii="Calibri" w:hAnsi="Calibri"/>
-                <w:b w:val="0"/>
-                <w:i w:val="0"/>
-                <w:color w:val="000000"/>
-                <w:sz w:val="16"/>
-              </w:rPr>
-              <w:t>Duvar Kaplaması</w:t>
-            </w:r>
-          </w:p>
-        </w:tc>
-        <w:tc>
-          <w:tcPr>
-            <w:tcW w:type="dxa" w:w="841"/>
-            <w:tcBorders>
-              <w:top w:val="single" w:sz="4" w:space="0" w:color="808080"/>
-              <w:left w:val="single" w:sz="4" w:space="0" w:color="808080"/>
-              <w:bottom w:val="single" w:sz="4" w:space="0" w:color="808080"/>
-              <w:right w:val="single" w:sz="4" w:space="0" w:color="808080"/>
-            </w:tcBorders>
-          </w:tcPr>
-          <w:p>
-            <w:pPr>
-              <w:spacing w:before="20" w:after="20"/>
-              <w:jc w:val="left"/>
-            </w:pPr>
-            <w:r>
-              <w:rPr>
-                <w:rFonts w:ascii="Calibri" w:hAnsi="Calibri"/>
-                <w:b w:val="0"/>
-                <w:i w:val="0"/>
-                <w:color w:val="000000"/>
-                <w:sz w:val="16"/>
-              </w:rPr>
-              <w:t>15.225.1010</w:t>
-            </w:r>
-          </w:p>
-        </w:tc>
-        <w:tc>
-          <w:tcPr>
-            <w:tcW w:type="dxa" w:w="3286"/>
-            <w:tcBorders>
-              <w:top w:val="single" w:sz="4" w:space="0" w:color="808080"/>
-              <w:left w:val="single" w:sz="4" w:space="0" w:color="808080"/>
-              <w:bottom w:val="single" w:sz="4" w:space="0" w:color="808080"/>
-              <w:right w:val="single" w:sz="4" w:space="0" w:color="808080"/>
-            </w:tcBorders>
-          </w:tcPr>
-          <w:p>
-            <w:pPr>
-              <w:spacing w:before="20" w:after="20"/>
-              <w:jc w:val="left"/>
-            </w:pPr>
-            <w:r>
-              <w:rPr>
-                <w:rFonts w:ascii="Calibri" w:hAnsi="Calibri"/>
-                <w:b w:val="0"/>
-                <w:i w:val="0"/>
-                <w:color w:val="000000"/>
-                <w:sz w:val="16"/>
-              </w:rPr>
-              <w:t>20 cm teçhizatsız gazbeton blok duvar (gazbeton tutkalı)</w:t>
-            </w:r>
-          </w:p>
-        </w:tc>
-        <w:tc>
-          <w:tcPr>
-            <w:tcW w:type="dxa" w:w="573"/>
-            <w:tcBorders>
-              <w:top w:val="single" w:sz="4" w:space="0" w:color="808080"/>
-              <w:left w:val="single" w:sz="4" w:space="0" w:color="808080"/>
-              <w:bottom w:val="single" w:sz="4" w:space="0" w:color="808080"/>
-              <w:right w:val="single" w:sz="4" w:space="0" w:color="808080"/>
-            </w:tcBorders>
-          </w:tcPr>
-          <w:p>
-            <w:pPr>
-              <w:spacing w:before="20" w:after="20"/>
-              <w:jc w:val="left"/>
-            </w:pPr>
             <w:r>
               <w:rPr>
                 <w:rFonts w:ascii="Calibri" w:hAnsi="Calibri"/>
@@ -2753,6 +2770,198 @@
               <w:spacing w:before="20" w:after="20"/>
               <w:jc w:val="left"/>
             </w:pPr>
+          </w:p>
+        </w:tc>
+        <w:tc>
+          <w:tcPr>
+            <w:tcW w:type="dxa" w:w="573"/>
+            <w:tcBorders>
+              <w:top w:val="single" w:sz="4" w:space="0" w:color="808080"/>
+              <w:left w:val="single" w:sz="4" w:space="0" w:color="808080"/>
+              <w:bottom w:val="single" w:sz="4" w:space="0" w:color="808080"/>
+              <w:right w:val="single" w:sz="4" w:space="0" w:color="808080"/>
+            </w:tcBorders>
+          </w:tcPr>
+          <w:p>
+            <w:pPr>
+              <w:spacing w:before="20" w:after="20"/>
+              <w:jc w:val="left"/>
+            </w:pPr>
+          </w:p>
+        </w:tc>
+        <w:tc>
+          <w:tcPr>
+            <w:tcW w:type="dxa" w:w="573"/>
+            <w:tcBorders>
+              <w:top w:val="single" w:sz="4" w:space="0" w:color="808080"/>
+              <w:left w:val="single" w:sz="4" w:space="0" w:color="808080"/>
+              <w:bottom w:val="single" w:sz="4" w:space="0" w:color="808080"/>
+              <w:right w:val="single" w:sz="4" w:space="0" w:color="808080"/>
+            </w:tcBorders>
+          </w:tcPr>
+          <w:p>
+            <w:pPr>
+              <w:spacing w:before="20" w:after="20"/>
+              <w:jc w:val="left"/>
+            </w:pPr>
+          </w:p>
+        </w:tc>
+        <w:tc>
+          <w:tcPr>
+            <w:tcW w:type="dxa" w:w="573"/>
+            <w:tcBorders>
+              <w:top w:val="single" w:sz="4" w:space="0" w:color="808080"/>
+              <w:left w:val="single" w:sz="4" w:space="0" w:color="808080"/>
+              <w:bottom w:val="single" w:sz="4" w:space="0" w:color="808080"/>
+              <w:right w:val="single" w:sz="4" w:space="0" w:color="808080"/>
+            </w:tcBorders>
+          </w:tcPr>
+          <w:p>
+            <w:pPr>
+              <w:spacing w:before="20" w:after="20"/>
+              <w:jc w:val="left"/>
+            </w:pPr>
+          </w:p>
+        </w:tc>
+        <w:tc>
+          <w:tcPr>
+            <w:tcW w:type="dxa" w:w="573"/>
+            <w:tcBorders>
+              <w:top w:val="single" w:sz="4" w:space="0" w:color="808080"/>
+              <w:left w:val="single" w:sz="4" w:space="0" w:color="808080"/>
+              <w:bottom w:val="single" w:sz="4" w:space="0" w:color="808080"/>
+              <w:right w:val="single" w:sz="4" w:space="0" w:color="808080"/>
+            </w:tcBorders>
+          </w:tcPr>
+          <w:p>
+            <w:pPr>
+              <w:spacing w:before="20" w:after="20"/>
+              <w:jc w:val="left"/>
+            </w:pPr>
+          </w:p>
+        </w:tc>
+        <w:tc>
+          <w:tcPr>
+            <w:tcW w:type="dxa" w:w="573"/>
+            <w:tcBorders>
+              <w:top w:val="single" w:sz="4" w:space="0" w:color="808080"/>
+              <w:left w:val="single" w:sz="4" w:space="0" w:color="808080"/>
+              <w:bottom w:val="single" w:sz="4" w:space="0" w:color="808080"/>
+              <w:right w:val="single" w:sz="4" w:space="0" w:color="808080"/>
+            </w:tcBorders>
+          </w:tcPr>
+          <w:p>
+            <w:pPr>
+              <w:spacing w:before="20" w:after="20"/>
+              <w:jc w:val="left"/>
+            </w:pPr>
+          </w:p>
+        </w:tc>
+        <w:tc>
+          <w:tcPr>
+            <w:tcW w:type="dxa" w:w="573"/>
+            <w:tcBorders>
+              <w:top w:val="single" w:sz="4" w:space="0" w:color="808080"/>
+              <w:left w:val="single" w:sz="4" w:space="0" w:color="808080"/>
+              <w:bottom w:val="single" w:sz="4" w:space="0" w:color="808080"/>
+              <w:right w:val="single" w:sz="4" w:space="0" w:color="808080"/>
+            </w:tcBorders>
+          </w:tcPr>
+          <w:p>
+            <w:pPr>
+              <w:spacing w:before="20" w:after="20"/>
+              <w:jc w:val="left"/>
+            </w:pPr>
+          </w:p>
+        </w:tc>
+      </w:tr>
+      <w:tr>
+        <w:tc>
+          <w:tcPr>
+            <w:tcW w:type="dxa" w:w="1146"/>
+            <w:tcBorders>
+              <w:top w:val="single" w:sz="4" w:space="0" w:color="808080"/>
+              <w:left w:val="single" w:sz="4" w:space="0" w:color="808080"/>
+              <w:bottom w:val="single" w:sz="4" w:space="0" w:color="808080"/>
+              <w:right w:val="single" w:sz="4" w:space="0" w:color="808080"/>
+            </w:tcBorders>
+          </w:tcPr>
+          <w:p>
+            <w:pPr>
+              <w:spacing w:before="20" w:after="20"/>
+              <w:jc w:val="left"/>
+            </w:pPr>
+          </w:p>
+        </w:tc>
+        <w:tc>
+          <w:tcPr>
+            <w:tcW w:type="dxa" w:w="841"/>
+            <w:tcBorders>
+              <w:top w:val="single" w:sz="4" w:space="0" w:color="808080"/>
+              <w:left w:val="single" w:sz="4" w:space="0" w:color="808080"/>
+              <w:bottom w:val="single" w:sz="4" w:space="0" w:color="808080"/>
+              <w:right w:val="single" w:sz="4" w:space="0" w:color="808080"/>
+            </w:tcBorders>
+          </w:tcPr>
+          <w:p>
+            <w:pPr>
+              <w:spacing w:before="20" w:after="20"/>
+              <w:jc w:val="left"/>
+            </w:pPr>
+            <w:r>
+              <w:rPr>
+                <w:rFonts w:ascii="Calibri" w:hAnsi="Calibri"/>
+                <w:b w:val="0"/>
+                <w:i w:val="0"/>
+                <w:color w:val="000000"/>
+                <w:sz w:val="16"/>
+              </w:rPr>
+              <w:t>15.225.1410</w:t>
+            </w:r>
+          </w:p>
+        </w:tc>
+        <w:tc>
+          <w:tcPr>
+            <w:tcW w:type="dxa" w:w="3286"/>
+            <w:tcBorders>
+              <w:top w:val="single" w:sz="4" w:space="0" w:color="808080"/>
+              <w:left w:val="single" w:sz="4" w:space="0" w:color="808080"/>
+              <w:bottom w:val="single" w:sz="4" w:space="0" w:color="808080"/>
+              <w:right w:val="single" w:sz="4" w:space="0" w:color="808080"/>
+            </w:tcBorders>
+          </w:tcPr>
+          <w:p>
+            <w:pPr>
+              <w:spacing w:before="20" w:after="20"/>
+              <w:jc w:val="left"/>
+            </w:pPr>
+            <w:r>
+              <w:rPr>
+                <w:rFonts w:ascii="Calibri" w:hAnsi="Calibri"/>
+                <w:b w:val="0"/>
+                <w:i w:val="0"/>
+                <w:color w:val="000000"/>
+                <w:sz w:val="16"/>
+              </w:rPr>
+              <w:t>20 cm teçhizatlı gazbeton lento ve yatay hatıl</w:t>
+            </w:r>
+          </w:p>
+        </w:tc>
+        <w:tc>
+          <w:tcPr>
+            <w:tcW w:type="dxa" w:w="573"/>
+            <w:tcBorders>
+              <w:top w:val="single" w:sz="4" w:space="0" w:color="808080"/>
+              <w:left w:val="single" w:sz="4" w:space="0" w:color="808080"/>
+              <w:bottom w:val="single" w:sz="4" w:space="0" w:color="808080"/>
+              <w:right w:val="single" w:sz="4" w:space="0" w:color="808080"/>
+            </w:tcBorders>
+          </w:tcPr>
+          <w:p>
+            <w:pPr>
+              <w:spacing w:before="20" w:after="20"/>
+              <w:jc w:val="left"/>
+            </w:pPr>
             <w:r>
               <w:rPr>
                 <w:rFonts w:ascii="Calibri" w:hAnsi="Calibri"/>
@@ -2780,198 +2989,6 @@
               <w:spacing w:before="20" w:after="20"/>
               <w:jc w:val="left"/>
             </w:pPr>
-          </w:p>
-        </w:tc>
-        <w:tc>
-          <w:tcPr>
-            <w:tcW w:type="dxa" w:w="573"/>
-            <w:tcBorders>
-              <w:top w:val="single" w:sz="4" w:space="0" w:color="808080"/>
-              <w:left w:val="single" w:sz="4" w:space="0" w:color="808080"/>
-              <w:bottom w:val="single" w:sz="4" w:space="0" w:color="808080"/>
-              <w:right w:val="single" w:sz="4" w:space="0" w:color="808080"/>
-            </w:tcBorders>
-          </w:tcPr>
-          <w:p>
-            <w:pPr>
-              <w:spacing w:before="20" w:after="20"/>
-              <w:jc w:val="left"/>
-            </w:pPr>
-          </w:p>
-        </w:tc>
-        <w:tc>
-          <w:tcPr>
-            <w:tcW w:type="dxa" w:w="573"/>
-            <w:tcBorders>
-              <w:top w:val="single" w:sz="4" w:space="0" w:color="808080"/>
-              <w:left w:val="single" w:sz="4" w:space="0" w:color="808080"/>
-              <w:bottom w:val="single" w:sz="4" w:space="0" w:color="808080"/>
-              <w:right w:val="single" w:sz="4" w:space="0" w:color="808080"/>
-            </w:tcBorders>
-          </w:tcPr>
-          <w:p>
-            <w:pPr>
-              <w:spacing w:before="20" w:after="20"/>
-              <w:jc w:val="left"/>
-            </w:pPr>
-          </w:p>
-        </w:tc>
-        <w:tc>
-          <w:tcPr>
-            <w:tcW w:type="dxa" w:w="573"/>
-            <w:tcBorders>
-              <w:top w:val="single" w:sz="4" w:space="0" w:color="808080"/>
-              <w:left w:val="single" w:sz="4" w:space="0" w:color="808080"/>
-              <w:bottom w:val="single" w:sz="4" w:space="0" w:color="808080"/>
-              <w:right w:val="single" w:sz="4" w:space="0" w:color="808080"/>
-            </w:tcBorders>
-          </w:tcPr>
-          <w:p>
-            <w:pPr>
-              <w:spacing w:before="20" w:after="20"/>
-              <w:jc w:val="left"/>
-            </w:pPr>
-          </w:p>
-        </w:tc>
-        <w:tc>
-          <w:tcPr>
-            <w:tcW w:type="dxa" w:w="573"/>
-            <w:tcBorders>
-              <w:top w:val="single" w:sz="4" w:space="0" w:color="808080"/>
-              <w:left w:val="single" w:sz="4" w:space="0" w:color="808080"/>
-              <w:bottom w:val="single" w:sz="4" w:space="0" w:color="808080"/>
-              <w:right w:val="single" w:sz="4" w:space="0" w:color="808080"/>
-            </w:tcBorders>
-          </w:tcPr>
-          <w:p>
-            <w:pPr>
-              <w:spacing w:before="20" w:after="20"/>
-              <w:jc w:val="left"/>
-            </w:pPr>
-          </w:p>
-        </w:tc>
-        <w:tc>
-          <w:tcPr>
-            <w:tcW w:type="dxa" w:w="573"/>
-            <w:tcBorders>
-              <w:top w:val="single" w:sz="4" w:space="0" w:color="808080"/>
-              <w:left w:val="single" w:sz="4" w:space="0" w:color="808080"/>
-              <w:bottom w:val="single" w:sz="4" w:space="0" w:color="808080"/>
-              <w:right w:val="single" w:sz="4" w:space="0" w:color="808080"/>
-            </w:tcBorders>
-          </w:tcPr>
-          <w:p>
-            <w:pPr>
-              <w:spacing w:before="20" w:after="20"/>
-              <w:jc w:val="left"/>
-            </w:pPr>
-          </w:p>
-        </w:tc>
-        <w:tc>
-          <w:tcPr>
-            <w:tcW w:type="dxa" w:w="573"/>
-            <w:tcBorders>
-              <w:top w:val="single" w:sz="4" w:space="0" w:color="808080"/>
-              <w:left w:val="single" w:sz="4" w:space="0" w:color="808080"/>
-              <w:bottom w:val="single" w:sz="4" w:space="0" w:color="808080"/>
-              <w:right w:val="single" w:sz="4" w:space="0" w:color="808080"/>
-            </w:tcBorders>
-          </w:tcPr>
-          <w:p>
-            <w:pPr>
-              <w:spacing w:before="20" w:after="20"/>
-              <w:jc w:val="left"/>
-            </w:pPr>
-          </w:p>
-        </w:tc>
-      </w:tr>
-      <w:tr>
-        <w:tc>
-          <w:tcPr>
-            <w:tcW w:type="dxa" w:w="1146"/>
-            <w:tcBorders>
-              <w:top w:val="single" w:sz="4" w:space="0" w:color="808080"/>
-              <w:left w:val="single" w:sz="4" w:space="0" w:color="808080"/>
-              <w:bottom w:val="single" w:sz="4" w:space="0" w:color="808080"/>
-              <w:right w:val="single" w:sz="4" w:space="0" w:color="808080"/>
-            </w:tcBorders>
-          </w:tcPr>
-          <w:p>
-            <w:pPr>
-              <w:spacing w:before="20" w:after="20"/>
-              <w:jc w:val="left"/>
-            </w:pPr>
-          </w:p>
-        </w:tc>
-        <w:tc>
-          <w:tcPr>
-            <w:tcW w:type="dxa" w:w="841"/>
-            <w:tcBorders>
-              <w:top w:val="single" w:sz="4" w:space="0" w:color="808080"/>
-              <w:left w:val="single" w:sz="4" w:space="0" w:color="808080"/>
-              <w:bottom w:val="single" w:sz="4" w:space="0" w:color="808080"/>
-              <w:right w:val="single" w:sz="4" w:space="0" w:color="808080"/>
-            </w:tcBorders>
-          </w:tcPr>
-          <w:p>
-            <w:pPr>
-              <w:spacing w:before="20" w:after="20"/>
-              <w:jc w:val="left"/>
-            </w:pPr>
-            <w:r>
-              <w:rPr>
-                <w:rFonts w:ascii="Calibri" w:hAnsi="Calibri"/>
-                <w:b w:val="0"/>
-                <w:i w:val="0"/>
-                <w:color w:val="000000"/>
-                <w:sz w:val="16"/>
-              </w:rPr>
-              <w:t>15.225.1410</w:t>
-            </w:r>
-          </w:p>
-        </w:tc>
-        <w:tc>
-          <w:tcPr>
-            <w:tcW w:type="dxa" w:w="3286"/>
-            <w:tcBorders>
-              <w:top w:val="single" w:sz="4" w:space="0" w:color="808080"/>
-              <w:left w:val="single" w:sz="4" w:space="0" w:color="808080"/>
-              <w:bottom w:val="single" w:sz="4" w:space="0" w:color="808080"/>
-              <w:right w:val="single" w:sz="4" w:space="0" w:color="808080"/>
-            </w:tcBorders>
-          </w:tcPr>
-          <w:p>
-            <w:pPr>
-              <w:spacing w:before="20" w:after="20"/>
-              <w:jc w:val="left"/>
-            </w:pPr>
-            <w:r>
-              <w:rPr>
-                <w:rFonts w:ascii="Calibri" w:hAnsi="Calibri"/>
-                <w:b w:val="0"/>
-                <w:i w:val="0"/>
-                <w:color w:val="000000"/>
-                <w:sz w:val="16"/>
-              </w:rPr>
-              <w:t>20 cm teçhizatlı gazbeton lento ve yatay hatıl</w:t>
-            </w:r>
-          </w:p>
-        </w:tc>
-        <w:tc>
-          <w:tcPr>
-            <w:tcW w:type="dxa" w:w="573"/>
-            <w:tcBorders>
-              <w:top w:val="single" w:sz="4" w:space="0" w:color="808080"/>
-              <w:left w:val="single" w:sz="4" w:space="0" w:color="808080"/>
-              <w:bottom w:val="single" w:sz="4" w:space="0" w:color="808080"/>
-              <w:right w:val="single" w:sz="4" w:space="0" w:color="808080"/>
-            </w:tcBorders>
-          </w:tcPr>
-          <w:p>
-            <w:pPr>
-              <w:spacing w:before="20" w:after="20"/>
-              <w:jc w:val="left"/>
-            </w:pPr>
             <w:r>
               <w:rPr>
                 <w:rFonts w:ascii="Calibri" w:hAnsi="Calibri"/>
@@ -2999,6 +3016,215 @@
               <w:spacing w:before="20" w:after="20"/>
               <w:jc w:val="left"/>
             </w:pPr>
+          </w:p>
+        </w:tc>
+        <w:tc>
+          <w:tcPr>
+            <w:tcW w:type="dxa" w:w="573"/>
+            <w:tcBorders>
+              <w:top w:val="single" w:sz="4" w:space="0" w:color="808080"/>
+              <w:left w:val="single" w:sz="4" w:space="0" w:color="808080"/>
+              <w:bottom w:val="single" w:sz="4" w:space="0" w:color="808080"/>
+              <w:right w:val="single" w:sz="4" w:space="0" w:color="808080"/>
+            </w:tcBorders>
+          </w:tcPr>
+          <w:p>
+            <w:pPr>
+              <w:spacing w:before="20" w:after="20"/>
+              <w:jc w:val="left"/>
+            </w:pPr>
+          </w:p>
+        </w:tc>
+        <w:tc>
+          <w:tcPr>
+            <w:tcW w:type="dxa" w:w="573"/>
+            <w:tcBorders>
+              <w:top w:val="single" w:sz="4" w:space="0" w:color="808080"/>
+              <w:left w:val="single" w:sz="4" w:space="0" w:color="808080"/>
+              <w:bottom w:val="single" w:sz="4" w:space="0" w:color="808080"/>
+              <w:right w:val="single" w:sz="4" w:space="0" w:color="808080"/>
+            </w:tcBorders>
+          </w:tcPr>
+          <w:p>
+            <w:pPr>
+              <w:spacing w:before="20" w:after="20"/>
+              <w:jc w:val="left"/>
+            </w:pPr>
+          </w:p>
+        </w:tc>
+        <w:tc>
+          <w:tcPr>
+            <w:tcW w:type="dxa" w:w="573"/>
+            <w:tcBorders>
+              <w:top w:val="single" w:sz="4" w:space="0" w:color="808080"/>
+              <w:left w:val="single" w:sz="4" w:space="0" w:color="808080"/>
+              <w:bottom w:val="single" w:sz="4" w:space="0" w:color="808080"/>
+              <w:right w:val="single" w:sz="4" w:space="0" w:color="808080"/>
+            </w:tcBorders>
+          </w:tcPr>
+          <w:p>
+            <w:pPr>
+              <w:spacing w:before="20" w:after="20"/>
+              <w:jc w:val="left"/>
+            </w:pPr>
+          </w:p>
+        </w:tc>
+        <w:tc>
+          <w:tcPr>
+            <w:tcW w:type="dxa" w:w="573"/>
+            <w:tcBorders>
+              <w:top w:val="single" w:sz="4" w:space="0" w:color="808080"/>
+              <w:left w:val="single" w:sz="4" w:space="0" w:color="808080"/>
+              <w:bottom w:val="single" w:sz="4" w:space="0" w:color="808080"/>
+              <w:right w:val="single" w:sz="4" w:space="0" w:color="808080"/>
+            </w:tcBorders>
+          </w:tcPr>
+          <w:p>
+            <w:pPr>
+              <w:spacing w:before="20" w:after="20"/>
+              <w:jc w:val="left"/>
+            </w:pPr>
+          </w:p>
+        </w:tc>
+        <w:tc>
+          <w:tcPr>
+            <w:tcW w:type="dxa" w:w="573"/>
+            <w:tcBorders>
+              <w:top w:val="single" w:sz="4" w:space="0" w:color="808080"/>
+              <w:left w:val="single" w:sz="4" w:space="0" w:color="808080"/>
+              <w:bottom w:val="single" w:sz="4" w:space="0" w:color="808080"/>
+              <w:right w:val="single" w:sz="4" w:space="0" w:color="808080"/>
+            </w:tcBorders>
+          </w:tcPr>
+          <w:p>
+            <w:pPr>
+              <w:spacing w:before="20" w:after="20"/>
+              <w:jc w:val="left"/>
+            </w:pPr>
+          </w:p>
+        </w:tc>
+        <w:tc>
+          <w:tcPr>
+            <w:tcW w:type="dxa" w:w="573"/>
+            <w:tcBorders>
+              <w:top w:val="single" w:sz="4" w:space="0" w:color="808080"/>
+              <w:left w:val="single" w:sz="4" w:space="0" w:color="808080"/>
+              <w:bottom w:val="single" w:sz="4" w:space="0" w:color="808080"/>
+              <w:right w:val="single" w:sz="4" w:space="0" w:color="808080"/>
+            </w:tcBorders>
+          </w:tcPr>
+          <w:p>
+            <w:pPr>
+              <w:spacing w:before="20" w:after="20"/>
+              <w:jc w:val="left"/>
+            </w:pPr>
+          </w:p>
+        </w:tc>
+      </w:tr>
+      <w:tr>
+        <w:tc>
+          <w:tcPr>
+            <w:tcW w:type="dxa" w:w="1146"/>
+            <w:tcBorders>
+              <w:top w:val="single" w:sz="4" w:space="0" w:color="808080"/>
+              <w:left w:val="single" w:sz="4" w:space="0" w:color="808080"/>
+              <w:bottom w:val="single" w:sz="4" w:space="0" w:color="808080"/>
+              <w:right w:val="single" w:sz="4" w:space="0" w:color="808080"/>
+            </w:tcBorders>
+          </w:tcPr>
+          <w:p>
+            <w:pPr>
+              <w:spacing w:before="20" w:after="20"/>
+              <w:jc w:val="left"/>
+            </w:pPr>
+          </w:p>
+        </w:tc>
+        <w:tc>
+          <w:tcPr>
+            <w:tcW w:type="dxa" w:w="841"/>
+            <w:tcBorders>
+              <w:top w:val="single" w:sz="4" w:space="0" w:color="808080"/>
+              <w:left w:val="single" w:sz="4" w:space="0" w:color="808080"/>
+              <w:bottom w:val="single" w:sz="4" w:space="0" w:color="808080"/>
+              <w:right w:val="single" w:sz="4" w:space="0" w:color="808080"/>
+            </w:tcBorders>
+          </w:tcPr>
+          <w:p>
+            <w:pPr>
+              <w:spacing w:before="20" w:after="20"/>
+              <w:jc w:val="left"/>
+            </w:pPr>
+            <w:r>
+              <w:rPr>
+                <w:rFonts w:ascii="Calibri" w:hAnsi="Calibri"/>
+                <w:b w:val="0"/>
+                <w:i w:val="0"/>
+                <w:color w:val="000000"/>
+                <w:sz w:val="16"/>
+              </w:rPr>
+              <w:t>15.225.1004</w:t>
+            </w:r>
+          </w:p>
+        </w:tc>
+        <w:tc>
+          <w:tcPr>
+            <w:tcW w:type="dxa" w:w="3286"/>
+            <w:tcBorders>
+              <w:top w:val="single" w:sz="4" w:space="0" w:color="808080"/>
+              <w:left w:val="single" w:sz="4" w:space="0" w:color="808080"/>
+              <w:bottom w:val="single" w:sz="4" w:space="0" w:color="808080"/>
+              <w:right w:val="single" w:sz="4" w:space="0" w:color="808080"/>
+            </w:tcBorders>
+          </w:tcPr>
+          <w:p>
+            <w:pPr>
+              <w:spacing w:before="20" w:after="20"/>
+              <w:jc w:val="left"/>
+            </w:pPr>
+            <w:r>
+              <w:rPr>
+                <w:rFonts w:ascii="Calibri" w:hAnsi="Calibri"/>
+                <w:b w:val="0"/>
+                <w:i w:val="0"/>
+                <w:color w:val="000000"/>
+                <w:sz w:val="16"/>
+              </w:rPr>
+              <w:t>10 cm teçhizatsız gazbeton blok bölme duvarı (servis bölümü)</w:t>
+            </w:r>
+          </w:p>
+        </w:tc>
+        <w:tc>
+          <w:tcPr>
+            <w:tcW w:type="dxa" w:w="573"/>
+            <w:tcBorders>
+              <w:top w:val="single" w:sz="4" w:space="0" w:color="808080"/>
+              <w:left w:val="single" w:sz="4" w:space="0" w:color="808080"/>
+              <w:bottom w:val="single" w:sz="4" w:space="0" w:color="808080"/>
+              <w:right w:val="single" w:sz="4" w:space="0" w:color="808080"/>
+            </w:tcBorders>
+          </w:tcPr>
+          <w:p>
+            <w:pPr>
+              <w:spacing w:before="20" w:after="20"/>
+              <w:jc w:val="left"/>
+            </w:pPr>
+          </w:p>
+        </w:tc>
+        <w:tc>
+          <w:tcPr>
+            <w:tcW w:type="dxa" w:w="573"/>
+            <w:tcBorders>
+              <w:top w:val="single" w:sz="4" w:space="0" w:color="808080"/>
+              <w:left w:val="single" w:sz="4" w:space="0" w:color="808080"/>
+              <w:bottom w:val="single" w:sz="4" w:space="0" w:color="808080"/>
+              <w:right w:val="single" w:sz="4" w:space="0" w:color="808080"/>
+            </w:tcBorders>
+          </w:tcPr>
+          <w:p>
+            <w:pPr>
+              <w:spacing w:before="20" w:after="20"/>
+              <w:jc w:val="left"/>
+            </w:pPr>
             <w:r>
               <w:rPr>
                 <w:rFonts w:ascii="Calibri" w:hAnsi="Calibri"/>
@@ -4334,6 +4560,140 @@
               <w:spacing w:before="20" w:after="20"/>
               <w:jc w:val="left"/>
             </w:pPr>
+          </w:p>
+        </w:tc>
+        <w:tc>
+          <w:tcPr>
+            <w:tcW w:type="dxa" w:w="573"/>
+            <w:tcBorders>
+              <w:top w:val="single" w:sz="4" w:space="0" w:color="808080"/>
+              <w:left w:val="single" w:sz="4" w:space="0" w:color="808080"/>
+              <w:bottom w:val="single" w:sz="4" w:space="0" w:color="808080"/>
+              <w:right w:val="single" w:sz="4" w:space="0" w:color="808080"/>
+            </w:tcBorders>
+          </w:tcPr>
+          <w:p>
+            <w:pPr>
+              <w:spacing w:before="20" w:after="20"/>
+              <w:jc w:val="left"/>
+            </w:pPr>
+          </w:p>
+        </w:tc>
+        <w:tc>
+          <w:tcPr>
+            <w:tcW w:type="dxa" w:w="573"/>
+            <w:tcBorders>
+              <w:top w:val="single" w:sz="4" w:space="0" w:color="808080"/>
+              <w:left w:val="single" w:sz="4" w:space="0" w:color="808080"/>
+              <w:bottom w:val="single" w:sz="4" w:space="0" w:color="808080"/>
+              <w:right w:val="single" w:sz="4" w:space="0" w:color="808080"/>
+            </w:tcBorders>
+          </w:tcPr>
+          <w:p>
+            <w:pPr>
+              <w:spacing w:before="20" w:after="20"/>
+              <w:jc w:val="left"/>
+            </w:pPr>
+          </w:p>
+        </w:tc>
+      </w:tr>
+      <w:tr>
+        <w:tc>
+          <w:tcPr>
+            <w:tcW w:type="dxa" w:w="1146"/>
+            <w:tcBorders>
+              <w:top w:val="single" w:sz="4" w:space="0" w:color="808080"/>
+              <w:left w:val="single" w:sz="4" w:space="0" w:color="808080"/>
+              <w:bottom w:val="single" w:sz="4" w:space="0" w:color="808080"/>
+              <w:right w:val="single" w:sz="4" w:space="0" w:color="808080"/>
+            </w:tcBorders>
+          </w:tcPr>
+          <w:p>
+            <w:pPr>
+              <w:spacing w:before="20" w:after="20"/>
+              <w:jc w:val="left"/>
+            </w:pPr>
+            <w:r>
+              <w:rPr>
+                <w:rFonts w:ascii="Calibri" w:hAnsi="Calibri"/>
+                <w:b w:val="0"/>
+                <w:i w:val="0"/>
+                <w:color w:val="000000"/>
+                <w:sz w:val="16"/>
+              </w:rPr>
+              <w:t>Tavan Kaplaması</w:t>
+            </w:r>
+          </w:p>
+        </w:tc>
+        <w:tc>
+          <w:tcPr>
+            <w:tcW w:type="dxa" w:w="841"/>
+            <w:tcBorders>
+              <w:top w:val="single" w:sz="4" w:space="0" w:color="808080"/>
+              <w:left w:val="single" w:sz="4" w:space="0" w:color="808080"/>
+              <w:bottom w:val="single" w:sz="4" w:space="0" w:color="808080"/>
+              <w:right w:val="single" w:sz="4" w:space="0" w:color="808080"/>
+            </w:tcBorders>
+          </w:tcPr>
+          <w:p>
+            <w:pPr>
+              <w:spacing w:before="20" w:after="20"/>
+              <w:jc w:val="left"/>
+            </w:pPr>
+            <w:r>
+              <w:rPr>
+                <w:rFonts w:ascii="Calibri" w:hAnsi="Calibri"/>
+                <w:b w:val="0"/>
+                <w:i w:val="0"/>
+                <w:color w:val="000000"/>
+                <w:sz w:val="16"/>
+              </w:rPr>
+              <w:t>TKDK-0042</w:t>
+            </w:r>
+          </w:p>
+        </w:tc>
+        <w:tc>
+          <w:tcPr>
+            <w:tcW w:type="dxa" w:w="3286"/>
+            <w:tcBorders>
+              <w:top w:val="single" w:sz="4" w:space="0" w:color="808080"/>
+              <w:left w:val="single" w:sz="4" w:space="0" w:color="808080"/>
+              <w:bottom w:val="single" w:sz="4" w:space="0" w:color="808080"/>
+              <w:right w:val="single" w:sz="4" w:space="0" w:color="808080"/>
+            </w:tcBorders>
+          </w:tcPr>
+          <w:p>
+            <w:pPr>
+              <w:spacing w:before="20" w:after="20"/>
+              <w:jc w:val="left"/>
+            </w:pPr>
+            <w:r>
+              <w:rPr>
+                <w:rFonts w:ascii="Calibri" w:hAnsi="Calibri"/>
+                <w:b w:val="0"/>
+                <w:i w:val="0"/>
+                <w:color w:val="000000"/>
+                <w:sz w:val="16"/>
+              </w:rPr>
+              <w:t>6 cm poliüretan dolgulu sandviç panel (alttan görünür yüz)</w:t>
+            </w:r>
+          </w:p>
+        </w:tc>
+        <w:tc>
+          <w:tcPr>
+            <w:tcW w:type="dxa" w:w="573"/>
+            <w:tcBorders>
+              <w:top w:val="single" w:sz="4" w:space="0" w:color="808080"/>
+              <w:left w:val="single" w:sz="4" w:space="0" w:color="808080"/>
+              <w:bottom w:val="single" w:sz="4" w:space="0" w:color="808080"/>
+              <w:right w:val="single" w:sz="4" w:space="0" w:color="808080"/>
+            </w:tcBorders>
+          </w:tcPr>
+          <w:p>
+            <w:pPr>
+              <w:spacing w:before="20" w:after="20"/>
+              <w:jc w:val="left"/>
+            </w:pPr>
             <w:r>
               <w:rPr>
                 <w:rFonts w:ascii="Calibri" w:hAnsi="Calibri"/>
@@ -4361,42 +4721,6 @@
               <w:spacing w:before="20" w:after="20"/>
               <w:jc w:val="left"/>
             </w:pPr>
-          </w:p>
-        </w:tc>
-        <w:tc>
-          <w:tcPr>
-            <w:tcW w:type="dxa" w:w="573"/>
-            <w:tcBorders>
-              <w:top w:val="single" w:sz="4" w:space="0" w:color="808080"/>
-              <w:left w:val="single" w:sz="4" w:space="0" w:color="808080"/>
-              <w:bottom w:val="single" w:sz="4" w:space="0" w:color="808080"/>
-              <w:right w:val="single" w:sz="4" w:space="0" w:color="808080"/>
-            </w:tcBorders>
-          </w:tcPr>
-          <w:p>
-            <w:pPr>
-              <w:spacing w:before="20" w:after="20"/>
-              <w:jc w:val="left"/>
-            </w:pPr>
-          </w:p>
-        </w:tc>
-      </w:tr>
-      <w:tr>
-        <w:tc>
-          <w:tcPr>
-            <w:tcW w:type="dxa" w:w="1146"/>
-            <w:tcBorders>
-              <w:top w:val="single" w:sz="4" w:space="0" w:color="808080"/>
-              <w:left w:val="single" w:sz="4" w:space="0" w:color="808080"/>
-              <w:bottom w:val="single" w:sz="4" w:space="0" w:color="808080"/>
-              <w:right w:val="single" w:sz="4" w:space="0" w:color="808080"/>
-            </w:tcBorders>
-          </w:tcPr>
-          <w:p>
-            <w:pPr>
-              <w:spacing w:before="20" w:after="20"/>
-              <w:jc w:val="left"/>
-            </w:pPr>
             <w:r>
               <w:rPr>
                 <w:rFonts w:ascii="Calibri" w:hAnsi="Calibri"/>
@@ -4405,7 +4729,411 @@
                 <w:color w:val="000000"/>
                 <w:sz w:val="16"/>
               </w:rPr>
-              <w:t>Tavan Kaplaması</w:t>
+              <w:t>X</w:t>
+            </w:r>
+          </w:p>
+        </w:tc>
+        <w:tc>
+          <w:tcPr>
+            <w:tcW w:type="dxa" w:w="573"/>
+            <w:tcBorders>
+              <w:top w:val="single" w:sz="4" w:space="0" w:color="808080"/>
+              <w:left w:val="single" w:sz="4" w:space="0" w:color="808080"/>
+              <w:bottom w:val="single" w:sz="4" w:space="0" w:color="808080"/>
+              <w:right w:val="single" w:sz="4" w:space="0" w:color="808080"/>
+            </w:tcBorders>
+          </w:tcPr>
+          <w:p>
+            <w:pPr>
+              <w:spacing w:before="20" w:after="20"/>
+              <w:jc w:val="left"/>
+            </w:pPr>
+          </w:p>
+        </w:tc>
+        <w:tc>
+          <w:tcPr>
+            <w:tcW w:type="dxa" w:w="573"/>
+            <w:tcBorders>
+              <w:top w:val="single" w:sz="4" w:space="0" w:color="808080"/>
+              <w:left w:val="single" w:sz="4" w:space="0" w:color="808080"/>
+              <w:bottom w:val="single" w:sz="4" w:space="0" w:color="808080"/>
+              <w:right w:val="single" w:sz="4" w:space="0" w:color="808080"/>
+            </w:tcBorders>
+          </w:tcPr>
+          <w:p>
+            <w:pPr>
+              <w:spacing w:before="20" w:after="20"/>
+              <w:jc w:val="left"/>
+            </w:pPr>
+          </w:p>
+        </w:tc>
+        <w:tc>
+          <w:tcPr>
+            <w:tcW w:type="dxa" w:w="573"/>
+            <w:tcBorders>
+              <w:top w:val="single" w:sz="4" w:space="0" w:color="808080"/>
+              <w:left w:val="single" w:sz="4" w:space="0" w:color="808080"/>
+              <w:bottom w:val="single" w:sz="4" w:space="0" w:color="808080"/>
+              <w:right w:val="single" w:sz="4" w:space="0" w:color="808080"/>
+            </w:tcBorders>
+          </w:tcPr>
+          <w:p>
+            <w:pPr>
+              <w:spacing w:before="20" w:after="20"/>
+              <w:jc w:val="left"/>
+            </w:pPr>
+          </w:p>
+        </w:tc>
+        <w:tc>
+          <w:tcPr>
+            <w:tcW w:type="dxa" w:w="573"/>
+            <w:tcBorders>
+              <w:top w:val="single" w:sz="4" w:space="0" w:color="808080"/>
+              <w:left w:val="single" w:sz="4" w:space="0" w:color="808080"/>
+              <w:bottom w:val="single" w:sz="4" w:space="0" w:color="808080"/>
+              <w:right w:val="single" w:sz="4" w:space="0" w:color="808080"/>
+            </w:tcBorders>
+          </w:tcPr>
+          <w:p>
+            <w:pPr>
+              <w:spacing w:before="20" w:after="20"/>
+              <w:jc w:val="left"/>
+            </w:pPr>
+          </w:p>
+        </w:tc>
+        <w:tc>
+          <w:tcPr>
+            <w:tcW w:type="dxa" w:w="573"/>
+            <w:tcBorders>
+              <w:top w:val="single" w:sz="4" w:space="0" w:color="808080"/>
+              <w:left w:val="single" w:sz="4" w:space="0" w:color="808080"/>
+              <w:bottom w:val="single" w:sz="4" w:space="0" w:color="808080"/>
+              <w:right w:val="single" w:sz="4" w:space="0" w:color="808080"/>
+            </w:tcBorders>
+          </w:tcPr>
+          <w:p>
+            <w:pPr>
+              <w:spacing w:before="20" w:after="20"/>
+              <w:jc w:val="left"/>
+            </w:pPr>
+          </w:p>
+        </w:tc>
+        <w:tc>
+          <w:tcPr>
+            <w:tcW w:type="dxa" w:w="573"/>
+            <w:tcBorders>
+              <w:top w:val="single" w:sz="4" w:space="0" w:color="808080"/>
+              <w:left w:val="single" w:sz="4" w:space="0" w:color="808080"/>
+              <w:bottom w:val="single" w:sz="4" w:space="0" w:color="808080"/>
+              <w:right w:val="single" w:sz="4" w:space="0" w:color="808080"/>
+            </w:tcBorders>
+          </w:tcPr>
+          <w:p>
+            <w:pPr>
+              <w:spacing w:before="20" w:after="20"/>
+              <w:jc w:val="left"/>
+            </w:pPr>
+          </w:p>
+        </w:tc>
+        <w:tc>
+          <w:tcPr>
+            <w:tcW w:type="dxa" w:w="573"/>
+            <w:tcBorders>
+              <w:top w:val="single" w:sz="4" w:space="0" w:color="808080"/>
+              <w:left w:val="single" w:sz="4" w:space="0" w:color="808080"/>
+              <w:bottom w:val="single" w:sz="4" w:space="0" w:color="808080"/>
+              <w:right w:val="single" w:sz="4" w:space="0" w:color="808080"/>
+            </w:tcBorders>
+          </w:tcPr>
+          <w:p>
+            <w:pPr>
+              <w:spacing w:before="20" w:after="20"/>
+              <w:jc w:val="left"/>
+            </w:pPr>
+          </w:p>
+        </w:tc>
+      </w:tr>
+      <w:tr>
+        <w:tc>
+          <w:tcPr>
+            <w:tcW w:type="dxa" w:w="1146"/>
+            <w:tcBorders>
+              <w:top w:val="single" w:sz="4" w:space="0" w:color="808080"/>
+              <w:left w:val="single" w:sz="4" w:space="0" w:color="808080"/>
+              <w:bottom w:val="single" w:sz="4" w:space="0" w:color="808080"/>
+              <w:right w:val="single" w:sz="4" w:space="0" w:color="808080"/>
+            </w:tcBorders>
+          </w:tcPr>
+          <w:p>
+            <w:pPr>
+              <w:spacing w:before="20" w:after="20"/>
+              <w:jc w:val="left"/>
+            </w:pPr>
+          </w:p>
+        </w:tc>
+        <w:tc>
+          <w:tcPr>
+            <w:tcW w:type="dxa" w:w="841"/>
+            <w:tcBorders>
+              <w:top w:val="single" w:sz="4" w:space="0" w:color="808080"/>
+              <w:left w:val="single" w:sz="4" w:space="0" w:color="808080"/>
+              <w:bottom w:val="single" w:sz="4" w:space="0" w:color="808080"/>
+              <w:right w:val="single" w:sz="4" w:space="0" w:color="808080"/>
+            </w:tcBorders>
+          </w:tcPr>
+          <w:p>
+            <w:pPr>
+              <w:spacing w:before="20" w:after="20"/>
+              <w:jc w:val="left"/>
+            </w:pPr>
+            <w:r>
+              <w:rPr>
+                <w:rFonts w:ascii="Calibri" w:hAnsi="Calibri"/>
+                <w:b w:val="0"/>
+                <w:i w:val="0"/>
+                <w:color w:val="000000"/>
+                <w:sz w:val="16"/>
+              </w:rPr>
+              <w:t>15.150.1005</w:t>
+            </w:r>
+          </w:p>
+        </w:tc>
+        <w:tc>
+          <w:tcPr>
+            <w:tcW w:type="dxa" w:w="3286"/>
+            <w:tcBorders>
+              <w:top w:val="single" w:sz="4" w:space="0" w:color="808080"/>
+              <w:left w:val="single" w:sz="4" w:space="0" w:color="808080"/>
+              <w:bottom w:val="single" w:sz="4" w:space="0" w:color="808080"/>
+              <w:right w:val="single" w:sz="4" w:space="0" w:color="808080"/>
+            </w:tcBorders>
+          </w:tcPr>
+          <w:p>
+            <w:pPr>
+              <w:spacing w:before="20" w:after="20"/>
+              <w:jc w:val="left"/>
+            </w:pPr>
+            <w:r>
+              <w:rPr>
+                <w:rFonts w:ascii="Calibri" w:hAnsi="Calibri"/>
+                <w:b w:val="0"/>
+                <w:i w:val="0"/>
+                <w:color w:val="000000"/>
+                <w:sz w:val="16"/>
+              </w:rPr>
+              <w:t>C 25/30 betonarme üst döşeme</w:t>
+            </w:r>
+          </w:p>
+        </w:tc>
+        <w:tc>
+          <w:tcPr>
+            <w:tcW w:type="dxa" w:w="573"/>
+            <w:tcBorders>
+              <w:top w:val="single" w:sz="4" w:space="0" w:color="808080"/>
+              <w:left w:val="single" w:sz="4" w:space="0" w:color="808080"/>
+              <w:bottom w:val="single" w:sz="4" w:space="0" w:color="808080"/>
+              <w:right w:val="single" w:sz="4" w:space="0" w:color="808080"/>
+            </w:tcBorders>
+          </w:tcPr>
+          <w:p>
+            <w:pPr>
+              <w:spacing w:before="20" w:after="20"/>
+              <w:jc w:val="left"/>
+            </w:pPr>
+          </w:p>
+        </w:tc>
+        <w:tc>
+          <w:tcPr>
+            <w:tcW w:type="dxa" w:w="573"/>
+            <w:tcBorders>
+              <w:top w:val="single" w:sz="4" w:space="0" w:color="808080"/>
+              <w:left w:val="single" w:sz="4" w:space="0" w:color="808080"/>
+              <w:bottom w:val="single" w:sz="4" w:space="0" w:color="808080"/>
+              <w:right w:val="single" w:sz="4" w:space="0" w:color="808080"/>
+            </w:tcBorders>
+          </w:tcPr>
+          <w:p>
+            <w:pPr>
+              <w:spacing w:before="20" w:after="20"/>
+              <w:jc w:val="left"/>
+            </w:pPr>
+          </w:p>
+        </w:tc>
+        <w:tc>
+          <w:tcPr>
+            <w:tcW w:type="dxa" w:w="573"/>
+            <w:tcBorders>
+              <w:top w:val="single" w:sz="4" w:space="0" w:color="808080"/>
+              <w:left w:val="single" w:sz="4" w:space="0" w:color="808080"/>
+              <w:bottom w:val="single" w:sz="4" w:space="0" w:color="808080"/>
+              <w:right w:val="single" w:sz="4" w:space="0" w:color="808080"/>
+            </w:tcBorders>
+          </w:tcPr>
+          <w:p>
+            <w:pPr>
+              <w:spacing w:before="20" w:after="20"/>
+              <w:jc w:val="left"/>
+            </w:pPr>
+          </w:p>
+        </w:tc>
+        <w:tc>
+          <w:tcPr>
+            <w:tcW w:type="dxa" w:w="573"/>
+            <w:tcBorders>
+              <w:top w:val="single" w:sz="4" w:space="0" w:color="808080"/>
+              <w:left w:val="single" w:sz="4" w:space="0" w:color="808080"/>
+              <w:bottom w:val="single" w:sz="4" w:space="0" w:color="808080"/>
+              <w:right w:val="single" w:sz="4" w:space="0" w:color="808080"/>
+            </w:tcBorders>
+          </w:tcPr>
+          <w:p>
+            <w:pPr>
+              <w:spacing w:before="20" w:after="20"/>
+              <w:jc w:val="left"/>
+            </w:pPr>
+            <w:r>
+              <w:rPr>
+                <w:rFonts w:ascii="Calibri" w:hAnsi="Calibri"/>
+                <w:b w:val="0"/>
+                <w:i w:val="0"/>
+                <w:color w:val="000000"/>
+                <w:sz w:val="16"/>
+              </w:rPr>
+              <w:t>X</w:t>
+            </w:r>
+          </w:p>
+        </w:tc>
+        <w:tc>
+          <w:tcPr>
+            <w:tcW w:type="dxa" w:w="573"/>
+            <w:tcBorders>
+              <w:top w:val="single" w:sz="4" w:space="0" w:color="808080"/>
+              <w:left w:val="single" w:sz="4" w:space="0" w:color="808080"/>
+              <w:bottom w:val="single" w:sz="4" w:space="0" w:color="808080"/>
+              <w:right w:val="single" w:sz="4" w:space="0" w:color="808080"/>
+            </w:tcBorders>
+          </w:tcPr>
+          <w:p>
+            <w:pPr>
+              <w:spacing w:before="20" w:after="20"/>
+              <w:jc w:val="left"/>
+            </w:pPr>
+            <w:r>
+              <w:rPr>
+                <w:rFonts w:ascii="Calibri" w:hAnsi="Calibri"/>
+                <w:b w:val="0"/>
+                <w:i w:val="0"/>
+                <w:color w:val="000000"/>
+                <w:sz w:val="16"/>
+              </w:rPr>
+              <w:t>X</w:t>
+            </w:r>
+          </w:p>
+        </w:tc>
+        <w:tc>
+          <w:tcPr>
+            <w:tcW w:type="dxa" w:w="573"/>
+            <w:tcBorders>
+              <w:top w:val="single" w:sz="4" w:space="0" w:color="808080"/>
+              <w:left w:val="single" w:sz="4" w:space="0" w:color="808080"/>
+              <w:bottom w:val="single" w:sz="4" w:space="0" w:color="808080"/>
+              <w:right w:val="single" w:sz="4" w:space="0" w:color="808080"/>
+            </w:tcBorders>
+          </w:tcPr>
+          <w:p>
+            <w:pPr>
+              <w:spacing w:before="20" w:after="20"/>
+              <w:jc w:val="left"/>
+            </w:pPr>
+            <w:r>
+              <w:rPr>
+                <w:rFonts w:ascii="Calibri" w:hAnsi="Calibri"/>
+                <w:b w:val="0"/>
+                <w:i w:val="0"/>
+                <w:color w:val="000000"/>
+                <w:sz w:val="16"/>
+              </w:rPr>
+              <w:t>X</w:t>
+            </w:r>
+          </w:p>
+        </w:tc>
+        <w:tc>
+          <w:tcPr>
+            <w:tcW w:type="dxa" w:w="573"/>
+            <w:tcBorders>
+              <w:top w:val="single" w:sz="4" w:space="0" w:color="808080"/>
+              <w:left w:val="single" w:sz="4" w:space="0" w:color="808080"/>
+              <w:bottom w:val="single" w:sz="4" w:space="0" w:color="808080"/>
+              <w:right w:val="single" w:sz="4" w:space="0" w:color="808080"/>
+            </w:tcBorders>
+          </w:tcPr>
+          <w:p>
+            <w:pPr>
+              <w:spacing w:before="20" w:after="20"/>
+              <w:jc w:val="left"/>
+            </w:pPr>
+          </w:p>
+        </w:tc>
+        <w:tc>
+          <w:tcPr>
+            <w:tcW w:type="dxa" w:w="573"/>
+            <w:tcBorders>
+              <w:top w:val="single" w:sz="4" w:space="0" w:color="808080"/>
+              <w:left w:val="single" w:sz="4" w:space="0" w:color="808080"/>
+              <w:bottom w:val="single" w:sz="4" w:space="0" w:color="808080"/>
+              <w:right w:val="single" w:sz="4" w:space="0" w:color="808080"/>
+            </w:tcBorders>
+          </w:tcPr>
+          <w:p>
+            <w:pPr>
+              <w:spacing w:before="20" w:after="20"/>
+              <w:jc w:val="left"/>
+            </w:pPr>
+          </w:p>
+        </w:tc>
+        <w:tc>
+          <w:tcPr>
+            <w:tcW w:type="dxa" w:w="573"/>
+            <w:tcBorders>
+              <w:top w:val="single" w:sz="4" w:space="0" w:color="808080"/>
+              <w:left w:val="single" w:sz="4" w:space="0" w:color="808080"/>
+              <w:bottom w:val="single" w:sz="4" w:space="0" w:color="808080"/>
+              <w:right w:val="single" w:sz="4" w:space="0" w:color="808080"/>
+            </w:tcBorders>
+          </w:tcPr>
+          <w:p>
+            <w:pPr>
+              <w:spacing w:before="20" w:after="20"/>
+              <w:jc w:val="left"/>
+            </w:pPr>
+          </w:p>
+        </w:tc>
+      </w:tr>
+      <w:tr>
+        <w:tc>
+          <w:tcPr>
+            <w:tcW w:type="dxa" w:w="1146"/>
+            <w:tcBorders>
+              <w:top w:val="single" w:sz="4" w:space="0" w:color="808080"/>
+              <w:left w:val="single" w:sz="4" w:space="0" w:color="808080"/>
+              <w:bottom w:val="single" w:sz="4" w:space="0" w:color="808080"/>
+              <w:right w:val="single" w:sz="4" w:space="0" w:color="808080"/>
+            </w:tcBorders>
+          </w:tcPr>
+          <w:p>
+            <w:pPr>
+              <w:spacing w:before="20" w:after="20"/>
+              <w:jc w:val="left"/>
+            </w:pPr>
+            <w:r>
+              <w:rPr>
+                <w:rFonts w:ascii="Calibri" w:hAnsi="Calibri"/>
+                <w:b w:val="0"/>
+                <w:i w:val="0"/>
+                <w:color w:val="000000"/>
+                <w:sz w:val="16"/>
+              </w:rPr>
+              <w:t>Çatı İmalatları</w:t>
             </w:r>
           </w:p>
         </w:tc>
@@ -4459,8 +5187,42 @@
                 <w:color w:val="000000"/>
                 <w:sz w:val="16"/>
               </w:rPr>
-              <w:t>6 cm poliüretan dolgulu sandviç panel (alttan görünür yüz)</w:t>
+              <w:t>6 cm poliüretan dolgulu ısı yalıtımlı sandviç çatı paneli</w:t>
             </w:r>
+          </w:p>
+        </w:tc>
+        <w:tc>
+          <w:tcPr>
+            <w:tcW w:type="dxa" w:w="573"/>
+            <w:tcBorders>
+              <w:top w:val="single" w:sz="4" w:space="0" w:color="808080"/>
+              <w:left w:val="single" w:sz="4" w:space="0" w:color="808080"/>
+              <w:bottom w:val="single" w:sz="4" w:space="0" w:color="808080"/>
+              <w:right w:val="single" w:sz="4" w:space="0" w:color="808080"/>
+            </w:tcBorders>
+          </w:tcPr>
+          <w:p>
+            <w:pPr>
+              <w:spacing w:before="20" w:after="20"/>
+              <w:jc w:val="left"/>
+            </w:pPr>
+          </w:p>
+        </w:tc>
+        <w:tc>
+          <w:tcPr>
+            <w:tcW w:type="dxa" w:w="573"/>
+            <w:tcBorders>
+              <w:top w:val="single" w:sz="4" w:space="0" w:color="808080"/>
+              <w:left w:val="single" w:sz="4" w:space="0" w:color="808080"/>
+              <w:bottom w:val="single" w:sz="4" w:space="0" w:color="808080"/>
+              <w:right w:val="single" w:sz="4" w:space="0" w:color="808080"/>
+            </w:tcBorders>
+          </w:tcPr>
+          <w:p>
+            <w:pPr>
+              <w:spacing w:before="20" w:after="20"/>
+              <w:jc w:val="left"/>
+            </w:pPr>
           </w:p>
         </w:tc>
         <w:tc>
@@ -4505,6 +5267,215 @@
               <w:spacing w:before="20" w:after="20"/>
               <w:jc w:val="left"/>
             </w:pPr>
+          </w:p>
+        </w:tc>
+        <w:tc>
+          <w:tcPr>
+            <w:tcW w:type="dxa" w:w="573"/>
+            <w:tcBorders>
+              <w:top w:val="single" w:sz="4" w:space="0" w:color="808080"/>
+              <w:left w:val="single" w:sz="4" w:space="0" w:color="808080"/>
+              <w:bottom w:val="single" w:sz="4" w:space="0" w:color="808080"/>
+              <w:right w:val="single" w:sz="4" w:space="0" w:color="808080"/>
+            </w:tcBorders>
+          </w:tcPr>
+          <w:p>
+            <w:pPr>
+              <w:spacing w:before="20" w:after="20"/>
+              <w:jc w:val="left"/>
+            </w:pPr>
+          </w:p>
+        </w:tc>
+        <w:tc>
+          <w:tcPr>
+            <w:tcW w:type="dxa" w:w="573"/>
+            <w:tcBorders>
+              <w:top w:val="single" w:sz="4" w:space="0" w:color="808080"/>
+              <w:left w:val="single" w:sz="4" w:space="0" w:color="808080"/>
+              <w:bottom w:val="single" w:sz="4" w:space="0" w:color="808080"/>
+              <w:right w:val="single" w:sz="4" w:space="0" w:color="808080"/>
+            </w:tcBorders>
+          </w:tcPr>
+          <w:p>
+            <w:pPr>
+              <w:spacing w:before="20" w:after="20"/>
+              <w:jc w:val="left"/>
+            </w:pPr>
+          </w:p>
+        </w:tc>
+        <w:tc>
+          <w:tcPr>
+            <w:tcW w:type="dxa" w:w="573"/>
+            <w:tcBorders>
+              <w:top w:val="single" w:sz="4" w:space="0" w:color="808080"/>
+              <w:left w:val="single" w:sz="4" w:space="0" w:color="808080"/>
+              <w:bottom w:val="single" w:sz="4" w:space="0" w:color="808080"/>
+              <w:right w:val="single" w:sz="4" w:space="0" w:color="808080"/>
+            </w:tcBorders>
+          </w:tcPr>
+          <w:p>
+            <w:pPr>
+              <w:spacing w:before="20" w:after="20"/>
+              <w:jc w:val="left"/>
+            </w:pPr>
+          </w:p>
+        </w:tc>
+        <w:tc>
+          <w:tcPr>
+            <w:tcW w:type="dxa" w:w="573"/>
+            <w:tcBorders>
+              <w:top w:val="single" w:sz="4" w:space="0" w:color="808080"/>
+              <w:left w:val="single" w:sz="4" w:space="0" w:color="808080"/>
+              <w:bottom w:val="single" w:sz="4" w:space="0" w:color="808080"/>
+              <w:right w:val="single" w:sz="4" w:space="0" w:color="808080"/>
+            </w:tcBorders>
+          </w:tcPr>
+          <w:p>
+            <w:pPr>
+              <w:spacing w:before="20" w:after="20"/>
+              <w:jc w:val="left"/>
+            </w:pPr>
+          </w:p>
+        </w:tc>
+        <w:tc>
+          <w:tcPr>
+            <w:tcW w:type="dxa" w:w="573"/>
+            <w:tcBorders>
+              <w:top w:val="single" w:sz="4" w:space="0" w:color="808080"/>
+              <w:left w:val="single" w:sz="4" w:space="0" w:color="808080"/>
+              <w:bottom w:val="single" w:sz="4" w:space="0" w:color="808080"/>
+              <w:right w:val="single" w:sz="4" w:space="0" w:color="808080"/>
+            </w:tcBorders>
+          </w:tcPr>
+          <w:p>
+            <w:pPr>
+              <w:spacing w:before="20" w:after="20"/>
+              <w:jc w:val="left"/>
+            </w:pPr>
+          </w:p>
+        </w:tc>
+      </w:tr>
+      <w:tr>
+        <w:tc>
+          <w:tcPr>
+            <w:tcW w:type="dxa" w:w="1146"/>
+            <w:tcBorders>
+              <w:top w:val="single" w:sz="4" w:space="0" w:color="808080"/>
+              <w:left w:val="single" w:sz="4" w:space="0" w:color="808080"/>
+              <w:bottom w:val="single" w:sz="4" w:space="0" w:color="808080"/>
+              <w:right w:val="single" w:sz="4" w:space="0" w:color="808080"/>
+            </w:tcBorders>
+          </w:tcPr>
+          <w:p>
+            <w:pPr>
+              <w:spacing w:before="20" w:after="20"/>
+              <w:jc w:val="left"/>
+            </w:pPr>
+          </w:p>
+        </w:tc>
+        <w:tc>
+          <w:tcPr>
+            <w:tcW w:type="dxa" w:w="841"/>
+            <w:tcBorders>
+              <w:top w:val="single" w:sz="4" w:space="0" w:color="808080"/>
+              <w:left w:val="single" w:sz="4" w:space="0" w:color="808080"/>
+              <w:bottom w:val="single" w:sz="4" w:space="0" w:color="808080"/>
+              <w:right w:val="single" w:sz="4" w:space="0" w:color="808080"/>
+            </w:tcBorders>
+          </w:tcPr>
+          <w:p>
+            <w:pPr>
+              <w:spacing w:before="20" w:after="20"/>
+              <w:jc w:val="left"/>
+            </w:pPr>
+            <w:r>
+              <w:rPr>
+                <w:rFonts w:ascii="Calibri" w:hAnsi="Calibri"/>
+                <w:b w:val="0"/>
+                <w:i w:val="0"/>
+                <w:color w:val="000000"/>
+                <w:sz w:val="16"/>
+              </w:rPr>
+              <w:t>15.550.1202</w:t>
+            </w:r>
+          </w:p>
+        </w:tc>
+        <w:tc>
+          <w:tcPr>
+            <w:tcW w:type="dxa" w:w="3286"/>
+            <w:tcBorders>
+              <w:top w:val="single" w:sz="4" w:space="0" w:color="808080"/>
+              <w:left w:val="single" w:sz="4" w:space="0" w:color="808080"/>
+              <w:bottom w:val="single" w:sz="4" w:space="0" w:color="808080"/>
+              <w:right w:val="single" w:sz="4" w:space="0" w:color="808080"/>
+            </w:tcBorders>
+          </w:tcPr>
+          <w:p>
+            <w:pPr>
+              <w:spacing w:before="20" w:after="20"/>
+              <w:jc w:val="left"/>
+            </w:pPr>
+            <w:r>
+              <w:rPr>
+                <w:rFonts w:ascii="Calibri" w:hAnsi="Calibri"/>
+                <w:b w:val="0"/>
+                <w:i w:val="0"/>
+                <w:color w:val="000000"/>
+                <w:sz w:val="16"/>
+              </w:rPr>
+              <w:t>Lama ve profil demirden mahya, saçak ve köşe kapaması</w:t>
+            </w:r>
+          </w:p>
+        </w:tc>
+        <w:tc>
+          <w:tcPr>
+            <w:tcW w:type="dxa" w:w="573"/>
+            <w:tcBorders>
+              <w:top w:val="single" w:sz="4" w:space="0" w:color="808080"/>
+              <w:left w:val="single" w:sz="4" w:space="0" w:color="808080"/>
+              <w:bottom w:val="single" w:sz="4" w:space="0" w:color="808080"/>
+              <w:right w:val="single" w:sz="4" w:space="0" w:color="808080"/>
+            </w:tcBorders>
+          </w:tcPr>
+          <w:p>
+            <w:pPr>
+              <w:spacing w:before="20" w:after="20"/>
+              <w:jc w:val="left"/>
+            </w:pPr>
+          </w:p>
+        </w:tc>
+        <w:tc>
+          <w:tcPr>
+            <w:tcW w:type="dxa" w:w="573"/>
+            <w:tcBorders>
+              <w:top w:val="single" w:sz="4" w:space="0" w:color="808080"/>
+              <w:left w:val="single" w:sz="4" w:space="0" w:color="808080"/>
+              <w:bottom w:val="single" w:sz="4" w:space="0" w:color="808080"/>
+              <w:right w:val="single" w:sz="4" w:space="0" w:color="808080"/>
+            </w:tcBorders>
+          </w:tcPr>
+          <w:p>
+            <w:pPr>
+              <w:spacing w:before="20" w:after="20"/>
+              <w:jc w:val="left"/>
+            </w:pPr>
+          </w:p>
+        </w:tc>
+        <w:tc>
+          <w:tcPr>
+            <w:tcW w:type="dxa" w:w="573"/>
+            <w:tcBorders>
+              <w:top w:val="single" w:sz="4" w:space="0" w:color="808080"/>
+              <w:left w:val="single" w:sz="4" w:space="0" w:color="808080"/>
+              <w:bottom w:val="single" w:sz="4" w:space="0" w:color="808080"/>
+              <w:right w:val="single" w:sz="4" w:space="0" w:color="808080"/>
+            </w:tcBorders>
+          </w:tcPr>
+          <w:p>
+            <w:pPr>
+              <w:spacing w:before="20" w:after="20"/>
+              <w:jc w:val="left"/>
+            </w:pPr>
             <w:r>
               <w:rPr>
                 <w:rFonts w:ascii="Calibri" w:hAnsi="Calibri"/>
@@ -4619,23 +5590,6 @@
             </w:pPr>
           </w:p>
         </w:tc>
-        <w:tc>
-          <w:tcPr>
-            <w:tcW w:type="dxa" w:w="573"/>
-            <w:tcBorders>
-              <w:top w:val="single" w:sz="4" w:space="0" w:color="808080"/>
-              <w:left w:val="single" w:sz="4" w:space="0" w:color="808080"/>
-              <w:bottom w:val="single" w:sz="4" w:space="0" w:color="808080"/>
-              <w:right w:val="single" w:sz="4" w:space="0" w:color="808080"/>
-            </w:tcBorders>
-          </w:tcPr>
-          <w:p>
-            <w:pPr>
-              <w:spacing w:before="20" w:after="20"/>
-              <w:jc w:val="left"/>
-            </w:pPr>
-          </w:p>
-        </w:tc>
       </w:tr>
       <w:tr>
         <w:tc>
@@ -4678,7 +5632,7 @@
                 <w:color w:val="000000"/>
                 <w:sz w:val="16"/>
               </w:rPr>
-              <w:t>15.150.1005</w:t>
+              <w:t>TKDK-0115</w:t>
             </w:r>
           </w:p>
         </w:tc>
@@ -4705,25 +5659,8 @@
                 <w:color w:val="000000"/>
                 <w:sz w:val="16"/>
               </w:rPr>
-              <w:t>C 25/30 betonarme üst döşeme</w:t>
+              <w:t>Galvanizli düz sacdan yağmur oluğu (dere)</w:t>
             </w:r>
-          </w:p>
-        </w:tc>
-        <w:tc>
-          <w:tcPr>
-            <w:tcW w:type="dxa" w:w="573"/>
-            <w:tcBorders>
-              <w:top w:val="single" w:sz="4" w:space="0" w:color="808080"/>
-              <w:left w:val="single" w:sz="4" w:space="0" w:color="808080"/>
-              <w:bottom w:val="single" w:sz="4" w:space="0" w:color="808080"/>
-              <w:right w:val="single" w:sz="4" w:space="0" w:color="808080"/>
-            </w:tcBorders>
-          </w:tcPr>
-          <w:p>
-            <w:pPr>
-              <w:spacing w:before="20" w:after="20"/>
-              <w:jc w:val="left"/>
-            </w:pPr>
           </w:p>
         </w:tc>
         <w:tc>
@@ -4802,6 +5739,215 @@
               <w:spacing w:before="20" w:after="20"/>
               <w:jc w:val="left"/>
             </w:pPr>
+          </w:p>
+        </w:tc>
+        <w:tc>
+          <w:tcPr>
+            <w:tcW w:type="dxa" w:w="573"/>
+            <w:tcBorders>
+              <w:top w:val="single" w:sz="4" w:space="0" w:color="808080"/>
+              <w:left w:val="single" w:sz="4" w:space="0" w:color="808080"/>
+              <w:bottom w:val="single" w:sz="4" w:space="0" w:color="808080"/>
+              <w:right w:val="single" w:sz="4" w:space="0" w:color="808080"/>
+            </w:tcBorders>
+          </w:tcPr>
+          <w:p>
+            <w:pPr>
+              <w:spacing w:before="20" w:after="20"/>
+              <w:jc w:val="left"/>
+            </w:pPr>
+          </w:p>
+        </w:tc>
+        <w:tc>
+          <w:tcPr>
+            <w:tcW w:type="dxa" w:w="573"/>
+            <w:tcBorders>
+              <w:top w:val="single" w:sz="4" w:space="0" w:color="808080"/>
+              <w:left w:val="single" w:sz="4" w:space="0" w:color="808080"/>
+              <w:bottom w:val="single" w:sz="4" w:space="0" w:color="808080"/>
+              <w:right w:val="single" w:sz="4" w:space="0" w:color="808080"/>
+            </w:tcBorders>
+          </w:tcPr>
+          <w:p>
+            <w:pPr>
+              <w:spacing w:before="20" w:after="20"/>
+              <w:jc w:val="left"/>
+            </w:pPr>
+          </w:p>
+        </w:tc>
+        <w:tc>
+          <w:tcPr>
+            <w:tcW w:type="dxa" w:w="573"/>
+            <w:tcBorders>
+              <w:top w:val="single" w:sz="4" w:space="0" w:color="808080"/>
+              <w:left w:val="single" w:sz="4" w:space="0" w:color="808080"/>
+              <w:bottom w:val="single" w:sz="4" w:space="0" w:color="808080"/>
+              <w:right w:val="single" w:sz="4" w:space="0" w:color="808080"/>
+            </w:tcBorders>
+          </w:tcPr>
+          <w:p>
+            <w:pPr>
+              <w:spacing w:before="20" w:after="20"/>
+              <w:jc w:val="left"/>
+            </w:pPr>
+          </w:p>
+        </w:tc>
+        <w:tc>
+          <w:tcPr>
+            <w:tcW w:type="dxa" w:w="573"/>
+            <w:tcBorders>
+              <w:top w:val="single" w:sz="4" w:space="0" w:color="808080"/>
+              <w:left w:val="single" w:sz="4" w:space="0" w:color="808080"/>
+              <w:bottom w:val="single" w:sz="4" w:space="0" w:color="808080"/>
+              <w:right w:val="single" w:sz="4" w:space="0" w:color="808080"/>
+            </w:tcBorders>
+          </w:tcPr>
+          <w:p>
+            <w:pPr>
+              <w:spacing w:before="20" w:after="20"/>
+              <w:jc w:val="left"/>
+            </w:pPr>
+          </w:p>
+        </w:tc>
+        <w:tc>
+          <w:tcPr>
+            <w:tcW w:type="dxa" w:w="573"/>
+            <w:tcBorders>
+              <w:top w:val="single" w:sz="4" w:space="0" w:color="808080"/>
+              <w:left w:val="single" w:sz="4" w:space="0" w:color="808080"/>
+              <w:bottom w:val="single" w:sz="4" w:space="0" w:color="808080"/>
+              <w:right w:val="single" w:sz="4" w:space="0" w:color="808080"/>
+            </w:tcBorders>
+          </w:tcPr>
+          <w:p>
+            <w:pPr>
+              <w:spacing w:before="20" w:after="20"/>
+              <w:jc w:val="left"/>
+            </w:pPr>
+          </w:p>
+        </w:tc>
+      </w:tr>
+      <w:tr>
+        <w:tc>
+          <w:tcPr>
+            <w:tcW w:type="dxa" w:w="1146"/>
+            <w:tcBorders>
+              <w:top w:val="single" w:sz="4" w:space="0" w:color="808080"/>
+              <w:left w:val="single" w:sz="4" w:space="0" w:color="808080"/>
+              <w:bottom w:val="single" w:sz="4" w:space="0" w:color="808080"/>
+              <w:right w:val="single" w:sz="4" w:space="0" w:color="808080"/>
+            </w:tcBorders>
+          </w:tcPr>
+          <w:p>
+            <w:pPr>
+              <w:spacing w:before="20" w:after="20"/>
+              <w:jc w:val="left"/>
+            </w:pPr>
+          </w:p>
+        </w:tc>
+        <w:tc>
+          <w:tcPr>
+            <w:tcW w:type="dxa" w:w="841"/>
+            <w:tcBorders>
+              <w:top w:val="single" w:sz="4" w:space="0" w:color="808080"/>
+              <w:left w:val="single" w:sz="4" w:space="0" w:color="808080"/>
+              <w:bottom w:val="single" w:sz="4" w:space="0" w:color="808080"/>
+              <w:right w:val="single" w:sz="4" w:space="0" w:color="808080"/>
+            </w:tcBorders>
+          </w:tcPr>
+          <w:p>
+            <w:pPr>
+              <w:spacing w:before="20" w:after="20"/>
+              <w:jc w:val="left"/>
+            </w:pPr>
+            <w:r>
+              <w:rPr>
+                <w:rFonts w:ascii="Calibri" w:hAnsi="Calibri"/>
+                <w:b w:val="0"/>
+                <w:i w:val="0"/>
+                <w:color w:val="000000"/>
+                <w:sz w:val="16"/>
+              </w:rPr>
+              <w:t>15.315.1001</w:t>
+            </w:r>
+          </w:p>
+        </w:tc>
+        <w:tc>
+          <w:tcPr>
+            <w:tcW w:type="dxa" w:w="3286"/>
+            <w:tcBorders>
+              <w:top w:val="single" w:sz="4" w:space="0" w:color="808080"/>
+              <w:left w:val="single" w:sz="4" w:space="0" w:color="808080"/>
+              <w:bottom w:val="single" w:sz="4" w:space="0" w:color="808080"/>
+              <w:right w:val="single" w:sz="4" w:space="0" w:color="808080"/>
+            </w:tcBorders>
+          </w:tcPr>
+          <w:p>
+            <w:pPr>
+              <w:spacing w:before="20" w:after="20"/>
+              <w:jc w:val="left"/>
+            </w:pPr>
+            <w:r>
+              <w:rPr>
+                <w:rFonts w:ascii="Calibri" w:hAnsi="Calibri"/>
+                <w:b w:val="0"/>
+                <w:i w:val="0"/>
+                <w:color w:val="000000"/>
+                <w:sz w:val="16"/>
+              </w:rPr>
+              <w:t>Ø70 sert PVC yağmur suyu iniş borusu</w:t>
+            </w:r>
+          </w:p>
+        </w:tc>
+        <w:tc>
+          <w:tcPr>
+            <w:tcW w:type="dxa" w:w="573"/>
+            <w:tcBorders>
+              <w:top w:val="single" w:sz="4" w:space="0" w:color="808080"/>
+              <w:left w:val="single" w:sz="4" w:space="0" w:color="808080"/>
+              <w:bottom w:val="single" w:sz="4" w:space="0" w:color="808080"/>
+              <w:right w:val="single" w:sz="4" w:space="0" w:color="808080"/>
+            </w:tcBorders>
+          </w:tcPr>
+          <w:p>
+            <w:pPr>
+              <w:spacing w:before="20" w:after="20"/>
+              <w:jc w:val="left"/>
+            </w:pPr>
+          </w:p>
+        </w:tc>
+        <w:tc>
+          <w:tcPr>
+            <w:tcW w:type="dxa" w:w="573"/>
+            <w:tcBorders>
+              <w:top w:val="single" w:sz="4" w:space="0" w:color="808080"/>
+              <w:left w:val="single" w:sz="4" w:space="0" w:color="808080"/>
+              <w:bottom w:val="single" w:sz="4" w:space="0" w:color="808080"/>
+              <w:right w:val="single" w:sz="4" w:space="0" w:color="808080"/>
+            </w:tcBorders>
+          </w:tcPr>
+          <w:p>
+            <w:pPr>
+              <w:spacing w:before="20" w:after="20"/>
+              <w:jc w:val="left"/>
+            </w:pPr>
+          </w:p>
+        </w:tc>
+        <w:tc>
+          <w:tcPr>
+            <w:tcW w:type="dxa" w:w="573"/>
+            <w:tcBorders>
+              <w:top w:val="single" w:sz="4" w:space="0" w:color="808080"/>
+              <w:left w:val="single" w:sz="4" w:space="0" w:color="808080"/>
+              <w:bottom w:val="single" w:sz="4" w:space="0" w:color="808080"/>
+              <w:right w:val="single" w:sz="4" w:space="0" w:color="808080"/>
+            </w:tcBorders>
+          </w:tcPr>
+          <w:p>
+            <w:pPr>
+              <w:spacing w:before="20" w:after="20"/>
+              <w:jc w:val="left"/>
+            </w:pPr>
             <w:r>
               <w:rPr>
                 <w:rFonts w:ascii="Calibri" w:hAnsi="Calibri"/>
@@ -4829,6 +5975,191 @@
               <w:spacing w:before="20" w:after="20"/>
               <w:jc w:val="left"/>
             </w:pPr>
+          </w:p>
+        </w:tc>
+        <w:tc>
+          <w:tcPr>
+            <w:tcW w:type="dxa" w:w="573"/>
+            <w:tcBorders>
+              <w:top w:val="single" w:sz="4" w:space="0" w:color="808080"/>
+              <w:left w:val="single" w:sz="4" w:space="0" w:color="808080"/>
+              <w:bottom w:val="single" w:sz="4" w:space="0" w:color="808080"/>
+              <w:right w:val="single" w:sz="4" w:space="0" w:color="808080"/>
+            </w:tcBorders>
+          </w:tcPr>
+          <w:p>
+            <w:pPr>
+              <w:spacing w:before="20" w:after="20"/>
+              <w:jc w:val="left"/>
+            </w:pPr>
+          </w:p>
+        </w:tc>
+        <w:tc>
+          <w:tcPr>
+            <w:tcW w:type="dxa" w:w="573"/>
+            <w:tcBorders>
+              <w:top w:val="single" w:sz="4" w:space="0" w:color="808080"/>
+              <w:left w:val="single" w:sz="4" w:space="0" w:color="808080"/>
+              <w:bottom w:val="single" w:sz="4" w:space="0" w:color="808080"/>
+              <w:right w:val="single" w:sz="4" w:space="0" w:color="808080"/>
+            </w:tcBorders>
+          </w:tcPr>
+          <w:p>
+            <w:pPr>
+              <w:spacing w:before="20" w:after="20"/>
+              <w:jc w:val="left"/>
+            </w:pPr>
+          </w:p>
+        </w:tc>
+        <w:tc>
+          <w:tcPr>
+            <w:tcW w:type="dxa" w:w="573"/>
+            <w:tcBorders>
+              <w:top w:val="single" w:sz="4" w:space="0" w:color="808080"/>
+              <w:left w:val="single" w:sz="4" w:space="0" w:color="808080"/>
+              <w:bottom w:val="single" w:sz="4" w:space="0" w:color="808080"/>
+              <w:right w:val="single" w:sz="4" w:space="0" w:color="808080"/>
+            </w:tcBorders>
+          </w:tcPr>
+          <w:p>
+            <w:pPr>
+              <w:spacing w:before="20" w:after="20"/>
+              <w:jc w:val="left"/>
+            </w:pPr>
+          </w:p>
+        </w:tc>
+        <w:tc>
+          <w:tcPr>
+            <w:tcW w:type="dxa" w:w="573"/>
+            <w:tcBorders>
+              <w:top w:val="single" w:sz="4" w:space="0" w:color="808080"/>
+              <w:left w:val="single" w:sz="4" w:space="0" w:color="808080"/>
+              <w:bottom w:val="single" w:sz="4" w:space="0" w:color="808080"/>
+              <w:right w:val="single" w:sz="4" w:space="0" w:color="808080"/>
+            </w:tcBorders>
+          </w:tcPr>
+          <w:p>
+            <w:pPr>
+              <w:spacing w:before="20" w:after="20"/>
+              <w:jc w:val="left"/>
+            </w:pPr>
+          </w:p>
+        </w:tc>
+        <w:tc>
+          <w:tcPr>
+            <w:tcW w:type="dxa" w:w="573"/>
+            <w:tcBorders>
+              <w:top w:val="single" w:sz="4" w:space="0" w:color="808080"/>
+              <w:left w:val="single" w:sz="4" w:space="0" w:color="808080"/>
+              <w:bottom w:val="single" w:sz="4" w:space="0" w:color="808080"/>
+              <w:right w:val="single" w:sz="4" w:space="0" w:color="808080"/>
+            </w:tcBorders>
+          </w:tcPr>
+          <w:p>
+            <w:pPr>
+              <w:spacing w:before="20" w:after="20"/>
+              <w:jc w:val="left"/>
+            </w:pPr>
+          </w:p>
+        </w:tc>
+      </w:tr>
+      <w:tr>
+        <w:tc>
+          <w:tcPr>
+            <w:tcW w:type="dxa" w:w="1146"/>
+            <w:tcBorders>
+              <w:top w:val="single" w:sz="4" w:space="0" w:color="808080"/>
+              <w:left w:val="single" w:sz="4" w:space="0" w:color="808080"/>
+              <w:bottom w:val="single" w:sz="4" w:space="0" w:color="808080"/>
+              <w:right w:val="single" w:sz="4" w:space="0" w:color="808080"/>
+            </w:tcBorders>
+          </w:tcPr>
+          <w:p>
+            <w:pPr>
+              <w:spacing w:before="20" w:after="20"/>
+              <w:jc w:val="left"/>
+            </w:pPr>
+            <w:r>
+              <w:rPr>
+                <w:rFonts w:ascii="Calibri" w:hAnsi="Calibri"/>
+                <w:b w:val="0"/>
+                <w:i w:val="0"/>
+                <w:color w:val="000000"/>
+                <w:sz w:val="16"/>
+              </w:rPr>
+              <w:t>Kapı Doğraması</w:t>
+            </w:r>
+          </w:p>
+        </w:tc>
+        <w:tc>
+          <w:tcPr>
+            <w:tcW w:type="dxa" w:w="841"/>
+            <w:tcBorders>
+              <w:top w:val="single" w:sz="4" w:space="0" w:color="808080"/>
+              <w:left w:val="single" w:sz="4" w:space="0" w:color="808080"/>
+              <w:bottom w:val="single" w:sz="4" w:space="0" w:color="808080"/>
+              <w:right w:val="single" w:sz="4" w:space="0" w:color="808080"/>
+            </w:tcBorders>
+          </w:tcPr>
+          <w:p>
+            <w:pPr>
+              <w:spacing w:before="20" w:after="20"/>
+              <w:jc w:val="left"/>
+            </w:pPr>
+            <w:r>
+              <w:rPr>
+                <w:rFonts w:ascii="Calibri" w:hAnsi="Calibri"/>
+                <w:b w:val="0"/>
+                <w:i w:val="0"/>
+                <w:color w:val="000000"/>
+                <w:sz w:val="16"/>
+              </w:rPr>
+              <w:t>TKDK-0151</w:t>
+            </w:r>
+          </w:p>
+        </w:tc>
+        <w:tc>
+          <w:tcPr>
+            <w:tcW w:type="dxa" w:w="3286"/>
+            <w:tcBorders>
+              <w:top w:val="single" w:sz="4" w:space="0" w:color="808080"/>
+              <w:left w:val="single" w:sz="4" w:space="0" w:color="808080"/>
+              <w:bottom w:val="single" w:sz="4" w:space="0" w:color="808080"/>
+              <w:right w:val="single" w:sz="4" w:space="0" w:color="808080"/>
+            </w:tcBorders>
+          </w:tcPr>
+          <w:p>
+            <w:pPr>
+              <w:spacing w:before="20" w:after="20"/>
+              <w:jc w:val="left"/>
+            </w:pPr>
+            <w:r>
+              <w:rPr>
+                <w:rFonts w:ascii="Calibri" w:hAnsi="Calibri"/>
+                <w:b w:val="0"/>
+                <w:i w:val="0"/>
+                <w:color w:val="000000"/>
+                <w:sz w:val="16"/>
+              </w:rPr>
+              <w:t>5 cm poliüretan dolgulu ısı yalıtımlı kapı — servis kapısı 100/220 ve yükleme kapısı 300/300</w:t>
+            </w:r>
+          </w:p>
+        </w:tc>
+        <w:tc>
+          <w:tcPr>
+            <w:tcW w:type="dxa" w:w="573"/>
+            <w:tcBorders>
+              <w:top w:val="single" w:sz="4" w:space="0" w:color="808080"/>
+              <w:left w:val="single" w:sz="4" w:space="0" w:color="808080"/>
+              <w:bottom w:val="single" w:sz="4" w:space="0" w:color="808080"/>
+              <w:right w:val="single" w:sz="4" w:space="0" w:color="808080"/>
+            </w:tcBorders>
+          </w:tcPr>
+          <w:p>
+            <w:pPr>
+              <w:spacing w:before="20" w:after="20"/>
+              <w:jc w:val="left"/>
+            </w:pPr>
             <w:r>
               <w:rPr>
                 <w:rFonts w:ascii="Calibri" w:hAnsi="Calibri"/>
@@ -4856,6 +6187,232 @@
               <w:spacing w:before="20" w:after="20"/>
               <w:jc w:val="left"/>
             </w:pPr>
+          </w:p>
+        </w:tc>
+        <w:tc>
+          <w:tcPr>
+            <w:tcW w:type="dxa" w:w="573"/>
+            <w:tcBorders>
+              <w:top w:val="single" w:sz="4" w:space="0" w:color="808080"/>
+              <w:left w:val="single" w:sz="4" w:space="0" w:color="808080"/>
+              <w:bottom w:val="single" w:sz="4" w:space="0" w:color="808080"/>
+              <w:right w:val="single" w:sz="4" w:space="0" w:color="808080"/>
+            </w:tcBorders>
+          </w:tcPr>
+          <w:p>
+            <w:pPr>
+              <w:spacing w:before="20" w:after="20"/>
+              <w:jc w:val="left"/>
+            </w:pPr>
+          </w:p>
+        </w:tc>
+        <w:tc>
+          <w:tcPr>
+            <w:tcW w:type="dxa" w:w="573"/>
+            <w:tcBorders>
+              <w:top w:val="single" w:sz="4" w:space="0" w:color="808080"/>
+              <w:left w:val="single" w:sz="4" w:space="0" w:color="808080"/>
+              <w:bottom w:val="single" w:sz="4" w:space="0" w:color="808080"/>
+              <w:right w:val="single" w:sz="4" w:space="0" w:color="808080"/>
+            </w:tcBorders>
+          </w:tcPr>
+          <w:p>
+            <w:pPr>
+              <w:spacing w:before="20" w:after="20"/>
+              <w:jc w:val="left"/>
+            </w:pPr>
+          </w:p>
+        </w:tc>
+        <w:tc>
+          <w:tcPr>
+            <w:tcW w:type="dxa" w:w="573"/>
+            <w:tcBorders>
+              <w:top w:val="single" w:sz="4" w:space="0" w:color="808080"/>
+              <w:left w:val="single" w:sz="4" w:space="0" w:color="808080"/>
+              <w:bottom w:val="single" w:sz="4" w:space="0" w:color="808080"/>
+              <w:right w:val="single" w:sz="4" w:space="0" w:color="808080"/>
+            </w:tcBorders>
+          </w:tcPr>
+          <w:p>
+            <w:pPr>
+              <w:spacing w:before="20" w:after="20"/>
+              <w:jc w:val="left"/>
+            </w:pPr>
+          </w:p>
+        </w:tc>
+        <w:tc>
+          <w:tcPr>
+            <w:tcW w:type="dxa" w:w="573"/>
+            <w:tcBorders>
+              <w:top w:val="single" w:sz="4" w:space="0" w:color="808080"/>
+              <w:left w:val="single" w:sz="4" w:space="0" w:color="808080"/>
+              <w:bottom w:val="single" w:sz="4" w:space="0" w:color="808080"/>
+              <w:right w:val="single" w:sz="4" w:space="0" w:color="808080"/>
+            </w:tcBorders>
+          </w:tcPr>
+          <w:p>
+            <w:pPr>
+              <w:spacing w:before="20" w:after="20"/>
+              <w:jc w:val="left"/>
+            </w:pPr>
+          </w:p>
+        </w:tc>
+        <w:tc>
+          <w:tcPr>
+            <w:tcW w:type="dxa" w:w="573"/>
+            <w:tcBorders>
+              <w:top w:val="single" w:sz="4" w:space="0" w:color="808080"/>
+              <w:left w:val="single" w:sz="4" w:space="0" w:color="808080"/>
+              <w:bottom w:val="single" w:sz="4" w:space="0" w:color="808080"/>
+              <w:right w:val="single" w:sz="4" w:space="0" w:color="808080"/>
+            </w:tcBorders>
+          </w:tcPr>
+          <w:p>
+            <w:pPr>
+              <w:spacing w:before="20" w:after="20"/>
+              <w:jc w:val="left"/>
+            </w:pPr>
+          </w:p>
+        </w:tc>
+        <w:tc>
+          <w:tcPr>
+            <w:tcW w:type="dxa" w:w="573"/>
+            <w:tcBorders>
+              <w:top w:val="single" w:sz="4" w:space="0" w:color="808080"/>
+              <w:left w:val="single" w:sz="4" w:space="0" w:color="808080"/>
+              <w:bottom w:val="single" w:sz="4" w:space="0" w:color="808080"/>
+              <w:right w:val="single" w:sz="4" w:space="0" w:color="808080"/>
+            </w:tcBorders>
+          </w:tcPr>
+          <w:p>
+            <w:pPr>
+              <w:spacing w:before="20" w:after="20"/>
+              <w:jc w:val="left"/>
+            </w:pPr>
+          </w:p>
+        </w:tc>
+        <w:tc>
+          <w:tcPr>
+            <w:tcW w:type="dxa" w:w="573"/>
+            <w:tcBorders>
+              <w:top w:val="single" w:sz="4" w:space="0" w:color="808080"/>
+              <w:left w:val="single" w:sz="4" w:space="0" w:color="808080"/>
+              <w:bottom w:val="single" w:sz="4" w:space="0" w:color="808080"/>
+              <w:right w:val="single" w:sz="4" w:space="0" w:color="808080"/>
+            </w:tcBorders>
+          </w:tcPr>
+          <w:p>
+            <w:pPr>
+              <w:spacing w:before="20" w:after="20"/>
+              <w:jc w:val="left"/>
+            </w:pPr>
+          </w:p>
+        </w:tc>
+      </w:tr>
+      <w:tr>
+        <w:tc>
+          <w:tcPr>
+            <w:tcW w:type="dxa" w:w="1146"/>
+            <w:tcBorders>
+              <w:top w:val="single" w:sz="4" w:space="0" w:color="808080"/>
+              <w:left w:val="single" w:sz="4" w:space="0" w:color="808080"/>
+              <w:bottom w:val="single" w:sz="4" w:space="0" w:color="808080"/>
+              <w:right w:val="single" w:sz="4" w:space="0" w:color="808080"/>
+            </w:tcBorders>
+          </w:tcPr>
+          <w:p>
+            <w:pPr>
+              <w:spacing w:before="20" w:after="20"/>
+              <w:jc w:val="left"/>
+            </w:pPr>
+          </w:p>
+        </w:tc>
+        <w:tc>
+          <w:tcPr>
+            <w:tcW w:type="dxa" w:w="841"/>
+            <w:tcBorders>
+              <w:top w:val="single" w:sz="4" w:space="0" w:color="808080"/>
+              <w:left w:val="single" w:sz="4" w:space="0" w:color="808080"/>
+              <w:bottom w:val="single" w:sz="4" w:space="0" w:color="808080"/>
+              <w:right w:val="single" w:sz="4" w:space="0" w:color="808080"/>
+            </w:tcBorders>
+          </w:tcPr>
+          <w:p>
+            <w:pPr>
+              <w:spacing w:before="20" w:after="20"/>
+              <w:jc w:val="left"/>
+            </w:pPr>
+            <w:r>
+              <w:rPr>
+                <w:rFonts w:ascii="Calibri" w:hAnsi="Calibri"/>
+                <w:b w:val="0"/>
+                <w:i w:val="0"/>
+                <w:color w:val="000000"/>
+                <w:sz w:val="16"/>
+              </w:rPr>
+              <w:t>TKDK-0175</w:t>
+            </w:r>
+          </w:p>
+        </w:tc>
+        <w:tc>
+          <w:tcPr>
+            <w:tcW w:type="dxa" w:w="3286"/>
+            <w:tcBorders>
+              <w:top w:val="single" w:sz="4" w:space="0" w:color="808080"/>
+              <w:left w:val="single" w:sz="4" w:space="0" w:color="808080"/>
+              <w:bottom w:val="single" w:sz="4" w:space="0" w:color="808080"/>
+              <w:right w:val="single" w:sz="4" w:space="0" w:color="808080"/>
+            </w:tcBorders>
+          </w:tcPr>
+          <w:p>
+            <w:pPr>
+              <w:spacing w:before="20" w:after="20"/>
+              <w:jc w:val="left"/>
+            </w:pPr>
+            <w:r>
+              <w:rPr>
+                <w:rFonts w:ascii="Calibri" w:hAnsi="Calibri"/>
+                <w:b w:val="0"/>
+                <w:i w:val="0"/>
+                <w:color w:val="000000"/>
+                <w:sz w:val="16"/>
+              </w:rPr>
+              <w:t>PVC kaplamalı MDF presli iç kapı kanadı (hijyen bölmesi, ofis ve WC)</w:t>
+            </w:r>
+          </w:p>
+        </w:tc>
+        <w:tc>
+          <w:tcPr>
+            <w:tcW w:type="dxa" w:w="573"/>
+            <w:tcBorders>
+              <w:top w:val="single" w:sz="4" w:space="0" w:color="808080"/>
+              <w:left w:val="single" w:sz="4" w:space="0" w:color="808080"/>
+              <w:bottom w:val="single" w:sz="4" w:space="0" w:color="808080"/>
+              <w:right w:val="single" w:sz="4" w:space="0" w:color="808080"/>
+            </w:tcBorders>
+          </w:tcPr>
+          <w:p>
+            <w:pPr>
+              <w:spacing w:before="20" w:after="20"/>
+              <w:jc w:val="left"/>
+            </w:pPr>
+          </w:p>
+        </w:tc>
+        <w:tc>
+          <w:tcPr>
+            <w:tcW w:type="dxa" w:w="573"/>
+            <w:tcBorders>
+              <w:top w:val="single" w:sz="4" w:space="0" w:color="808080"/>
+              <w:left w:val="single" w:sz="4" w:space="0" w:color="808080"/>
+              <w:bottom w:val="single" w:sz="4" w:space="0" w:color="808080"/>
+              <w:right w:val="single" w:sz="4" w:space="0" w:color="808080"/>
+            </w:tcBorders>
+          </w:tcPr>
+          <w:p>
+            <w:pPr>
+              <w:spacing w:before="20" w:after="20"/>
+              <w:jc w:val="left"/>
+            </w:pPr>
             <w:r>
               <w:rPr>
                 <w:rFonts w:ascii="Calibri" w:hAnsi="Calibri"/>
@@ -4902,11 +6459,113 @@
             </w:pPr>
           </w:p>
         </w:tc>
+        <w:tc>
+          <w:tcPr>
+            <w:tcW w:type="dxa" w:w="573"/>
+            <w:tcBorders>
+              <w:top w:val="single" w:sz="4" w:space="0" w:color="808080"/>
+              <w:left w:val="single" w:sz="4" w:space="0" w:color="808080"/>
+              <w:bottom w:val="single" w:sz="4" w:space="0" w:color="808080"/>
+              <w:right w:val="single" w:sz="4" w:space="0" w:color="808080"/>
+            </w:tcBorders>
+          </w:tcPr>
+          <w:p>
+            <w:pPr>
+              <w:spacing w:before="20" w:after="20"/>
+              <w:jc w:val="left"/>
+            </w:pPr>
+          </w:p>
+        </w:tc>
+        <w:tc>
+          <w:tcPr>
+            <w:tcW w:type="dxa" w:w="573"/>
+            <w:tcBorders>
+              <w:top w:val="single" w:sz="4" w:space="0" w:color="808080"/>
+              <w:left w:val="single" w:sz="4" w:space="0" w:color="808080"/>
+              <w:bottom w:val="single" w:sz="4" w:space="0" w:color="808080"/>
+              <w:right w:val="single" w:sz="4" w:space="0" w:color="808080"/>
+            </w:tcBorders>
+          </w:tcPr>
+          <w:p>
+            <w:pPr>
+              <w:spacing w:before="20" w:after="20"/>
+              <w:jc w:val="left"/>
+            </w:pPr>
+          </w:p>
+        </w:tc>
+        <w:tc>
+          <w:tcPr>
+            <w:tcW w:type="dxa" w:w="573"/>
+            <w:tcBorders>
+              <w:top w:val="single" w:sz="4" w:space="0" w:color="808080"/>
+              <w:left w:val="single" w:sz="4" w:space="0" w:color="808080"/>
+              <w:bottom w:val="single" w:sz="4" w:space="0" w:color="808080"/>
+              <w:right w:val="single" w:sz="4" w:space="0" w:color="808080"/>
+            </w:tcBorders>
+          </w:tcPr>
+          <w:p>
+            <w:pPr>
+              <w:spacing w:before="20" w:after="20"/>
+              <w:jc w:val="left"/>
+            </w:pPr>
+          </w:p>
+        </w:tc>
+        <w:tc>
+          <w:tcPr>
+            <w:tcW w:type="dxa" w:w="573"/>
+            <w:tcBorders>
+              <w:top w:val="single" w:sz="4" w:space="0" w:color="808080"/>
+              <w:left w:val="single" w:sz="4" w:space="0" w:color="808080"/>
+              <w:bottom w:val="single" w:sz="4" w:space="0" w:color="808080"/>
+              <w:right w:val="single" w:sz="4" w:space="0" w:color="808080"/>
+            </w:tcBorders>
+          </w:tcPr>
+          <w:p>
+            <w:pPr>
+              <w:spacing w:before="20" w:after="20"/>
+              <w:jc w:val="left"/>
+            </w:pPr>
+          </w:p>
+        </w:tc>
+        <w:tc>
+          <w:tcPr>
+            <w:tcW w:type="dxa" w:w="573"/>
+            <w:tcBorders>
+              <w:top w:val="single" w:sz="4" w:space="0" w:color="808080"/>
+              <w:left w:val="single" w:sz="4" w:space="0" w:color="808080"/>
+              <w:bottom w:val="single" w:sz="4" w:space="0" w:color="808080"/>
+              <w:right w:val="single" w:sz="4" w:space="0" w:color="808080"/>
+            </w:tcBorders>
+          </w:tcPr>
+          <w:p>
+            <w:pPr>
+              <w:spacing w:before="20" w:after="20"/>
+              <w:jc w:val="left"/>
+            </w:pPr>
+          </w:p>
+        </w:tc>
       </w:tr>
       <w:tr>
         <w:tc>
           <w:tcPr>
             <w:tcW w:type="dxa" w:w="1146"/>
+            <w:tcBorders>
+              <w:top w:val="single" w:sz="4" w:space="0" w:color="808080"/>
+              <w:left w:val="single" w:sz="4" w:space="0" w:color="808080"/>
+              <w:bottom w:val="single" w:sz="4" w:space="0" w:color="808080"/>
+              <w:right w:val="single" w:sz="4" w:space="0" w:color="808080"/>
+            </w:tcBorders>
+          </w:tcPr>
+          <w:p>
+            <w:pPr>
+              <w:spacing w:before="20" w:after="20"/>
+              <w:jc w:val="left"/>
+            </w:pPr>
+          </w:p>
+        </w:tc>
+        <w:tc>
+          <w:tcPr>
+            <w:tcW w:type="dxa" w:w="841"/>
             <w:tcBorders>
               <w:top w:val="single" w:sz="4" w:space="0" w:color="808080"/>
               <w:left w:val="single" w:sz="4" w:space="0" w:color="808080"/>
@@ -4927,13 +6586,13 @@
                 <w:color w:val="000000"/>
                 <w:sz w:val="16"/>
               </w:rPr>
-              <w:t>Çatı İmalatları</w:t>
+              <w:t>15.550.1002</w:t>
             </w:r>
           </w:p>
         </w:tc>
         <w:tc>
           <w:tcPr>
-            <w:tcW w:type="dxa" w:w="841"/>
+            <w:tcW w:type="dxa" w:w="3286"/>
             <w:tcBorders>
               <w:top w:val="single" w:sz="4" w:space="0" w:color="808080"/>
               <w:left w:val="single" w:sz="4" w:space="0" w:color="808080"/>
@@ -4954,52 +6613,8 @@
                 <w:color w:val="000000"/>
                 <w:sz w:val="16"/>
               </w:rPr>
-              <w:t>TKDK-0042</w:t>
+              <w:t>1,50 mm sacdan bükme kapı kasası (hijyen bölmesi, ofis ve WC)</w:t>
             </w:r>
-          </w:p>
-        </w:tc>
-        <w:tc>
-          <w:tcPr>
-            <w:tcW w:type="dxa" w:w="3286"/>
-            <w:tcBorders>
-              <w:top w:val="single" w:sz="4" w:space="0" w:color="808080"/>
-              <w:left w:val="single" w:sz="4" w:space="0" w:color="808080"/>
-              <w:bottom w:val="single" w:sz="4" w:space="0" w:color="808080"/>
-              <w:right w:val="single" w:sz="4" w:space="0" w:color="808080"/>
-            </w:tcBorders>
-          </w:tcPr>
-          <w:p>
-            <w:pPr>
-              <w:spacing w:before="20" w:after="20"/>
-              <w:jc w:val="left"/>
-            </w:pPr>
-            <w:r>
-              <w:rPr>
-                <w:rFonts w:ascii="Calibri" w:hAnsi="Calibri"/>
-                <w:b w:val="0"/>
-                <w:i w:val="0"/>
-                <w:color w:val="000000"/>
-                <w:sz w:val="16"/>
-              </w:rPr>
-              <w:t>6 cm poliüretan dolgulu ısı yalıtımlı sandviç çatı paneli</w:t>
-            </w:r>
-          </w:p>
-        </w:tc>
-        <w:tc>
-          <w:tcPr>
-            <w:tcW w:type="dxa" w:w="573"/>
-            <w:tcBorders>
-              <w:top w:val="single" w:sz="4" w:space="0" w:color="808080"/>
-              <w:left w:val="single" w:sz="4" w:space="0" w:color="808080"/>
-              <w:bottom w:val="single" w:sz="4" w:space="0" w:color="808080"/>
-              <w:right w:val="single" w:sz="4" w:space="0" w:color="808080"/>
-            </w:tcBorders>
-          </w:tcPr>
-          <w:p>
-            <w:pPr>
-              <w:spacing w:before="20" w:after="20"/>
-              <w:jc w:val="left"/>
-            </w:pPr>
           </w:p>
         </w:tc>
         <w:tc>
@@ -5148,28 +6763,28 @@
             </w:pPr>
           </w:p>
         </w:tc>
+        <w:tc>
+          <w:tcPr>
+            <w:tcW w:type="dxa" w:w="573"/>
+            <w:tcBorders>
+              <w:top w:val="single" w:sz="4" w:space="0" w:color="808080"/>
+              <w:left w:val="single" w:sz="4" w:space="0" w:color="808080"/>
+              <w:bottom w:val="single" w:sz="4" w:space="0" w:color="808080"/>
+              <w:right w:val="single" w:sz="4" w:space="0" w:color="808080"/>
+            </w:tcBorders>
+          </w:tcPr>
+          <w:p>
+            <w:pPr>
+              <w:spacing w:before="20" w:after="20"/>
+              <w:jc w:val="left"/>
+            </w:pPr>
+          </w:p>
+        </w:tc>
       </w:tr>
       <w:tr>
         <w:tc>
           <w:tcPr>
             <w:tcW w:type="dxa" w:w="1146"/>
-            <w:tcBorders>
-              <w:top w:val="single" w:sz="4" w:space="0" w:color="808080"/>
-              <w:left w:val="single" w:sz="4" w:space="0" w:color="808080"/>
-              <w:bottom w:val="single" w:sz="4" w:space="0" w:color="808080"/>
-              <w:right w:val="single" w:sz="4" w:space="0" w:color="808080"/>
-            </w:tcBorders>
-          </w:tcPr>
-          <w:p>
-            <w:pPr>
-              <w:spacing w:before="20" w:after="20"/>
-              <w:jc w:val="left"/>
-            </w:pPr>
-          </w:p>
-        </w:tc>
-        <w:tc>
-          <w:tcPr>
-            <w:tcW w:type="dxa" w:w="841"/>
             <w:tcBorders>
               <w:top w:val="single" w:sz="4" w:space="0" w:color="808080"/>
               <w:left w:val="single" w:sz="4" w:space="0" w:color="808080"/>
@@ -5190,13 +6805,13 @@
                 <w:color w:val="000000"/>
                 <w:sz w:val="16"/>
               </w:rPr>
-              <w:t>15.550.1202</w:t>
+              <w:t>Kanalizasyon İmalatları</w:t>
             </w:r>
           </w:p>
         </w:tc>
         <w:tc>
           <w:tcPr>
-            <w:tcW w:type="dxa" w:w="3286"/>
+            <w:tcW w:type="dxa" w:w="841"/>
             <w:tcBorders>
               <w:top w:val="single" w:sz="4" w:space="0" w:color="808080"/>
               <w:left w:val="single" w:sz="4" w:space="0" w:color="808080"/>
@@ -5217,8 +6832,103 @@
                 <w:color w:val="000000"/>
                 <w:sz w:val="16"/>
               </w:rPr>
-              <w:t>Lama ve profil demirden mahya, saçak ve köşe kapaması</w:t>
+              <w:t>ÖP-15</w:t>
             </w:r>
+          </w:p>
+        </w:tc>
+        <w:tc>
+          <w:tcPr>
+            <w:tcW w:type="dxa" w:w="3286"/>
+            <w:tcBorders>
+              <w:top w:val="single" w:sz="4" w:space="0" w:color="808080"/>
+              <w:left w:val="single" w:sz="4" w:space="0" w:color="808080"/>
+              <w:bottom w:val="single" w:sz="4" w:space="0" w:color="808080"/>
+              <w:right w:val="single" w:sz="4" w:space="0" w:color="808080"/>
+            </w:tcBorders>
+          </w:tcPr>
+          <w:p>
+            <w:pPr>
+              <w:spacing w:before="20" w:after="20"/>
+              <w:jc w:val="left"/>
+            </w:pPr>
+            <w:r>
+              <w:rPr>
+                <w:rFonts w:ascii="Calibri" w:hAnsi="Calibri"/>
+                <w:b w:val="0"/>
+                <w:i w:val="0"/>
+                <w:color w:val="000000"/>
+                <w:sz w:val="16"/>
+              </w:rPr>
+              <w:t>Prefabrik polietilen sızdırmaz foseptik tankı — 6 m³</w:t>
+            </w:r>
+          </w:p>
+        </w:tc>
+        <w:tc>
+          <w:tcPr>
+            <w:tcW w:type="dxa" w:w="573"/>
+            <w:tcBorders>
+              <w:top w:val="single" w:sz="4" w:space="0" w:color="808080"/>
+              <w:left w:val="single" w:sz="4" w:space="0" w:color="808080"/>
+              <w:bottom w:val="single" w:sz="4" w:space="0" w:color="808080"/>
+              <w:right w:val="single" w:sz="4" w:space="0" w:color="808080"/>
+            </w:tcBorders>
+          </w:tcPr>
+          <w:p>
+            <w:pPr>
+              <w:spacing w:before="20" w:after="20"/>
+              <w:jc w:val="left"/>
+            </w:pPr>
+          </w:p>
+        </w:tc>
+        <w:tc>
+          <w:tcPr>
+            <w:tcW w:type="dxa" w:w="573"/>
+            <w:tcBorders>
+              <w:top w:val="single" w:sz="4" w:space="0" w:color="808080"/>
+              <w:left w:val="single" w:sz="4" w:space="0" w:color="808080"/>
+              <w:bottom w:val="single" w:sz="4" w:space="0" w:color="808080"/>
+              <w:right w:val="single" w:sz="4" w:space="0" w:color="808080"/>
+            </w:tcBorders>
+          </w:tcPr>
+          <w:p>
+            <w:pPr>
+              <w:spacing w:before="20" w:after="20"/>
+              <w:jc w:val="left"/>
+            </w:pPr>
+          </w:p>
+        </w:tc>
+        <w:tc>
+          <w:tcPr>
+            <w:tcW w:type="dxa" w:w="573"/>
+            <w:tcBorders>
+              <w:top w:val="single" w:sz="4" w:space="0" w:color="808080"/>
+              <w:left w:val="single" w:sz="4" w:space="0" w:color="808080"/>
+              <w:bottom w:val="single" w:sz="4" w:space="0" w:color="808080"/>
+              <w:right w:val="single" w:sz="4" w:space="0" w:color="808080"/>
+            </w:tcBorders>
+          </w:tcPr>
+          <w:p>
+            <w:pPr>
+              <w:spacing w:before="20" w:after="20"/>
+              <w:jc w:val="left"/>
+            </w:pPr>
+          </w:p>
+        </w:tc>
+        <w:tc>
+          <w:tcPr>
+            <w:tcW w:type="dxa" w:w="573"/>
+            <w:tcBorders>
+              <w:top w:val="single" w:sz="4" w:space="0" w:color="808080"/>
+              <w:left w:val="single" w:sz="4" w:space="0" w:color="808080"/>
+              <w:bottom w:val="single" w:sz="4" w:space="0" w:color="808080"/>
+              <w:right w:val="single" w:sz="4" w:space="0" w:color="808080"/>
+            </w:tcBorders>
+          </w:tcPr>
+          <w:p>
+            <w:pPr>
+              <w:spacing w:before="20" w:after="20"/>
+              <w:jc w:val="left"/>
+            </w:pPr>
           </w:p>
         </w:tc>
         <w:tc>
@@ -5316,74 +7026,6 @@
             </w:pPr>
           </w:p>
         </w:tc>
-        <w:tc>
-          <w:tcPr>
-            <w:tcW w:type="dxa" w:w="573"/>
-            <w:tcBorders>
-              <w:top w:val="single" w:sz="4" w:space="0" w:color="808080"/>
-              <w:left w:val="single" w:sz="4" w:space="0" w:color="808080"/>
-              <w:bottom w:val="single" w:sz="4" w:space="0" w:color="808080"/>
-              <w:right w:val="single" w:sz="4" w:space="0" w:color="808080"/>
-            </w:tcBorders>
-          </w:tcPr>
-          <w:p>
-            <w:pPr>
-              <w:spacing w:before="20" w:after="20"/>
-              <w:jc w:val="left"/>
-            </w:pPr>
-          </w:p>
-        </w:tc>
-        <w:tc>
-          <w:tcPr>
-            <w:tcW w:type="dxa" w:w="573"/>
-            <w:tcBorders>
-              <w:top w:val="single" w:sz="4" w:space="0" w:color="808080"/>
-              <w:left w:val="single" w:sz="4" w:space="0" w:color="808080"/>
-              <w:bottom w:val="single" w:sz="4" w:space="0" w:color="808080"/>
-              <w:right w:val="single" w:sz="4" w:space="0" w:color="808080"/>
-            </w:tcBorders>
-          </w:tcPr>
-          <w:p>
-            <w:pPr>
-              <w:spacing w:before="20" w:after="20"/>
-              <w:jc w:val="left"/>
-            </w:pPr>
-          </w:p>
-        </w:tc>
-        <w:tc>
-          <w:tcPr>
-            <w:tcW w:type="dxa" w:w="573"/>
-            <w:tcBorders>
-              <w:top w:val="single" w:sz="4" w:space="0" w:color="808080"/>
-              <w:left w:val="single" w:sz="4" w:space="0" w:color="808080"/>
-              <w:bottom w:val="single" w:sz="4" w:space="0" w:color="808080"/>
-              <w:right w:val="single" w:sz="4" w:space="0" w:color="808080"/>
-            </w:tcBorders>
-          </w:tcPr>
-          <w:p>
-            <w:pPr>
-              <w:spacing w:before="20" w:after="20"/>
-              <w:jc w:val="left"/>
-            </w:pPr>
-          </w:p>
-        </w:tc>
-        <w:tc>
-          <w:tcPr>
-            <w:tcW w:type="dxa" w:w="573"/>
-            <w:tcBorders>
-              <w:top w:val="single" w:sz="4" w:space="0" w:color="808080"/>
-              <w:left w:val="single" w:sz="4" w:space="0" w:color="808080"/>
-              <w:bottom w:val="single" w:sz="4" w:space="0" w:color="808080"/>
-              <w:right w:val="single" w:sz="4" w:space="0" w:color="808080"/>
-            </w:tcBorders>
-          </w:tcPr>
-          <w:p>
-            <w:pPr>
-              <w:spacing w:before="20" w:after="20"/>
-              <w:jc w:val="left"/>
-            </w:pPr>
-          </w:p>
-        </w:tc>
       </w:tr>
       <w:tr>
         <w:tc>
@@ -5426,7 +7068,7 @@
                 <w:color w:val="000000"/>
                 <w:sz w:val="16"/>
               </w:rPr>
-              <w:t>TKDK-0115</w:t>
+              <w:t>43.527.1001</w:t>
             </w:r>
           </w:p>
         </w:tc>
@@ -5453,25 +7095,8 @@
                 <w:color w:val="000000"/>
                 <w:sz w:val="16"/>
               </w:rPr>
-              <w:t>Galvanizli düz sacdan yağmur oluğu ve ø100 iniş borusu</w:t>
+              <w:t>Ø150 HDPE koruge pissu borusu (SN 8)</w:t>
             </w:r>
-          </w:p>
-        </w:tc>
-        <w:tc>
-          <w:tcPr>
-            <w:tcW w:type="dxa" w:w="573"/>
-            <w:tcBorders>
-              <w:top w:val="single" w:sz="4" w:space="0" w:color="808080"/>
-              <w:left w:val="single" w:sz="4" w:space="0" w:color="808080"/>
-              <w:bottom w:val="single" w:sz="4" w:space="0" w:color="808080"/>
-              <w:right w:val="single" w:sz="4" w:space="0" w:color="808080"/>
-            </w:tcBorders>
-          </w:tcPr>
-          <w:p>
-            <w:pPr>
-              <w:spacing w:before="20" w:after="20"/>
-              <w:jc w:val="left"/>
-            </w:pPr>
           </w:p>
         </w:tc>
         <w:tc>
@@ -5620,89 +7245,6 @@
             </w:pPr>
           </w:p>
         </w:tc>
-      </w:tr>
-      <w:tr>
-        <w:tc>
-          <w:tcPr>
-            <w:tcW w:type="dxa" w:w="1146"/>
-            <w:tcBorders>
-              <w:top w:val="single" w:sz="4" w:space="0" w:color="808080"/>
-              <w:left w:val="single" w:sz="4" w:space="0" w:color="808080"/>
-              <w:bottom w:val="single" w:sz="4" w:space="0" w:color="808080"/>
-              <w:right w:val="single" w:sz="4" w:space="0" w:color="808080"/>
-            </w:tcBorders>
-          </w:tcPr>
-          <w:p>
-            <w:pPr>
-              <w:spacing w:before="20" w:after="20"/>
-              <w:jc w:val="left"/>
-            </w:pPr>
-            <w:r>
-              <w:rPr>
-                <w:rFonts w:ascii="Calibri" w:hAnsi="Calibri"/>
-                <w:b w:val="0"/>
-                <w:i w:val="0"/>
-                <w:color w:val="000000"/>
-                <w:sz w:val="16"/>
-              </w:rPr>
-              <w:t>Kapı Doğraması</w:t>
-            </w:r>
-          </w:p>
-        </w:tc>
-        <w:tc>
-          <w:tcPr>
-            <w:tcW w:type="dxa" w:w="841"/>
-            <w:tcBorders>
-              <w:top w:val="single" w:sz="4" w:space="0" w:color="808080"/>
-              <w:left w:val="single" w:sz="4" w:space="0" w:color="808080"/>
-              <w:bottom w:val="single" w:sz="4" w:space="0" w:color="808080"/>
-              <w:right w:val="single" w:sz="4" w:space="0" w:color="808080"/>
-            </w:tcBorders>
-          </w:tcPr>
-          <w:p>
-            <w:pPr>
-              <w:spacing w:before="20" w:after="20"/>
-              <w:jc w:val="left"/>
-            </w:pPr>
-            <w:r>
-              <w:rPr>
-                <w:rFonts w:ascii="Calibri" w:hAnsi="Calibri"/>
-                <w:b w:val="0"/>
-                <w:i w:val="0"/>
-                <w:color w:val="000000"/>
-                <w:sz w:val="16"/>
-              </w:rPr>
-              <w:t>TKDK-0151</w:t>
-            </w:r>
-          </w:p>
-        </w:tc>
-        <w:tc>
-          <w:tcPr>
-            <w:tcW w:type="dxa" w:w="3286"/>
-            <w:tcBorders>
-              <w:top w:val="single" w:sz="4" w:space="0" w:color="808080"/>
-              <w:left w:val="single" w:sz="4" w:space="0" w:color="808080"/>
-              <w:bottom w:val="single" w:sz="4" w:space="0" w:color="808080"/>
-              <w:right w:val="single" w:sz="4" w:space="0" w:color="808080"/>
-            </w:tcBorders>
-          </w:tcPr>
-          <w:p>
-            <w:pPr>
-              <w:spacing w:before="20" w:after="20"/>
-              <w:jc w:val="left"/>
-            </w:pPr>
-            <w:r>
-              <w:rPr>
-                <w:rFonts w:ascii="Calibri" w:hAnsi="Calibri"/>
-                <w:b w:val="0"/>
-                <w:i w:val="0"/>
-                <w:color w:val="000000"/>
-                <w:sz w:val="16"/>
-              </w:rPr>
-              <w:t>5 cm poliüretan dolgulu ısı yalıtımlı kapı — servis kapısı 100/220 ve yükleme kapısı 300/300</w:t>
-            </w:r>
-          </w:p>
-        </w:tc>
         <w:tc>
           <w:tcPr>
             <w:tcW w:type="dxa" w:w="573"/>
@@ -5730,142 +7272,6 @@
             </w:r>
           </w:p>
         </w:tc>
-        <w:tc>
-          <w:tcPr>
-            <w:tcW w:type="dxa" w:w="573"/>
-            <w:tcBorders>
-              <w:top w:val="single" w:sz="4" w:space="0" w:color="808080"/>
-              <w:left w:val="single" w:sz="4" w:space="0" w:color="808080"/>
-              <w:bottom w:val="single" w:sz="4" w:space="0" w:color="808080"/>
-              <w:right w:val="single" w:sz="4" w:space="0" w:color="808080"/>
-            </w:tcBorders>
-          </w:tcPr>
-          <w:p>
-            <w:pPr>
-              <w:spacing w:before="20" w:after="20"/>
-              <w:jc w:val="left"/>
-            </w:pPr>
-          </w:p>
-        </w:tc>
-        <w:tc>
-          <w:tcPr>
-            <w:tcW w:type="dxa" w:w="573"/>
-            <w:tcBorders>
-              <w:top w:val="single" w:sz="4" w:space="0" w:color="808080"/>
-              <w:left w:val="single" w:sz="4" w:space="0" w:color="808080"/>
-              <w:bottom w:val="single" w:sz="4" w:space="0" w:color="808080"/>
-              <w:right w:val="single" w:sz="4" w:space="0" w:color="808080"/>
-            </w:tcBorders>
-          </w:tcPr>
-          <w:p>
-            <w:pPr>
-              <w:spacing w:before="20" w:after="20"/>
-              <w:jc w:val="left"/>
-            </w:pPr>
-          </w:p>
-        </w:tc>
-        <w:tc>
-          <w:tcPr>
-            <w:tcW w:type="dxa" w:w="573"/>
-            <w:tcBorders>
-              <w:top w:val="single" w:sz="4" w:space="0" w:color="808080"/>
-              <w:left w:val="single" w:sz="4" w:space="0" w:color="808080"/>
-              <w:bottom w:val="single" w:sz="4" w:space="0" w:color="808080"/>
-              <w:right w:val="single" w:sz="4" w:space="0" w:color="808080"/>
-            </w:tcBorders>
-          </w:tcPr>
-          <w:p>
-            <w:pPr>
-              <w:spacing w:before="20" w:after="20"/>
-              <w:jc w:val="left"/>
-            </w:pPr>
-          </w:p>
-        </w:tc>
-        <w:tc>
-          <w:tcPr>
-            <w:tcW w:type="dxa" w:w="573"/>
-            <w:tcBorders>
-              <w:top w:val="single" w:sz="4" w:space="0" w:color="808080"/>
-              <w:left w:val="single" w:sz="4" w:space="0" w:color="808080"/>
-              <w:bottom w:val="single" w:sz="4" w:space="0" w:color="808080"/>
-              <w:right w:val="single" w:sz="4" w:space="0" w:color="808080"/>
-            </w:tcBorders>
-          </w:tcPr>
-          <w:p>
-            <w:pPr>
-              <w:spacing w:before="20" w:after="20"/>
-              <w:jc w:val="left"/>
-            </w:pPr>
-          </w:p>
-        </w:tc>
-        <w:tc>
-          <w:tcPr>
-            <w:tcW w:type="dxa" w:w="573"/>
-            <w:tcBorders>
-              <w:top w:val="single" w:sz="4" w:space="0" w:color="808080"/>
-              <w:left w:val="single" w:sz="4" w:space="0" w:color="808080"/>
-              <w:bottom w:val="single" w:sz="4" w:space="0" w:color="808080"/>
-              <w:right w:val="single" w:sz="4" w:space="0" w:color="808080"/>
-            </w:tcBorders>
-          </w:tcPr>
-          <w:p>
-            <w:pPr>
-              <w:spacing w:before="20" w:after="20"/>
-              <w:jc w:val="left"/>
-            </w:pPr>
-          </w:p>
-        </w:tc>
-        <w:tc>
-          <w:tcPr>
-            <w:tcW w:type="dxa" w:w="573"/>
-            <w:tcBorders>
-              <w:top w:val="single" w:sz="4" w:space="0" w:color="808080"/>
-              <w:left w:val="single" w:sz="4" w:space="0" w:color="808080"/>
-              <w:bottom w:val="single" w:sz="4" w:space="0" w:color="808080"/>
-              <w:right w:val="single" w:sz="4" w:space="0" w:color="808080"/>
-            </w:tcBorders>
-          </w:tcPr>
-          <w:p>
-            <w:pPr>
-              <w:spacing w:before="20" w:after="20"/>
-              <w:jc w:val="left"/>
-            </w:pPr>
-          </w:p>
-        </w:tc>
-        <w:tc>
-          <w:tcPr>
-            <w:tcW w:type="dxa" w:w="573"/>
-            <w:tcBorders>
-              <w:top w:val="single" w:sz="4" w:space="0" w:color="808080"/>
-              <w:left w:val="single" w:sz="4" w:space="0" w:color="808080"/>
-              <w:bottom w:val="single" w:sz="4" w:space="0" w:color="808080"/>
-              <w:right w:val="single" w:sz="4" w:space="0" w:color="808080"/>
-            </w:tcBorders>
-          </w:tcPr>
-          <w:p>
-            <w:pPr>
-              <w:spacing w:before="20" w:after="20"/>
-              <w:jc w:val="left"/>
-            </w:pPr>
-          </w:p>
-        </w:tc>
-        <w:tc>
-          <w:tcPr>
-            <w:tcW w:type="dxa" w:w="573"/>
-            <w:tcBorders>
-              <w:top w:val="single" w:sz="4" w:space="0" w:color="808080"/>
-              <w:left w:val="single" w:sz="4" w:space="0" w:color="808080"/>
-              <w:bottom w:val="single" w:sz="4" w:space="0" w:color="808080"/>
-              <w:right w:val="single" w:sz="4" w:space="0" w:color="808080"/>
-            </w:tcBorders>
-          </w:tcPr>
-          <w:p>
-            <w:pPr>
-              <w:spacing w:before="20" w:after="20"/>
-              <w:jc w:val="left"/>
-            </w:pPr>
-          </w:p>
-        </w:tc>
       </w:tr>
       <w:tr>
         <w:tc>
@@ -5908,7 +7314,7 @@
                 <w:color w:val="000000"/>
                 <w:sz w:val="16"/>
               </w:rPr>
-              <w:t>TKDK-0175</w:t>
+              <w:t>15.560.1003</w:t>
             </w:r>
           </w:p>
         </w:tc>
@@ -5935,8 +7341,127 @@
                 <w:color w:val="000000"/>
                 <w:sz w:val="16"/>
               </w:rPr>
-              <w:t>PVC kaplamalı MDF presli iç kapı kanadı (hijyen bölmesi, ofis ve WC)</w:t>
+              <w:t>Betonarme kompozit rögar kapağı</w:t>
             </w:r>
+          </w:p>
+        </w:tc>
+        <w:tc>
+          <w:tcPr>
+            <w:tcW w:type="dxa" w:w="573"/>
+            <w:tcBorders>
+              <w:top w:val="single" w:sz="4" w:space="0" w:color="808080"/>
+              <w:left w:val="single" w:sz="4" w:space="0" w:color="808080"/>
+              <w:bottom w:val="single" w:sz="4" w:space="0" w:color="808080"/>
+              <w:right w:val="single" w:sz="4" w:space="0" w:color="808080"/>
+            </w:tcBorders>
+          </w:tcPr>
+          <w:p>
+            <w:pPr>
+              <w:spacing w:before="20" w:after="20"/>
+              <w:jc w:val="left"/>
+            </w:pPr>
+          </w:p>
+        </w:tc>
+        <w:tc>
+          <w:tcPr>
+            <w:tcW w:type="dxa" w:w="573"/>
+            <w:tcBorders>
+              <w:top w:val="single" w:sz="4" w:space="0" w:color="808080"/>
+              <w:left w:val="single" w:sz="4" w:space="0" w:color="808080"/>
+              <w:bottom w:val="single" w:sz="4" w:space="0" w:color="808080"/>
+              <w:right w:val="single" w:sz="4" w:space="0" w:color="808080"/>
+            </w:tcBorders>
+          </w:tcPr>
+          <w:p>
+            <w:pPr>
+              <w:spacing w:before="20" w:after="20"/>
+              <w:jc w:val="left"/>
+            </w:pPr>
+          </w:p>
+        </w:tc>
+        <w:tc>
+          <w:tcPr>
+            <w:tcW w:type="dxa" w:w="573"/>
+            <w:tcBorders>
+              <w:top w:val="single" w:sz="4" w:space="0" w:color="808080"/>
+              <w:left w:val="single" w:sz="4" w:space="0" w:color="808080"/>
+              <w:bottom w:val="single" w:sz="4" w:space="0" w:color="808080"/>
+              <w:right w:val="single" w:sz="4" w:space="0" w:color="808080"/>
+            </w:tcBorders>
+          </w:tcPr>
+          <w:p>
+            <w:pPr>
+              <w:spacing w:before="20" w:after="20"/>
+              <w:jc w:val="left"/>
+            </w:pPr>
+          </w:p>
+        </w:tc>
+        <w:tc>
+          <w:tcPr>
+            <w:tcW w:type="dxa" w:w="573"/>
+            <w:tcBorders>
+              <w:top w:val="single" w:sz="4" w:space="0" w:color="808080"/>
+              <w:left w:val="single" w:sz="4" w:space="0" w:color="808080"/>
+              <w:bottom w:val="single" w:sz="4" w:space="0" w:color="808080"/>
+              <w:right w:val="single" w:sz="4" w:space="0" w:color="808080"/>
+            </w:tcBorders>
+          </w:tcPr>
+          <w:p>
+            <w:pPr>
+              <w:spacing w:before="20" w:after="20"/>
+              <w:jc w:val="left"/>
+            </w:pPr>
+          </w:p>
+        </w:tc>
+        <w:tc>
+          <w:tcPr>
+            <w:tcW w:type="dxa" w:w="573"/>
+            <w:tcBorders>
+              <w:top w:val="single" w:sz="4" w:space="0" w:color="808080"/>
+              <w:left w:val="single" w:sz="4" w:space="0" w:color="808080"/>
+              <w:bottom w:val="single" w:sz="4" w:space="0" w:color="808080"/>
+              <w:right w:val="single" w:sz="4" w:space="0" w:color="808080"/>
+            </w:tcBorders>
+          </w:tcPr>
+          <w:p>
+            <w:pPr>
+              <w:spacing w:before="20" w:after="20"/>
+              <w:jc w:val="left"/>
+            </w:pPr>
+          </w:p>
+        </w:tc>
+        <w:tc>
+          <w:tcPr>
+            <w:tcW w:type="dxa" w:w="573"/>
+            <w:tcBorders>
+              <w:top w:val="single" w:sz="4" w:space="0" w:color="808080"/>
+              <w:left w:val="single" w:sz="4" w:space="0" w:color="808080"/>
+              <w:bottom w:val="single" w:sz="4" w:space="0" w:color="808080"/>
+              <w:right w:val="single" w:sz="4" w:space="0" w:color="808080"/>
+            </w:tcBorders>
+          </w:tcPr>
+          <w:p>
+            <w:pPr>
+              <w:spacing w:before="20" w:after="20"/>
+              <w:jc w:val="left"/>
+            </w:pPr>
+          </w:p>
+        </w:tc>
+        <w:tc>
+          <w:tcPr>
+            <w:tcW w:type="dxa" w:w="573"/>
+            <w:tcBorders>
+              <w:top w:val="single" w:sz="4" w:space="0" w:color="808080"/>
+              <w:left w:val="single" w:sz="4" w:space="0" w:color="808080"/>
+              <w:bottom w:val="single" w:sz="4" w:space="0" w:color="808080"/>
+              <w:right w:val="single" w:sz="4" w:space="0" w:color="808080"/>
+            </w:tcBorders>
+          </w:tcPr>
+          <w:p>
+            <w:pPr>
+              <w:spacing w:before="20" w:after="20"/>
+              <w:jc w:val="left"/>
+            </w:pPr>
           </w:p>
         </w:tc>
         <w:tc>
@@ -5981,125 +7506,6 @@
               </w:rPr>
               <w:t>X</w:t>
             </w:r>
-          </w:p>
-        </w:tc>
-        <w:tc>
-          <w:tcPr>
-            <w:tcW w:type="dxa" w:w="573"/>
-            <w:tcBorders>
-              <w:top w:val="single" w:sz="4" w:space="0" w:color="808080"/>
-              <w:left w:val="single" w:sz="4" w:space="0" w:color="808080"/>
-              <w:bottom w:val="single" w:sz="4" w:space="0" w:color="808080"/>
-              <w:right w:val="single" w:sz="4" w:space="0" w:color="808080"/>
-            </w:tcBorders>
-          </w:tcPr>
-          <w:p>
-            <w:pPr>
-              <w:spacing w:before="20" w:after="20"/>
-              <w:jc w:val="left"/>
-            </w:pPr>
-          </w:p>
-        </w:tc>
-        <w:tc>
-          <w:tcPr>
-            <w:tcW w:type="dxa" w:w="573"/>
-            <w:tcBorders>
-              <w:top w:val="single" w:sz="4" w:space="0" w:color="808080"/>
-              <w:left w:val="single" w:sz="4" w:space="0" w:color="808080"/>
-              <w:bottom w:val="single" w:sz="4" w:space="0" w:color="808080"/>
-              <w:right w:val="single" w:sz="4" w:space="0" w:color="808080"/>
-            </w:tcBorders>
-          </w:tcPr>
-          <w:p>
-            <w:pPr>
-              <w:spacing w:before="20" w:after="20"/>
-              <w:jc w:val="left"/>
-            </w:pPr>
-          </w:p>
-        </w:tc>
-        <w:tc>
-          <w:tcPr>
-            <w:tcW w:type="dxa" w:w="573"/>
-            <w:tcBorders>
-              <w:top w:val="single" w:sz="4" w:space="0" w:color="808080"/>
-              <w:left w:val="single" w:sz="4" w:space="0" w:color="808080"/>
-              <w:bottom w:val="single" w:sz="4" w:space="0" w:color="808080"/>
-              <w:right w:val="single" w:sz="4" w:space="0" w:color="808080"/>
-            </w:tcBorders>
-          </w:tcPr>
-          <w:p>
-            <w:pPr>
-              <w:spacing w:before="20" w:after="20"/>
-              <w:jc w:val="left"/>
-            </w:pPr>
-          </w:p>
-        </w:tc>
-        <w:tc>
-          <w:tcPr>
-            <w:tcW w:type="dxa" w:w="573"/>
-            <w:tcBorders>
-              <w:top w:val="single" w:sz="4" w:space="0" w:color="808080"/>
-              <w:left w:val="single" w:sz="4" w:space="0" w:color="808080"/>
-              <w:bottom w:val="single" w:sz="4" w:space="0" w:color="808080"/>
-              <w:right w:val="single" w:sz="4" w:space="0" w:color="808080"/>
-            </w:tcBorders>
-          </w:tcPr>
-          <w:p>
-            <w:pPr>
-              <w:spacing w:before="20" w:after="20"/>
-              <w:jc w:val="left"/>
-            </w:pPr>
-          </w:p>
-        </w:tc>
-        <w:tc>
-          <w:tcPr>
-            <w:tcW w:type="dxa" w:w="573"/>
-            <w:tcBorders>
-              <w:top w:val="single" w:sz="4" w:space="0" w:color="808080"/>
-              <w:left w:val="single" w:sz="4" w:space="0" w:color="808080"/>
-              <w:bottom w:val="single" w:sz="4" w:space="0" w:color="808080"/>
-              <w:right w:val="single" w:sz="4" w:space="0" w:color="808080"/>
-            </w:tcBorders>
-          </w:tcPr>
-          <w:p>
-            <w:pPr>
-              <w:spacing w:before="20" w:after="20"/>
-              <w:jc w:val="left"/>
-            </w:pPr>
-          </w:p>
-        </w:tc>
-        <w:tc>
-          <w:tcPr>
-            <w:tcW w:type="dxa" w:w="573"/>
-            <w:tcBorders>
-              <w:top w:val="single" w:sz="4" w:space="0" w:color="808080"/>
-              <w:left w:val="single" w:sz="4" w:space="0" w:color="808080"/>
-              <w:bottom w:val="single" w:sz="4" w:space="0" w:color="808080"/>
-              <w:right w:val="single" w:sz="4" w:space="0" w:color="808080"/>
-            </w:tcBorders>
-          </w:tcPr>
-          <w:p>
-            <w:pPr>
-              <w:spacing w:before="20" w:after="20"/>
-              <w:jc w:val="left"/>
-            </w:pPr>
-          </w:p>
-        </w:tc>
-        <w:tc>
-          <w:tcPr>
-            <w:tcW w:type="dxa" w:w="573"/>
-            <w:tcBorders>
-              <w:top w:val="single" w:sz="4" w:space="0" w:color="808080"/>
-              <w:left w:val="single" w:sz="4" w:space="0" w:color="808080"/>
-              <w:bottom w:val="single" w:sz="4" w:space="0" w:color="808080"/>
-              <w:right w:val="single" w:sz="4" w:space="0" w:color="808080"/>
-            </w:tcBorders>
-          </w:tcPr>
-          <w:p>
-            <w:pPr>
-              <w:spacing w:before="20" w:after="20"/>
-              <w:jc w:val="left"/>
-            </w:pPr>
           </w:p>
         </w:tc>
       </w:tr>
@@ -6453,7 +7859,7 @@
           <w:color w:val="000000"/>
           <w:sz w:val="15"/>
         </w:rPr>
-        <w:t>•  Gübre çukuru, ölü atma çukuru, foseptik ve depoların iç yüzeyleri kaplamasız brüt betonarmedir; su yalıtımı bu hesabın kapsamı dışında bırakılmıştır.</w:t>
+        <w:t>•  Gübre çukuru, ölü atma çukuru ve depoların iç yüzeyleri kaplamasız brüt betonarmedir; su yalıtımı bu hesabın kapsamı dışında bırakılmıştır. Foseptik betonarme değildir: kazı ve grobeton oturma yatağı üzerine yerleştirilen prefabrik polietilen sızdırmaz tanktır.</w:t>
       </w:r>
     </w:p>
     <w:sectPr>

</xml_diff>

<commit_message>
Mahal listesine sıhhi tesisat eklendi (MAHAL-SIHHI-PROFORMA)
Co-Authored-By: Claude Opus 5 <noreply@anthropic.com>
Claude-Session: https://claude.ai/code/session_01HJPp6bx7wepUX5p8fxGcjg
</commit_message>
<xml_diff>
--- a/belgeler/05_MAHAL_LISTESI.docx
+++ b/belgeler/05_MAHAL_LISTESI.docx
@@ -7588,6 +7588,1442 @@
                 <w:sz w:val="16"/>
               </w:rPr>
               <w:t>Betonarme direkli galvanizli tel örgü çit (h = 1,50 m, göz 60x60 mm)</w:t>
+            </w:r>
+          </w:p>
+        </w:tc>
+        <w:tc>
+          <w:tcPr>
+            <w:tcW w:type="dxa" w:w="573"/>
+            <w:tcBorders>
+              <w:top w:val="single" w:sz="4" w:space="0" w:color="808080"/>
+              <w:left w:val="single" w:sz="4" w:space="0" w:color="808080"/>
+              <w:bottom w:val="single" w:sz="4" w:space="0" w:color="808080"/>
+              <w:right w:val="single" w:sz="4" w:space="0" w:color="808080"/>
+            </w:tcBorders>
+          </w:tcPr>
+          <w:p>
+            <w:pPr>
+              <w:spacing w:before="20" w:after="20"/>
+              <w:jc w:val="left"/>
+            </w:pPr>
+          </w:p>
+        </w:tc>
+        <w:tc>
+          <w:tcPr>
+            <w:tcW w:type="dxa" w:w="573"/>
+            <w:tcBorders>
+              <w:top w:val="single" w:sz="4" w:space="0" w:color="808080"/>
+              <w:left w:val="single" w:sz="4" w:space="0" w:color="808080"/>
+              <w:bottom w:val="single" w:sz="4" w:space="0" w:color="808080"/>
+              <w:right w:val="single" w:sz="4" w:space="0" w:color="808080"/>
+            </w:tcBorders>
+          </w:tcPr>
+          <w:p>
+            <w:pPr>
+              <w:spacing w:before="20" w:after="20"/>
+              <w:jc w:val="left"/>
+            </w:pPr>
+          </w:p>
+        </w:tc>
+        <w:tc>
+          <w:tcPr>
+            <w:tcW w:type="dxa" w:w="573"/>
+            <w:tcBorders>
+              <w:top w:val="single" w:sz="4" w:space="0" w:color="808080"/>
+              <w:left w:val="single" w:sz="4" w:space="0" w:color="808080"/>
+              <w:bottom w:val="single" w:sz="4" w:space="0" w:color="808080"/>
+              <w:right w:val="single" w:sz="4" w:space="0" w:color="808080"/>
+            </w:tcBorders>
+          </w:tcPr>
+          <w:p>
+            <w:pPr>
+              <w:spacing w:before="20" w:after="20"/>
+              <w:jc w:val="left"/>
+            </w:pPr>
+          </w:p>
+        </w:tc>
+        <w:tc>
+          <w:tcPr>
+            <w:tcW w:type="dxa" w:w="573"/>
+            <w:tcBorders>
+              <w:top w:val="single" w:sz="4" w:space="0" w:color="808080"/>
+              <w:left w:val="single" w:sz="4" w:space="0" w:color="808080"/>
+              <w:bottom w:val="single" w:sz="4" w:space="0" w:color="808080"/>
+              <w:right w:val="single" w:sz="4" w:space="0" w:color="808080"/>
+            </w:tcBorders>
+          </w:tcPr>
+          <w:p>
+            <w:pPr>
+              <w:spacing w:before="20" w:after="20"/>
+              <w:jc w:val="left"/>
+            </w:pPr>
+          </w:p>
+        </w:tc>
+        <w:tc>
+          <w:tcPr>
+            <w:tcW w:type="dxa" w:w="573"/>
+            <w:tcBorders>
+              <w:top w:val="single" w:sz="4" w:space="0" w:color="808080"/>
+              <w:left w:val="single" w:sz="4" w:space="0" w:color="808080"/>
+              <w:bottom w:val="single" w:sz="4" w:space="0" w:color="808080"/>
+              <w:right w:val="single" w:sz="4" w:space="0" w:color="808080"/>
+            </w:tcBorders>
+          </w:tcPr>
+          <w:p>
+            <w:pPr>
+              <w:spacing w:before="20" w:after="20"/>
+              <w:jc w:val="left"/>
+            </w:pPr>
+          </w:p>
+        </w:tc>
+        <w:tc>
+          <w:tcPr>
+            <w:tcW w:type="dxa" w:w="573"/>
+            <w:tcBorders>
+              <w:top w:val="single" w:sz="4" w:space="0" w:color="808080"/>
+              <w:left w:val="single" w:sz="4" w:space="0" w:color="808080"/>
+              <w:bottom w:val="single" w:sz="4" w:space="0" w:color="808080"/>
+              <w:right w:val="single" w:sz="4" w:space="0" w:color="808080"/>
+            </w:tcBorders>
+          </w:tcPr>
+          <w:p>
+            <w:pPr>
+              <w:spacing w:before="20" w:after="20"/>
+              <w:jc w:val="left"/>
+            </w:pPr>
+          </w:p>
+        </w:tc>
+        <w:tc>
+          <w:tcPr>
+            <w:tcW w:type="dxa" w:w="573"/>
+            <w:tcBorders>
+              <w:top w:val="single" w:sz="4" w:space="0" w:color="808080"/>
+              <w:left w:val="single" w:sz="4" w:space="0" w:color="808080"/>
+              <w:bottom w:val="single" w:sz="4" w:space="0" w:color="808080"/>
+              <w:right w:val="single" w:sz="4" w:space="0" w:color="808080"/>
+            </w:tcBorders>
+          </w:tcPr>
+          <w:p>
+            <w:pPr>
+              <w:spacing w:before="20" w:after="20"/>
+              <w:jc w:val="left"/>
+            </w:pPr>
+          </w:p>
+        </w:tc>
+        <w:tc>
+          <w:tcPr>
+            <w:tcW w:type="dxa" w:w="573"/>
+            <w:tcBorders>
+              <w:top w:val="single" w:sz="4" w:space="0" w:color="808080"/>
+              <w:left w:val="single" w:sz="4" w:space="0" w:color="808080"/>
+              <w:bottom w:val="single" w:sz="4" w:space="0" w:color="808080"/>
+              <w:right w:val="single" w:sz="4" w:space="0" w:color="808080"/>
+            </w:tcBorders>
+          </w:tcPr>
+          <w:p>
+            <w:pPr>
+              <w:spacing w:before="20" w:after="20"/>
+              <w:jc w:val="left"/>
+            </w:pPr>
+          </w:p>
+        </w:tc>
+        <w:tc>
+          <w:tcPr>
+            <w:tcW w:type="dxa" w:w="573"/>
+            <w:tcBorders>
+              <w:top w:val="single" w:sz="4" w:space="0" w:color="808080"/>
+              <w:left w:val="single" w:sz="4" w:space="0" w:color="808080"/>
+              <w:bottom w:val="single" w:sz="4" w:space="0" w:color="808080"/>
+              <w:right w:val="single" w:sz="4" w:space="0" w:color="808080"/>
+            </w:tcBorders>
+          </w:tcPr>
+          <w:p>
+            <w:pPr>
+              <w:spacing w:before="20" w:after="20"/>
+              <w:jc w:val="left"/>
+            </w:pPr>
+            <w:r>
+              <w:rPr>
+                <w:rFonts w:ascii="Calibri" w:hAnsi="Calibri"/>
+                <w:b w:val="0"/>
+                <w:i w:val="0"/>
+                <w:color w:val="000000"/>
+                <w:sz w:val="16"/>
+              </w:rPr>
+              <w:t>X</w:t>
+            </w:r>
+          </w:p>
+        </w:tc>
+      </w:tr>
+      <w:tr>
+        <w:tc>
+          <w:tcPr>
+            <w:tcW w:type="dxa" w:w="1146"/>
+            <w:tcBorders>
+              <w:top w:val="single" w:sz="4" w:space="0" w:color="808080"/>
+              <w:left w:val="single" w:sz="4" w:space="0" w:color="808080"/>
+              <w:bottom w:val="single" w:sz="4" w:space="0" w:color="808080"/>
+              <w:right w:val="single" w:sz="4" w:space="0" w:color="808080"/>
+            </w:tcBorders>
+          </w:tcPr>
+          <w:p>
+            <w:pPr>
+              <w:spacing w:before="20" w:after="20"/>
+              <w:jc w:val="left"/>
+            </w:pPr>
+            <w:r>
+              <w:rPr>
+                <w:rFonts w:ascii="Calibri" w:hAnsi="Calibri"/>
+                <w:b w:val="0"/>
+                <w:i w:val="0"/>
+                <w:color w:val="000000"/>
+                <w:sz w:val="16"/>
+              </w:rPr>
+              <w:t>Sıhhi Tesisat</w:t>
+            </w:r>
+          </w:p>
+        </w:tc>
+        <w:tc>
+          <w:tcPr>
+            <w:tcW w:type="dxa" w:w="841"/>
+            <w:tcBorders>
+              <w:top w:val="single" w:sz="4" w:space="0" w:color="808080"/>
+              <w:left w:val="single" w:sz="4" w:space="0" w:color="808080"/>
+              <w:bottom w:val="single" w:sz="4" w:space="0" w:color="808080"/>
+              <w:right w:val="single" w:sz="4" w:space="0" w:color="808080"/>
+            </w:tcBorders>
+          </w:tcPr>
+          <w:p>
+            <w:pPr>
+              <w:spacing w:before="20" w:after="20"/>
+              <w:jc w:val="left"/>
+            </w:pPr>
+            <w:r>
+              <w:rPr>
+                <w:rFonts w:ascii="Calibri" w:hAnsi="Calibri"/>
+                <w:b w:val="0"/>
+                <w:i w:val="0"/>
+                <w:color w:val="000000"/>
+                <w:sz w:val="16"/>
+              </w:rPr>
+              <w:t>—</w:t>
+            </w:r>
+          </w:p>
+        </w:tc>
+        <w:tc>
+          <w:tcPr>
+            <w:tcW w:type="dxa" w:w="3286"/>
+            <w:tcBorders>
+              <w:top w:val="single" w:sz="4" w:space="0" w:color="808080"/>
+              <w:left w:val="single" w:sz="4" w:space="0" w:color="808080"/>
+              <w:bottom w:val="single" w:sz="4" w:space="0" w:color="808080"/>
+              <w:right w:val="single" w:sz="4" w:space="0" w:color="808080"/>
+            </w:tcBorders>
+          </w:tcPr>
+          <w:p>
+            <w:pPr>
+              <w:spacing w:before="20" w:after="20"/>
+              <w:jc w:val="left"/>
+            </w:pPr>
+            <w:r>
+              <w:rPr>
+                <w:rFonts w:ascii="Calibri" w:hAnsi="Calibri"/>
+                <w:b w:val="0"/>
+                <w:i w:val="0"/>
+                <w:color w:val="000000"/>
+                <w:sz w:val="16"/>
+              </w:rPr>
+              <w:t>Temiz su tesisatı — PPRC boru ve ek parçaları, küresel vanalar, askı ve kılıflar</w:t>
+            </w:r>
+          </w:p>
+        </w:tc>
+        <w:tc>
+          <w:tcPr>
+            <w:tcW w:type="dxa" w:w="573"/>
+            <w:tcBorders>
+              <w:top w:val="single" w:sz="4" w:space="0" w:color="808080"/>
+              <w:left w:val="single" w:sz="4" w:space="0" w:color="808080"/>
+              <w:bottom w:val="single" w:sz="4" w:space="0" w:color="808080"/>
+              <w:right w:val="single" w:sz="4" w:space="0" w:color="808080"/>
+            </w:tcBorders>
+          </w:tcPr>
+          <w:p>
+            <w:pPr>
+              <w:spacing w:before="20" w:after="20"/>
+              <w:jc w:val="left"/>
+            </w:pPr>
+            <w:r>
+              <w:rPr>
+                <w:rFonts w:ascii="Calibri" w:hAnsi="Calibri"/>
+                <w:b w:val="0"/>
+                <w:i w:val="0"/>
+                <w:color w:val="000000"/>
+                <w:sz w:val="16"/>
+              </w:rPr>
+              <w:t>X</w:t>
+            </w:r>
+          </w:p>
+        </w:tc>
+        <w:tc>
+          <w:tcPr>
+            <w:tcW w:type="dxa" w:w="573"/>
+            <w:tcBorders>
+              <w:top w:val="single" w:sz="4" w:space="0" w:color="808080"/>
+              <w:left w:val="single" w:sz="4" w:space="0" w:color="808080"/>
+              <w:bottom w:val="single" w:sz="4" w:space="0" w:color="808080"/>
+              <w:right w:val="single" w:sz="4" w:space="0" w:color="808080"/>
+            </w:tcBorders>
+          </w:tcPr>
+          <w:p>
+            <w:pPr>
+              <w:spacing w:before="20" w:after="20"/>
+              <w:jc w:val="left"/>
+            </w:pPr>
+            <w:r>
+              <w:rPr>
+                <w:rFonts w:ascii="Calibri" w:hAnsi="Calibri"/>
+                <w:b w:val="0"/>
+                <w:i w:val="0"/>
+                <w:color w:val="000000"/>
+                <w:sz w:val="16"/>
+              </w:rPr>
+              <w:t>X</w:t>
+            </w:r>
+          </w:p>
+        </w:tc>
+        <w:tc>
+          <w:tcPr>
+            <w:tcW w:type="dxa" w:w="573"/>
+            <w:tcBorders>
+              <w:top w:val="single" w:sz="4" w:space="0" w:color="808080"/>
+              <w:left w:val="single" w:sz="4" w:space="0" w:color="808080"/>
+              <w:bottom w:val="single" w:sz="4" w:space="0" w:color="808080"/>
+              <w:right w:val="single" w:sz="4" w:space="0" w:color="808080"/>
+            </w:tcBorders>
+          </w:tcPr>
+          <w:p>
+            <w:pPr>
+              <w:spacing w:before="20" w:after="20"/>
+              <w:jc w:val="left"/>
+            </w:pPr>
+          </w:p>
+        </w:tc>
+        <w:tc>
+          <w:tcPr>
+            <w:tcW w:type="dxa" w:w="573"/>
+            <w:tcBorders>
+              <w:top w:val="single" w:sz="4" w:space="0" w:color="808080"/>
+              <w:left w:val="single" w:sz="4" w:space="0" w:color="808080"/>
+              <w:bottom w:val="single" w:sz="4" w:space="0" w:color="808080"/>
+              <w:right w:val="single" w:sz="4" w:space="0" w:color="808080"/>
+            </w:tcBorders>
+          </w:tcPr>
+          <w:p>
+            <w:pPr>
+              <w:spacing w:before="20" w:after="20"/>
+              <w:jc w:val="left"/>
+            </w:pPr>
+          </w:p>
+        </w:tc>
+        <w:tc>
+          <w:tcPr>
+            <w:tcW w:type="dxa" w:w="573"/>
+            <w:tcBorders>
+              <w:top w:val="single" w:sz="4" w:space="0" w:color="808080"/>
+              <w:left w:val="single" w:sz="4" w:space="0" w:color="808080"/>
+              <w:bottom w:val="single" w:sz="4" w:space="0" w:color="808080"/>
+              <w:right w:val="single" w:sz="4" w:space="0" w:color="808080"/>
+            </w:tcBorders>
+          </w:tcPr>
+          <w:p>
+            <w:pPr>
+              <w:spacing w:before="20" w:after="20"/>
+              <w:jc w:val="left"/>
+            </w:pPr>
+          </w:p>
+        </w:tc>
+        <w:tc>
+          <w:tcPr>
+            <w:tcW w:type="dxa" w:w="573"/>
+            <w:tcBorders>
+              <w:top w:val="single" w:sz="4" w:space="0" w:color="808080"/>
+              <w:left w:val="single" w:sz="4" w:space="0" w:color="808080"/>
+              <w:bottom w:val="single" w:sz="4" w:space="0" w:color="808080"/>
+              <w:right w:val="single" w:sz="4" w:space="0" w:color="808080"/>
+            </w:tcBorders>
+          </w:tcPr>
+          <w:p>
+            <w:pPr>
+              <w:spacing w:before="20" w:after="20"/>
+              <w:jc w:val="left"/>
+            </w:pPr>
+          </w:p>
+        </w:tc>
+        <w:tc>
+          <w:tcPr>
+            <w:tcW w:type="dxa" w:w="573"/>
+            <w:tcBorders>
+              <w:top w:val="single" w:sz="4" w:space="0" w:color="808080"/>
+              <w:left w:val="single" w:sz="4" w:space="0" w:color="808080"/>
+              <w:bottom w:val="single" w:sz="4" w:space="0" w:color="808080"/>
+              <w:right w:val="single" w:sz="4" w:space="0" w:color="808080"/>
+            </w:tcBorders>
+          </w:tcPr>
+          <w:p>
+            <w:pPr>
+              <w:spacing w:before="20" w:after="20"/>
+              <w:jc w:val="left"/>
+            </w:pPr>
+          </w:p>
+        </w:tc>
+        <w:tc>
+          <w:tcPr>
+            <w:tcW w:type="dxa" w:w="573"/>
+            <w:tcBorders>
+              <w:top w:val="single" w:sz="4" w:space="0" w:color="808080"/>
+              <w:left w:val="single" w:sz="4" w:space="0" w:color="808080"/>
+              <w:bottom w:val="single" w:sz="4" w:space="0" w:color="808080"/>
+              <w:right w:val="single" w:sz="4" w:space="0" w:color="808080"/>
+            </w:tcBorders>
+          </w:tcPr>
+          <w:p>
+            <w:pPr>
+              <w:spacing w:before="20" w:after="20"/>
+              <w:jc w:val="left"/>
+            </w:pPr>
+          </w:p>
+        </w:tc>
+        <w:tc>
+          <w:tcPr>
+            <w:tcW w:type="dxa" w:w="573"/>
+            <w:tcBorders>
+              <w:top w:val="single" w:sz="4" w:space="0" w:color="808080"/>
+              <w:left w:val="single" w:sz="4" w:space="0" w:color="808080"/>
+              <w:bottom w:val="single" w:sz="4" w:space="0" w:color="808080"/>
+              <w:right w:val="single" w:sz="4" w:space="0" w:color="808080"/>
+            </w:tcBorders>
+          </w:tcPr>
+          <w:p>
+            <w:pPr>
+              <w:spacing w:before="20" w:after="20"/>
+              <w:jc w:val="left"/>
+            </w:pPr>
+          </w:p>
+        </w:tc>
+      </w:tr>
+      <w:tr>
+        <w:tc>
+          <w:tcPr>
+            <w:tcW w:type="dxa" w:w="1146"/>
+            <w:tcBorders>
+              <w:top w:val="single" w:sz="4" w:space="0" w:color="808080"/>
+              <w:left w:val="single" w:sz="4" w:space="0" w:color="808080"/>
+              <w:bottom w:val="single" w:sz="4" w:space="0" w:color="808080"/>
+              <w:right w:val="single" w:sz="4" w:space="0" w:color="808080"/>
+            </w:tcBorders>
+          </w:tcPr>
+          <w:p>
+            <w:pPr>
+              <w:spacing w:before="20" w:after="20"/>
+              <w:jc w:val="left"/>
+            </w:pPr>
+          </w:p>
+        </w:tc>
+        <w:tc>
+          <w:tcPr>
+            <w:tcW w:type="dxa" w:w="841"/>
+            <w:tcBorders>
+              <w:top w:val="single" w:sz="4" w:space="0" w:color="808080"/>
+              <w:left w:val="single" w:sz="4" w:space="0" w:color="808080"/>
+              <w:bottom w:val="single" w:sz="4" w:space="0" w:color="808080"/>
+              <w:right w:val="single" w:sz="4" w:space="0" w:color="808080"/>
+            </w:tcBorders>
+          </w:tcPr>
+          <w:p>
+            <w:pPr>
+              <w:spacing w:before="20" w:after="20"/>
+              <w:jc w:val="left"/>
+            </w:pPr>
+            <w:r>
+              <w:rPr>
+                <w:rFonts w:ascii="Calibri" w:hAnsi="Calibri"/>
+                <w:b w:val="0"/>
+                <w:i w:val="0"/>
+                <w:color w:val="000000"/>
+                <w:sz w:val="16"/>
+              </w:rPr>
+              <w:t>—</w:t>
+            </w:r>
+          </w:p>
+        </w:tc>
+        <w:tc>
+          <w:tcPr>
+            <w:tcW w:type="dxa" w:w="3286"/>
+            <w:tcBorders>
+              <w:top w:val="single" w:sz="4" w:space="0" w:color="808080"/>
+              <w:left w:val="single" w:sz="4" w:space="0" w:color="808080"/>
+              <w:bottom w:val="single" w:sz="4" w:space="0" w:color="808080"/>
+              <w:right w:val="single" w:sz="4" w:space="0" w:color="808080"/>
+            </w:tcBorders>
+          </w:tcPr>
+          <w:p>
+            <w:pPr>
+              <w:spacing w:before="20" w:after="20"/>
+              <w:jc w:val="left"/>
+            </w:pPr>
+            <w:r>
+              <w:rPr>
+                <w:rFonts w:ascii="Calibri" w:hAnsi="Calibri"/>
+                <w:b w:val="0"/>
+                <w:i w:val="0"/>
+                <w:color w:val="000000"/>
+                <w:sz w:val="16"/>
+              </w:rPr>
+              <w:t>Pis su tesisatı — Ø50 / Ø70 / Ø100 sert PVC boru, temizleme kapağı, yer süzgeci</w:t>
+            </w:r>
+          </w:p>
+        </w:tc>
+        <w:tc>
+          <w:tcPr>
+            <w:tcW w:type="dxa" w:w="573"/>
+            <w:tcBorders>
+              <w:top w:val="single" w:sz="4" w:space="0" w:color="808080"/>
+              <w:left w:val="single" w:sz="4" w:space="0" w:color="808080"/>
+              <w:bottom w:val="single" w:sz="4" w:space="0" w:color="808080"/>
+              <w:right w:val="single" w:sz="4" w:space="0" w:color="808080"/>
+            </w:tcBorders>
+          </w:tcPr>
+          <w:p>
+            <w:pPr>
+              <w:spacing w:before="20" w:after="20"/>
+              <w:jc w:val="left"/>
+            </w:pPr>
+          </w:p>
+        </w:tc>
+        <w:tc>
+          <w:tcPr>
+            <w:tcW w:type="dxa" w:w="573"/>
+            <w:tcBorders>
+              <w:top w:val="single" w:sz="4" w:space="0" w:color="808080"/>
+              <w:left w:val="single" w:sz="4" w:space="0" w:color="808080"/>
+              <w:bottom w:val="single" w:sz="4" w:space="0" w:color="808080"/>
+              <w:right w:val="single" w:sz="4" w:space="0" w:color="808080"/>
+            </w:tcBorders>
+          </w:tcPr>
+          <w:p>
+            <w:pPr>
+              <w:spacing w:before="20" w:after="20"/>
+              <w:jc w:val="left"/>
+            </w:pPr>
+            <w:r>
+              <w:rPr>
+                <w:rFonts w:ascii="Calibri" w:hAnsi="Calibri"/>
+                <w:b w:val="0"/>
+                <w:i w:val="0"/>
+                <w:color w:val="000000"/>
+                <w:sz w:val="16"/>
+              </w:rPr>
+              <w:t>X</w:t>
+            </w:r>
+          </w:p>
+        </w:tc>
+        <w:tc>
+          <w:tcPr>
+            <w:tcW w:type="dxa" w:w="573"/>
+            <w:tcBorders>
+              <w:top w:val="single" w:sz="4" w:space="0" w:color="808080"/>
+              <w:left w:val="single" w:sz="4" w:space="0" w:color="808080"/>
+              <w:bottom w:val="single" w:sz="4" w:space="0" w:color="808080"/>
+              <w:right w:val="single" w:sz="4" w:space="0" w:color="808080"/>
+            </w:tcBorders>
+          </w:tcPr>
+          <w:p>
+            <w:pPr>
+              <w:spacing w:before="20" w:after="20"/>
+              <w:jc w:val="left"/>
+            </w:pPr>
+          </w:p>
+        </w:tc>
+        <w:tc>
+          <w:tcPr>
+            <w:tcW w:type="dxa" w:w="573"/>
+            <w:tcBorders>
+              <w:top w:val="single" w:sz="4" w:space="0" w:color="808080"/>
+              <w:left w:val="single" w:sz="4" w:space="0" w:color="808080"/>
+              <w:bottom w:val="single" w:sz="4" w:space="0" w:color="808080"/>
+              <w:right w:val="single" w:sz="4" w:space="0" w:color="808080"/>
+            </w:tcBorders>
+          </w:tcPr>
+          <w:p>
+            <w:pPr>
+              <w:spacing w:before="20" w:after="20"/>
+              <w:jc w:val="left"/>
+            </w:pPr>
+          </w:p>
+        </w:tc>
+        <w:tc>
+          <w:tcPr>
+            <w:tcW w:type="dxa" w:w="573"/>
+            <w:tcBorders>
+              <w:top w:val="single" w:sz="4" w:space="0" w:color="808080"/>
+              <w:left w:val="single" w:sz="4" w:space="0" w:color="808080"/>
+              <w:bottom w:val="single" w:sz="4" w:space="0" w:color="808080"/>
+              <w:right w:val="single" w:sz="4" w:space="0" w:color="808080"/>
+            </w:tcBorders>
+          </w:tcPr>
+          <w:p>
+            <w:pPr>
+              <w:spacing w:before="20" w:after="20"/>
+              <w:jc w:val="left"/>
+            </w:pPr>
+          </w:p>
+        </w:tc>
+        <w:tc>
+          <w:tcPr>
+            <w:tcW w:type="dxa" w:w="573"/>
+            <w:tcBorders>
+              <w:top w:val="single" w:sz="4" w:space="0" w:color="808080"/>
+              <w:left w:val="single" w:sz="4" w:space="0" w:color="808080"/>
+              <w:bottom w:val="single" w:sz="4" w:space="0" w:color="808080"/>
+              <w:right w:val="single" w:sz="4" w:space="0" w:color="808080"/>
+            </w:tcBorders>
+          </w:tcPr>
+          <w:p>
+            <w:pPr>
+              <w:spacing w:before="20" w:after="20"/>
+              <w:jc w:val="left"/>
+            </w:pPr>
+          </w:p>
+        </w:tc>
+        <w:tc>
+          <w:tcPr>
+            <w:tcW w:type="dxa" w:w="573"/>
+            <w:tcBorders>
+              <w:top w:val="single" w:sz="4" w:space="0" w:color="808080"/>
+              <w:left w:val="single" w:sz="4" w:space="0" w:color="808080"/>
+              <w:bottom w:val="single" w:sz="4" w:space="0" w:color="808080"/>
+              <w:right w:val="single" w:sz="4" w:space="0" w:color="808080"/>
+            </w:tcBorders>
+          </w:tcPr>
+          <w:p>
+            <w:pPr>
+              <w:spacing w:before="20" w:after="20"/>
+              <w:jc w:val="left"/>
+            </w:pPr>
+          </w:p>
+        </w:tc>
+        <w:tc>
+          <w:tcPr>
+            <w:tcW w:type="dxa" w:w="573"/>
+            <w:tcBorders>
+              <w:top w:val="single" w:sz="4" w:space="0" w:color="808080"/>
+              <w:left w:val="single" w:sz="4" w:space="0" w:color="808080"/>
+              <w:bottom w:val="single" w:sz="4" w:space="0" w:color="808080"/>
+              <w:right w:val="single" w:sz="4" w:space="0" w:color="808080"/>
+            </w:tcBorders>
+          </w:tcPr>
+          <w:p>
+            <w:pPr>
+              <w:spacing w:before="20" w:after="20"/>
+              <w:jc w:val="left"/>
+            </w:pPr>
+          </w:p>
+        </w:tc>
+        <w:tc>
+          <w:tcPr>
+            <w:tcW w:type="dxa" w:w="573"/>
+            <w:tcBorders>
+              <w:top w:val="single" w:sz="4" w:space="0" w:color="808080"/>
+              <w:left w:val="single" w:sz="4" w:space="0" w:color="808080"/>
+              <w:bottom w:val="single" w:sz="4" w:space="0" w:color="808080"/>
+              <w:right w:val="single" w:sz="4" w:space="0" w:color="808080"/>
+            </w:tcBorders>
+          </w:tcPr>
+          <w:p>
+            <w:pPr>
+              <w:spacing w:before="20" w:after="20"/>
+              <w:jc w:val="left"/>
+            </w:pPr>
+          </w:p>
+        </w:tc>
+      </w:tr>
+      <w:tr>
+        <w:tc>
+          <w:tcPr>
+            <w:tcW w:type="dxa" w:w="1146"/>
+            <w:tcBorders>
+              <w:top w:val="single" w:sz="4" w:space="0" w:color="808080"/>
+              <w:left w:val="single" w:sz="4" w:space="0" w:color="808080"/>
+              <w:bottom w:val="single" w:sz="4" w:space="0" w:color="808080"/>
+              <w:right w:val="single" w:sz="4" w:space="0" w:color="808080"/>
+            </w:tcBorders>
+          </w:tcPr>
+          <w:p>
+            <w:pPr>
+              <w:spacing w:before="20" w:after="20"/>
+              <w:jc w:val="left"/>
+            </w:pPr>
+          </w:p>
+        </w:tc>
+        <w:tc>
+          <w:tcPr>
+            <w:tcW w:type="dxa" w:w="841"/>
+            <w:tcBorders>
+              <w:top w:val="single" w:sz="4" w:space="0" w:color="808080"/>
+              <w:left w:val="single" w:sz="4" w:space="0" w:color="808080"/>
+              <w:bottom w:val="single" w:sz="4" w:space="0" w:color="808080"/>
+              <w:right w:val="single" w:sz="4" w:space="0" w:color="808080"/>
+            </w:tcBorders>
+          </w:tcPr>
+          <w:p>
+            <w:pPr>
+              <w:spacing w:before="20" w:after="20"/>
+              <w:jc w:val="left"/>
+            </w:pPr>
+            <w:r>
+              <w:rPr>
+                <w:rFonts w:ascii="Calibri" w:hAnsi="Calibri"/>
+                <w:b w:val="0"/>
+                <w:i w:val="0"/>
+                <w:color w:val="000000"/>
+                <w:sz w:val="16"/>
+              </w:rPr>
+              <w:t>—</w:t>
+            </w:r>
+          </w:p>
+        </w:tc>
+        <w:tc>
+          <w:tcPr>
+            <w:tcW w:type="dxa" w:w="3286"/>
+            <w:tcBorders>
+              <w:top w:val="single" w:sz="4" w:space="0" w:color="808080"/>
+              <w:left w:val="single" w:sz="4" w:space="0" w:color="808080"/>
+              <w:bottom w:val="single" w:sz="4" w:space="0" w:color="808080"/>
+              <w:right w:val="single" w:sz="4" w:space="0" w:color="808080"/>
+            </w:tcBorders>
+          </w:tcPr>
+          <w:p>
+            <w:pPr>
+              <w:spacing w:before="20" w:after="20"/>
+              <w:jc w:val="left"/>
+            </w:pPr>
+            <w:r>
+              <w:rPr>
+                <w:rFonts w:ascii="Calibri" w:hAnsi="Calibri"/>
+                <w:b w:val="0"/>
+                <w:i w:val="0"/>
+                <w:color w:val="000000"/>
+                <w:sz w:val="16"/>
+              </w:rPr>
+              <w:t>Termosifon — sıcak su üretimi</w:t>
+            </w:r>
+          </w:p>
+        </w:tc>
+        <w:tc>
+          <w:tcPr>
+            <w:tcW w:type="dxa" w:w="573"/>
+            <w:tcBorders>
+              <w:top w:val="single" w:sz="4" w:space="0" w:color="808080"/>
+              <w:left w:val="single" w:sz="4" w:space="0" w:color="808080"/>
+              <w:bottom w:val="single" w:sz="4" w:space="0" w:color="808080"/>
+              <w:right w:val="single" w:sz="4" w:space="0" w:color="808080"/>
+            </w:tcBorders>
+          </w:tcPr>
+          <w:p>
+            <w:pPr>
+              <w:spacing w:before="20" w:after="20"/>
+              <w:jc w:val="left"/>
+            </w:pPr>
+          </w:p>
+        </w:tc>
+        <w:tc>
+          <w:tcPr>
+            <w:tcW w:type="dxa" w:w="573"/>
+            <w:tcBorders>
+              <w:top w:val="single" w:sz="4" w:space="0" w:color="808080"/>
+              <w:left w:val="single" w:sz="4" w:space="0" w:color="808080"/>
+              <w:bottom w:val="single" w:sz="4" w:space="0" w:color="808080"/>
+              <w:right w:val="single" w:sz="4" w:space="0" w:color="808080"/>
+            </w:tcBorders>
+          </w:tcPr>
+          <w:p>
+            <w:pPr>
+              <w:spacing w:before="20" w:after="20"/>
+              <w:jc w:val="left"/>
+            </w:pPr>
+            <w:r>
+              <w:rPr>
+                <w:rFonts w:ascii="Calibri" w:hAnsi="Calibri"/>
+                <w:b w:val="0"/>
+                <w:i w:val="0"/>
+                <w:color w:val="000000"/>
+                <w:sz w:val="16"/>
+              </w:rPr>
+              <w:t>X</w:t>
+            </w:r>
+          </w:p>
+        </w:tc>
+        <w:tc>
+          <w:tcPr>
+            <w:tcW w:type="dxa" w:w="573"/>
+            <w:tcBorders>
+              <w:top w:val="single" w:sz="4" w:space="0" w:color="808080"/>
+              <w:left w:val="single" w:sz="4" w:space="0" w:color="808080"/>
+              <w:bottom w:val="single" w:sz="4" w:space="0" w:color="808080"/>
+              <w:right w:val="single" w:sz="4" w:space="0" w:color="808080"/>
+            </w:tcBorders>
+          </w:tcPr>
+          <w:p>
+            <w:pPr>
+              <w:spacing w:before="20" w:after="20"/>
+              <w:jc w:val="left"/>
+            </w:pPr>
+          </w:p>
+        </w:tc>
+        <w:tc>
+          <w:tcPr>
+            <w:tcW w:type="dxa" w:w="573"/>
+            <w:tcBorders>
+              <w:top w:val="single" w:sz="4" w:space="0" w:color="808080"/>
+              <w:left w:val="single" w:sz="4" w:space="0" w:color="808080"/>
+              <w:bottom w:val="single" w:sz="4" w:space="0" w:color="808080"/>
+              <w:right w:val="single" w:sz="4" w:space="0" w:color="808080"/>
+            </w:tcBorders>
+          </w:tcPr>
+          <w:p>
+            <w:pPr>
+              <w:spacing w:before="20" w:after="20"/>
+              <w:jc w:val="left"/>
+            </w:pPr>
+          </w:p>
+        </w:tc>
+        <w:tc>
+          <w:tcPr>
+            <w:tcW w:type="dxa" w:w="573"/>
+            <w:tcBorders>
+              <w:top w:val="single" w:sz="4" w:space="0" w:color="808080"/>
+              <w:left w:val="single" w:sz="4" w:space="0" w:color="808080"/>
+              <w:bottom w:val="single" w:sz="4" w:space="0" w:color="808080"/>
+              <w:right w:val="single" w:sz="4" w:space="0" w:color="808080"/>
+            </w:tcBorders>
+          </w:tcPr>
+          <w:p>
+            <w:pPr>
+              <w:spacing w:before="20" w:after="20"/>
+              <w:jc w:val="left"/>
+            </w:pPr>
+          </w:p>
+        </w:tc>
+        <w:tc>
+          <w:tcPr>
+            <w:tcW w:type="dxa" w:w="573"/>
+            <w:tcBorders>
+              <w:top w:val="single" w:sz="4" w:space="0" w:color="808080"/>
+              <w:left w:val="single" w:sz="4" w:space="0" w:color="808080"/>
+              <w:bottom w:val="single" w:sz="4" w:space="0" w:color="808080"/>
+              <w:right w:val="single" w:sz="4" w:space="0" w:color="808080"/>
+            </w:tcBorders>
+          </w:tcPr>
+          <w:p>
+            <w:pPr>
+              <w:spacing w:before="20" w:after="20"/>
+              <w:jc w:val="left"/>
+            </w:pPr>
+          </w:p>
+        </w:tc>
+        <w:tc>
+          <w:tcPr>
+            <w:tcW w:type="dxa" w:w="573"/>
+            <w:tcBorders>
+              <w:top w:val="single" w:sz="4" w:space="0" w:color="808080"/>
+              <w:left w:val="single" w:sz="4" w:space="0" w:color="808080"/>
+              <w:bottom w:val="single" w:sz="4" w:space="0" w:color="808080"/>
+              <w:right w:val="single" w:sz="4" w:space="0" w:color="808080"/>
+            </w:tcBorders>
+          </w:tcPr>
+          <w:p>
+            <w:pPr>
+              <w:spacing w:before="20" w:after="20"/>
+              <w:jc w:val="left"/>
+            </w:pPr>
+          </w:p>
+        </w:tc>
+        <w:tc>
+          <w:tcPr>
+            <w:tcW w:type="dxa" w:w="573"/>
+            <w:tcBorders>
+              <w:top w:val="single" w:sz="4" w:space="0" w:color="808080"/>
+              <w:left w:val="single" w:sz="4" w:space="0" w:color="808080"/>
+              <w:bottom w:val="single" w:sz="4" w:space="0" w:color="808080"/>
+              <w:right w:val="single" w:sz="4" w:space="0" w:color="808080"/>
+            </w:tcBorders>
+          </w:tcPr>
+          <w:p>
+            <w:pPr>
+              <w:spacing w:before="20" w:after="20"/>
+              <w:jc w:val="left"/>
+            </w:pPr>
+          </w:p>
+        </w:tc>
+        <w:tc>
+          <w:tcPr>
+            <w:tcW w:type="dxa" w:w="573"/>
+            <w:tcBorders>
+              <w:top w:val="single" w:sz="4" w:space="0" w:color="808080"/>
+              <w:left w:val="single" w:sz="4" w:space="0" w:color="808080"/>
+              <w:bottom w:val="single" w:sz="4" w:space="0" w:color="808080"/>
+              <w:right w:val="single" w:sz="4" w:space="0" w:color="808080"/>
+            </w:tcBorders>
+          </w:tcPr>
+          <w:p>
+            <w:pPr>
+              <w:spacing w:before="20" w:after="20"/>
+              <w:jc w:val="left"/>
+            </w:pPr>
+          </w:p>
+        </w:tc>
+      </w:tr>
+      <w:tr>
+        <w:tc>
+          <w:tcPr>
+            <w:tcW w:type="dxa" w:w="1146"/>
+            <w:tcBorders>
+              <w:top w:val="single" w:sz="4" w:space="0" w:color="808080"/>
+              <w:left w:val="single" w:sz="4" w:space="0" w:color="808080"/>
+              <w:bottom w:val="single" w:sz="4" w:space="0" w:color="808080"/>
+              <w:right w:val="single" w:sz="4" w:space="0" w:color="808080"/>
+            </w:tcBorders>
+          </w:tcPr>
+          <w:p>
+            <w:pPr>
+              <w:spacing w:before="20" w:after="20"/>
+              <w:jc w:val="left"/>
+            </w:pPr>
+          </w:p>
+        </w:tc>
+        <w:tc>
+          <w:tcPr>
+            <w:tcW w:type="dxa" w:w="841"/>
+            <w:tcBorders>
+              <w:top w:val="single" w:sz="4" w:space="0" w:color="808080"/>
+              <w:left w:val="single" w:sz="4" w:space="0" w:color="808080"/>
+              <w:bottom w:val="single" w:sz="4" w:space="0" w:color="808080"/>
+              <w:right w:val="single" w:sz="4" w:space="0" w:color="808080"/>
+            </w:tcBorders>
+          </w:tcPr>
+          <w:p>
+            <w:pPr>
+              <w:spacing w:before="20" w:after="20"/>
+              <w:jc w:val="left"/>
+            </w:pPr>
+            <w:r>
+              <w:rPr>
+                <w:rFonts w:ascii="Calibri" w:hAnsi="Calibri"/>
+                <w:b w:val="0"/>
+                <w:i w:val="0"/>
+                <w:color w:val="000000"/>
+                <w:sz w:val="16"/>
+              </w:rPr>
+              <w:t>—</w:t>
+            </w:r>
+          </w:p>
+        </w:tc>
+        <w:tc>
+          <w:tcPr>
+            <w:tcW w:type="dxa" w:w="3286"/>
+            <w:tcBorders>
+              <w:top w:val="single" w:sz="4" w:space="0" w:color="808080"/>
+              <w:left w:val="single" w:sz="4" w:space="0" w:color="808080"/>
+              <w:bottom w:val="single" w:sz="4" w:space="0" w:color="808080"/>
+              <w:right w:val="single" w:sz="4" w:space="0" w:color="808080"/>
+            </w:tcBorders>
+          </w:tcPr>
+          <w:p>
+            <w:pPr>
+              <w:spacing w:before="20" w:after="20"/>
+              <w:jc w:val="left"/>
+            </w:pPr>
+            <w:r>
+              <w:rPr>
+                <w:rFonts w:ascii="Calibri" w:hAnsi="Calibri"/>
+                <w:b w:val="0"/>
+                <w:i w:val="0"/>
+                <w:color w:val="000000"/>
+                <w:sz w:val="16"/>
+              </w:rPr>
+              <w:t>Şebeke su bağlantısı ve 2" su sayacı</w:t>
+            </w:r>
+          </w:p>
+        </w:tc>
+        <w:tc>
+          <w:tcPr>
+            <w:tcW w:type="dxa" w:w="573"/>
+            <w:tcBorders>
+              <w:top w:val="single" w:sz="4" w:space="0" w:color="808080"/>
+              <w:left w:val="single" w:sz="4" w:space="0" w:color="808080"/>
+              <w:bottom w:val="single" w:sz="4" w:space="0" w:color="808080"/>
+              <w:right w:val="single" w:sz="4" w:space="0" w:color="808080"/>
+            </w:tcBorders>
+          </w:tcPr>
+          <w:p>
+            <w:pPr>
+              <w:spacing w:before="20" w:after="20"/>
+              <w:jc w:val="left"/>
+            </w:pPr>
+          </w:p>
+        </w:tc>
+        <w:tc>
+          <w:tcPr>
+            <w:tcW w:type="dxa" w:w="573"/>
+            <w:tcBorders>
+              <w:top w:val="single" w:sz="4" w:space="0" w:color="808080"/>
+              <w:left w:val="single" w:sz="4" w:space="0" w:color="808080"/>
+              <w:bottom w:val="single" w:sz="4" w:space="0" w:color="808080"/>
+              <w:right w:val="single" w:sz="4" w:space="0" w:color="808080"/>
+            </w:tcBorders>
+          </w:tcPr>
+          <w:p>
+            <w:pPr>
+              <w:spacing w:before="20" w:after="20"/>
+              <w:jc w:val="left"/>
+            </w:pPr>
+          </w:p>
+        </w:tc>
+        <w:tc>
+          <w:tcPr>
+            <w:tcW w:type="dxa" w:w="573"/>
+            <w:tcBorders>
+              <w:top w:val="single" w:sz="4" w:space="0" w:color="808080"/>
+              <w:left w:val="single" w:sz="4" w:space="0" w:color="808080"/>
+              <w:bottom w:val="single" w:sz="4" w:space="0" w:color="808080"/>
+              <w:right w:val="single" w:sz="4" w:space="0" w:color="808080"/>
+            </w:tcBorders>
+          </w:tcPr>
+          <w:p>
+            <w:pPr>
+              <w:spacing w:before="20" w:after="20"/>
+              <w:jc w:val="left"/>
+            </w:pPr>
+          </w:p>
+        </w:tc>
+        <w:tc>
+          <w:tcPr>
+            <w:tcW w:type="dxa" w:w="573"/>
+            <w:tcBorders>
+              <w:top w:val="single" w:sz="4" w:space="0" w:color="808080"/>
+              <w:left w:val="single" w:sz="4" w:space="0" w:color="808080"/>
+              <w:bottom w:val="single" w:sz="4" w:space="0" w:color="808080"/>
+              <w:right w:val="single" w:sz="4" w:space="0" w:color="808080"/>
+            </w:tcBorders>
+          </w:tcPr>
+          <w:p>
+            <w:pPr>
+              <w:spacing w:before="20" w:after="20"/>
+              <w:jc w:val="left"/>
+            </w:pPr>
+          </w:p>
+        </w:tc>
+        <w:tc>
+          <w:tcPr>
+            <w:tcW w:type="dxa" w:w="573"/>
+            <w:tcBorders>
+              <w:top w:val="single" w:sz="4" w:space="0" w:color="808080"/>
+              <w:left w:val="single" w:sz="4" w:space="0" w:color="808080"/>
+              <w:bottom w:val="single" w:sz="4" w:space="0" w:color="808080"/>
+              <w:right w:val="single" w:sz="4" w:space="0" w:color="808080"/>
+            </w:tcBorders>
+          </w:tcPr>
+          <w:p>
+            <w:pPr>
+              <w:spacing w:before="20" w:after="20"/>
+              <w:jc w:val="left"/>
+            </w:pPr>
+          </w:p>
+        </w:tc>
+        <w:tc>
+          <w:tcPr>
+            <w:tcW w:type="dxa" w:w="573"/>
+            <w:tcBorders>
+              <w:top w:val="single" w:sz="4" w:space="0" w:color="808080"/>
+              <w:left w:val="single" w:sz="4" w:space="0" w:color="808080"/>
+              <w:bottom w:val="single" w:sz="4" w:space="0" w:color="808080"/>
+              <w:right w:val="single" w:sz="4" w:space="0" w:color="808080"/>
+            </w:tcBorders>
+          </w:tcPr>
+          <w:p>
+            <w:pPr>
+              <w:spacing w:before="20" w:after="20"/>
+              <w:jc w:val="left"/>
+            </w:pPr>
+          </w:p>
+        </w:tc>
+        <w:tc>
+          <w:tcPr>
+            <w:tcW w:type="dxa" w:w="573"/>
+            <w:tcBorders>
+              <w:top w:val="single" w:sz="4" w:space="0" w:color="808080"/>
+              <w:left w:val="single" w:sz="4" w:space="0" w:color="808080"/>
+              <w:bottom w:val="single" w:sz="4" w:space="0" w:color="808080"/>
+              <w:right w:val="single" w:sz="4" w:space="0" w:color="808080"/>
+            </w:tcBorders>
+          </w:tcPr>
+          <w:p>
+            <w:pPr>
+              <w:spacing w:before="20" w:after="20"/>
+              <w:jc w:val="left"/>
+            </w:pPr>
+          </w:p>
+        </w:tc>
+        <w:tc>
+          <w:tcPr>
+            <w:tcW w:type="dxa" w:w="573"/>
+            <w:tcBorders>
+              <w:top w:val="single" w:sz="4" w:space="0" w:color="808080"/>
+              <w:left w:val="single" w:sz="4" w:space="0" w:color="808080"/>
+              <w:bottom w:val="single" w:sz="4" w:space="0" w:color="808080"/>
+              <w:right w:val="single" w:sz="4" w:space="0" w:color="808080"/>
+            </w:tcBorders>
+          </w:tcPr>
+          <w:p>
+            <w:pPr>
+              <w:spacing w:before="20" w:after="20"/>
+              <w:jc w:val="left"/>
+            </w:pPr>
+          </w:p>
+        </w:tc>
+        <w:tc>
+          <w:tcPr>
+            <w:tcW w:type="dxa" w:w="573"/>
+            <w:tcBorders>
+              <w:top w:val="single" w:sz="4" w:space="0" w:color="808080"/>
+              <w:left w:val="single" w:sz="4" w:space="0" w:color="808080"/>
+              <w:bottom w:val="single" w:sz="4" w:space="0" w:color="808080"/>
+              <w:right w:val="single" w:sz="4" w:space="0" w:color="808080"/>
+            </w:tcBorders>
+          </w:tcPr>
+          <w:p>
+            <w:pPr>
+              <w:spacing w:before="20" w:after="20"/>
+              <w:jc w:val="left"/>
+            </w:pPr>
+            <w:r>
+              <w:rPr>
+                <w:rFonts w:ascii="Calibri" w:hAnsi="Calibri"/>
+                <w:b w:val="0"/>
+                <w:i w:val="0"/>
+                <w:color w:val="000000"/>
+                <w:sz w:val="16"/>
+              </w:rPr>
+              <w:t>X</w:t>
+            </w:r>
+          </w:p>
+        </w:tc>
+      </w:tr>
+      <w:tr>
+        <w:tc>
+          <w:tcPr>
+            <w:tcW w:type="dxa" w:w="1146"/>
+            <w:tcBorders>
+              <w:top w:val="single" w:sz="4" w:space="0" w:color="808080"/>
+              <w:left w:val="single" w:sz="4" w:space="0" w:color="808080"/>
+              <w:bottom w:val="single" w:sz="4" w:space="0" w:color="808080"/>
+              <w:right w:val="single" w:sz="4" w:space="0" w:color="808080"/>
+            </w:tcBorders>
+          </w:tcPr>
+          <w:p>
+            <w:pPr>
+              <w:spacing w:before="20" w:after="20"/>
+              <w:jc w:val="left"/>
+            </w:pPr>
+          </w:p>
+        </w:tc>
+        <w:tc>
+          <w:tcPr>
+            <w:tcW w:type="dxa" w:w="841"/>
+            <w:tcBorders>
+              <w:top w:val="single" w:sz="4" w:space="0" w:color="808080"/>
+              <w:left w:val="single" w:sz="4" w:space="0" w:color="808080"/>
+              <w:bottom w:val="single" w:sz="4" w:space="0" w:color="808080"/>
+              <w:right w:val="single" w:sz="4" w:space="0" w:color="808080"/>
+            </w:tcBorders>
+          </w:tcPr>
+          <w:p>
+            <w:pPr>
+              <w:spacing w:before="20" w:after="20"/>
+              <w:jc w:val="left"/>
+            </w:pPr>
+            <w:r>
+              <w:rPr>
+                <w:rFonts w:ascii="Calibri" w:hAnsi="Calibri"/>
+                <w:b w:val="0"/>
+                <w:i w:val="0"/>
+                <w:color w:val="000000"/>
+                <w:sz w:val="16"/>
+              </w:rPr>
+              <w:t>—</w:t>
+            </w:r>
+          </w:p>
+        </w:tc>
+        <w:tc>
+          <w:tcPr>
+            <w:tcW w:type="dxa" w:w="3286"/>
+            <w:tcBorders>
+              <w:top w:val="single" w:sz="4" w:space="0" w:color="808080"/>
+              <w:left w:val="single" w:sz="4" w:space="0" w:color="808080"/>
+              <w:bottom w:val="single" w:sz="4" w:space="0" w:color="808080"/>
+              <w:right w:val="single" w:sz="4" w:space="0" w:color="808080"/>
+            </w:tcBorders>
+          </w:tcPr>
+          <w:p>
+            <w:pPr>
+              <w:spacing w:before="20" w:after="20"/>
+              <w:jc w:val="left"/>
+            </w:pPr>
+            <w:r>
+              <w:rPr>
+                <w:rFonts w:ascii="Calibri" w:hAnsi="Calibri"/>
+                <w:b w:val="0"/>
+                <w:i w:val="0"/>
+                <w:color w:val="000000"/>
+                <w:sz w:val="16"/>
+              </w:rPr>
+              <w:t>Hidrofor — Q = 2 m³/h, P = 33-38 mSS</w:t>
+            </w:r>
+          </w:p>
+        </w:tc>
+        <w:tc>
+          <w:tcPr>
+            <w:tcW w:type="dxa" w:w="573"/>
+            <w:tcBorders>
+              <w:top w:val="single" w:sz="4" w:space="0" w:color="808080"/>
+              <w:left w:val="single" w:sz="4" w:space="0" w:color="808080"/>
+              <w:bottom w:val="single" w:sz="4" w:space="0" w:color="808080"/>
+              <w:right w:val="single" w:sz="4" w:space="0" w:color="808080"/>
+            </w:tcBorders>
+          </w:tcPr>
+          <w:p>
+            <w:pPr>
+              <w:spacing w:before="20" w:after="20"/>
+              <w:jc w:val="left"/>
+            </w:pPr>
+          </w:p>
+        </w:tc>
+        <w:tc>
+          <w:tcPr>
+            <w:tcW w:type="dxa" w:w="573"/>
+            <w:tcBorders>
+              <w:top w:val="single" w:sz="4" w:space="0" w:color="808080"/>
+              <w:left w:val="single" w:sz="4" w:space="0" w:color="808080"/>
+              <w:bottom w:val="single" w:sz="4" w:space="0" w:color="808080"/>
+              <w:right w:val="single" w:sz="4" w:space="0" w:color="808080"/>
+            </w:tcBorders>
+          </w:tcPr>
+          <w:p>
+            <w:pPr>
+              <w:spacing w:before="20" w:after="20"/>
+              <w:jc w:val="left"/>
+            </w:pPr>
+          </w:p>
+        </w:tc>
+        <w:tc>
+          <w:tcPr>
+            <w:tcW w:type="dxa" w:w="573"/>
+            <w:tcBorders>
+              <w:top w:val="single" w:sz="4" w:space="0" w:color="808080"/>
+              <w:left w:val="single" w:sz="4" w:space="0" w:color="808080"/>
+              <w:bottom w:val="single" w:sz="4" w:space="0" w:color="808080"/>
+              <w:right w:val="single" w:sz="4" w:space="0" w:color="808080"/>
+            </w:tcBorders>
+          </w:tcPr>
+          <w:p>
+            <w:pPr>
+              <w:spacing w:before="20" w:after="20"/>
+              <w:jc w:val="left"/>
+            </w:pPr>
+          </w:p>
+        </w:tc>
+        <w:tc>
+          <w:tcPr>
+            <w:tcW w:type="dxa" w:w="573"/>
+            <w:tcBorders>
+              <w:top w:val="single" w:sz="4" w:space="0" w:color="808080"/>
+              <w:left w:val="single" w:sz="4" w:space="0" w:color="808080"/>
+              <w:bottom w:val="single" w:sz="4" w:space="0" w:color="808080"/>
+              <w:right w:val="single" w:sz="4" w:space="0" w:color="808080"/>
+            </w:tcBorders>
+          </w:tcPr>
+          <w:p>
+            <w:pPr>
+              <w:spacing w:before="20" w:after="20"/>
+              <w:jc w:val="left"/>
+            </w:pPr>
+          </w:p>
+        </w:tc>
+        <w:tc>
+          <w:tcPr>
+            <w:tcW w:type="dxa" w:w="573"/>
+            <w:tcBorders>
+              <w:top w:val="single" w:sz="4" w:space="0" w:color="808080"/>
+              <w:left w:val="single" w:sz="4" w:space="0" w:color="808080"/>
+              <w:bottom w:val="single" w:sz="4" w:space="0" w:color="808080"/>
+              <w:right w:val="single" w:sz="4" w:space="0" w:color="808080"/>
+            </w:tcBorders>
+          </w:tcPr>
+          <w:p>
+            <w:pPr>
+              <w:spacing w:before="20" w:after="20"/>
+              <w:jc w:val="left"/>
+            </w:pPr>
+          </w:p>
+        </w:tc>
+        <w:tc>
+          <w:tcPr>
+            <w:tcW w:type="dxa" w:w="573"/>
+            <w:tcBorders>
+              <w:top w:val="single" w:sz="4" w:space="0" w:color="808080"/>
+              <w:left w:val="single" w:sz="4" w:space="0" w:color="808080"/>
+              <w:bottom w:val="single" w:sz="4" w:space="0" w:color="808080"/>
+              <w:right w:val="single" w:sz="4" w:space="0" w:color="808080"/>
+            </w:tcBorders>
+          </w:tcPr>
+          <w:p>
+            <w:pPr>
+              <w:spacing w:before="20" w:after="20"/>
+              <w:jc w:val="left"/>
+            </w:pPr>
+          </w:p>
+        </w:tc>
+        <w:tc>
+          <w:tcPr>
+            <w:tcW w:type="dxa" w:w="573"/>
+            <w:tcBorders>
+              <w:top w:val="single" w:sz="4" w:space="0" w:color="808080"/>
+              <w:left w:val="single" w:sz="4" w:space="0" w:color="808080"/>
+              <w:bottom w:val="single" w:sz="4" w:space="0" w:color="808080"/>
+              <w:right w:val="single" w:sz="4" w:space="0" w:color="808080"/>
+            </w:tcBorders>
+          </w:tcPr>
+          <w:p>
+            <w:pPr>
+              <w:spacing w:before="20" w:after="20"/>
+              <w:jc w:val="left"/>
+            </w:pPr>
+          </w:p>
+        </w:tc>
+        <w:tc>
+          <w:tcPr>
+            <w:tcW w:type="dxa" w:w="573"/>
+            <w:tcBorders>
+              <w:top w:val="single" w:sz="4" w:space="0" w:color="808080"/>
+              <w:left w:val="single" w:sz="4" w:space="0" w:color="808080"/>
+              <w:bottom w:val="single" w:sz="4" w:space="0" w:color="808080"/>
+              <w:right w:val="single" w:sz="4" w:space="0" w:color="808080"/>
+            </w:tcBorders>
+          </w:tcPr>
+          <w:p>
+            <w:pPr>
+              <w:spacing w:before="20" w:after="20"/>
+              <w:jc w:val="left"/>
+            </w:pPr>
+          </w:p>
+        </w:tc>
+        <w:tc>
+          <w:tcPr>
+            <w:tcW w:type="dxa" w:w="573"/>
+            <w:tcBorders>
+              <w:top w:val="single" w:sz="4" w:space="0" w:color="808080"/>
+              <w:left w:val="single" w:sz="4" w:space="0" w:color="808080"/>
+              <w:bottom w:val="single" w:sz="4" w:space="0" w:color="808080"/>
+              <w:right w:val="single" w:sz="4" w:space="0" w:color="808080"/>
+            </w:tcBorders>
+          </w:tcPr>
+          <w:p>
+            <w:pPr>
+              <w:spacing w:before="20" w:after="20"/>
+              <w:jc w:val="left"/>
+            </w:pPr>
+            <w:r>
+              <w:rPr>
+                <w:rFonts w:ascii="Calibri" w:hAnsi="Calibri"/>
+                <w:b w:val="0"/>
+                <w:i w:val="0"/>
+                <w:color w:val="000000"/>
+                <w:sz w:val="16"/>
+              </w:rPr>
+              <w:t>X</w:t>
+            </w:r>
+          </w:p>
+        </w:tc>
+      </w:tr>
+      <w:tr>
+        <w:tc>
+          <w:tcPr>
+            <w:tcW w:type="dxa" w:w="1146"/>
+            <w:tcBorders>
+              <w:top w:val="single" w:sz="4" w:space="0" w:color="808080"/>
+              <w:left w:val="single" w:sz="4" w:space="0" w:color="808080"/>
+              <w:bottom w:val="single" w:sz="4" w:space="0" w:color="808080"/>
+              <w:right w:val="single" w:sz="4" w:space="0" w:color="808080"/>
+            </w:tcBorders>
+          </w:tcPr>
+          <w:p>
+            <w:pPr>
+              <w:spacing w:before="20" w:after="20"/>
+              <w:jc w:val="left"/>
+            </w:pPr>
+          </w:p>
+        </w:tc>
+        <w:tc>
+          <w:tcPr>
+            <w:tcW w:type="dxa" w:w="841"/>
+            <w:tcBorders>
+              <w:top w:val="single" w:sz="4" w:space="0" w:color="808080"/>
+              <w:left w:val="single" w:sz="4" w:space="0" w:color="808080"/>
+              <w:bottom w:val="single" w:sz="4" w:space="0" w:color="808080"/>
+              <w:right w:val="single" w:sz="4" w:space="0" w:color="808080"/>
+            </w:tcBorders>
+          </w:tcPr>
+          <w:p>
+            <w:pPr>
+              <w:spacing w:before="20" w:after="20"/>
+              <w:jc w:val="left"/>
+            </w:pPr>
+            <w:r>
+              <w:rPr>
+                <w:rFonts w:ascii="Calibri" w:hAnsi="Calibri"/>
+                <w:b w:val="0"/>
+                <w:i w:val="0"/>
+                <w:color w:val="000000"/>
+                <w:sz w:val="16"/>
+              </w:rPr>
+              <w:t>—</w:t>
+            </w:r>
+          </w:p>
+        </w:tc>
+        <w:tc>
+          <w:tcPr>
+            <w:tcW w:type="dxa" w:w="3286"/>
+            <w:tcBorders>
+              <w:top w:val="single" w:sz="4" w:space="0" w:color="808080"/>
+              <w:left w:val="single" w:sz="4" w:space="0" w:color="808080"/>
+              <w:bottom w:val="single" w:sz="4" w:space="0" w:color="808080"/>
+              <w:right w:val="single" w:sz="4" w:space="0" w:color="808080"/>
+            </w:tcBorders>
+          </w:tcPr>
+          <w:p>
+            <w:pPr>
+              <w:spacing w:before="20" w:after="20"/>
+              <w:jc w:val="left"/>
+            </w:pPr>
+            <w:r>
+              <w:rPr>
+                <w:rFonts w:ascii="Calibri" w:hAnsi="Calibri"/>
+                <w:b w:val="0"/>
+                <w:i w:val="0"/>
+                <w:color w:val="000000"/>
+                <w:sz w:val="16"/>
+              </w:rPr>
+              <w:t>Tesisat hidroforu — 0,3 m³/h, 30 mSS</w:t>
             </w:r>
           </w:p>
         </w:tc>
@@ -7844,6 +9280,22 @@
           <w:sz w:val="15"/>
         </w:rPr>
         <w:t>•  Listedeki pozların tamamı birim fiyat kitaplarındandır: 15.xxx ÇŞB 2026 birim fiyat kitabı, TKDK-xxxx ise TKDK 17.02.2026 Özel Poz Tablosu pozudur.</w:t>
+      </w:r>
+    </w:p>
+    <w:p>
+      <w:pPr>
+        <w:spacing w:after="60"/>
+        <w:jc w:val="both"/>
+      </w:pPr>
+      <w:r>
+        <w:rPr>
+          <w:rFonts w:ascii="Calibri" w:hAnsi="Calibri"/>
+          <w:b w:val="0"/>
+          <w:i w:val="0"/>
+          <w:color w:val="000000"/>
+          <w:sz w:val="15"/>
+        </w:rPr>
+        <w:t>•  Sıhhi tesisat kalemlerinin kitap pozu yoktur ve keşif özetinde yer almazlar: miktarları onaylı sıhhi tesisat projesinden, bedelleri piyasa araştırmasından gelir ve 36 numaralı proforma ile beyan edilir. Poz sütununda “—” işareti bunu gösterir.</w:t>
       </w:r>
     </w:p>
     <w:p>

</xml_diff>